<commit_message>
zero-shot full corp result and drafted dissertation paper
</commit_message>
<xml_diff>
--- a/p2t_lora_checkpoints_dedup/analysis/error_analysis_report_2026-07-22_v3.docx
+++ b/p2t_lora_checkpoints_dedup/analysis/error_analysis_report_2026-07-22_v3.docx
@@ -1,6 +1,6 @@
 
 <file path=word/document.xml><?xml version="1.0" encoding="utf-8"?>
-<w:document xmlns:wpc="http://schemas.microsoft.com/office/word/2010/wordprocessingCanvas" xmlns:cx="http://schemas.microsoft.com/office/drawing/2014/chartex" xmlns:cx1="http://schemas.microsoft.com/office/drawing/2015/9/8/chartex" xmlns:cx2="http://schemas.microsoft.com/office/drawing/2015/10/21/chartex" xmlns:cx3="http://schemas.microsoft.com/office/drawing/2016/5/9/chartex" xmlns:cx4="http://schemas.microsoft.com/office/drawing/2016/5/10/chartex" xmlns:cx5="http://schemas.microsoft.com/office/drawing/2016/5/11/chartex" xmlns:cx6="http://schemas.microsoft.com/office/drawing/2016/5/12/chartex" xmlns:cx7="http://schemas.microsoft.com/office/drawing/2016/5/13/chartex" xmlns:cx8="http://schemas.microsoft.com/office/drawing/2016/5/14/chartex" xmlns:mc="http://schemas.openxmlformats.org/markup-compatibility/2006" xmlns:aink="http://schemas.microsoft.com/office/drawing/2016/ink" xmlns:am3d="http://schemas.microsoft.com/office/drawing/2017/model3d" xmlns:o="urn:schemas-microsoft-com:office:office" xmlns:oel="http://schemas.microsoft.com/office/2019/extlst" xmlns:r="http://schemas.openxmlformats.org/officeDocument/2006/relationships" xmlns:m="http://schemas.openxmlformats.org/officeDocument/2006/math" xmlns:v="urn:schemas-microsoft-com:vml" xmlns:wp14="http://schemas.microsoft.com/office/word/2010/wordprocessingDrawing" xmlns:wp="http://schemas.openxmlformats.org/drawingml/2006/wordprocessingDrawing" xmlns:w10="urn:schemas-microsoft-com:office:word" xmlns:w="http://schemas.openxmlformats.org/wordprocessingml/2006/main" xmlns:w14="http://schemas.microsoft.com/office/word/2010/wordml" xmlns:w15="http://schemas.microsoft.com/office/word/2012/wordml" xmlns:w16cex="http://schemas.microsoft.com/office/word/2018/wordml/cex" xmlns:w16cid="http://schemas.microsoft.com/office/word/2016/wordml/cid" xmlns:w16="http://schemas.microsoft.com/office/word/2018/wordml" xmlns:w16du="http://schemas.microsoft.com/office/word/2023/wordml/word16du" xmlns:w16sdtdh="http://schemas.microsoft.com/office/word/2020/wordml/sdtdatahash" xmlns:w16sdtfl="http://schemas.microsoft.com/office/word/2024/wordml/sdtformatlock" xmlns:w16se="http://schemas.microsoft.com/office/word/2015/wordml/symex" xmlns:wpg="http://schemas.microsoft.com/office/word/2010/wordprocessingGroup" xmlns:wpi="http://schemas.microsoft.com/office/word/2010/wordprocessingInk" xmlns:wne="http://schemas.microsoft.com/office/word/2006/wordml" xmlns:wps="http://schemas.microsoft.com/office/word/2010/wordprocessingShape" mc:Ignorable="w14 w15 w16se w16cid w16 w16cex w16sdtdh w16sdtfl w16du wp14">
+<w:document xmlns:wpc="http://schemas.microsoft.com/office/word/2010/wordprocessingCanvas" xmlns:cx="http://schemas.microsoft.com/office/drawing/2014/chartex" xmlns:cx1="http://schemas.microsoft.com/office/drawing/2015/9/8/chartex" xmlns:cx2="http://schemas.microsoft.com/office/drawing/2015/10/21/chartex" xmlns:cx3="http://schemas.microsoft.com/office/drawing/2016/5/9/chartex" xmlns:cx4="http://schemas.microsoft.com/office/drawing/2016/5/10/chartex" xmlns:cx5="http://schemas.microsoft.com/office/drawing/2016/5/11/chartex" xmlns:cx6="http://schemas.microsoft.com/office/drawing/2016/5/12/chartex" xmlns:cx7="http://schemas.microsoft.com/office/drawing/2016/5/13/chartex" xmlns:cx8="http://schemas.microsoft.com/office/drawing/2016/5/14/chartex" xmlns:mc="http://schemas.openxmlformats.org/markup-compatibility/2006" xmlns:aink="http://schemas.microsoft.com/office/drawing/2016/ink" xmlns:am3d="http://schemas.microsoft.com/office/drawing/2017/model3d" xmlns:o="urn:schemas-microsoft-com:office:office" xmlns:oel="http://schemas.microsoft.com/office/2019/extlst" xmlns:r="http://schemas.openxmlformats.org/officeDocument/2006/relationships" xmlns:m="http://schemas.openxmlformats.org/officeDocument/2006/math" xmlns:v="urn:schemas-microsoft-com:vml" xmlns:wp14="http://schemas.microsoft.com/office/word/2010/wordprocessingDrawing" xmlns:wp="http://schemas.openxmlformats.org/drawingml/2006/wordprocessingDrawing" xmlns:w10="urn:schemas-microsoft-com:office:word" xmlns:w="http://schemas.openxmlformats.org/wordprocessingml/2006/main" xmlns:w14="http://schemas.microsoft.com/office/word/2010/wordml" xmlns:w15="http://schemas.microsoft.com/office/word/2012/wordml" xmlns:w16cei="http://schemas.microsoft.com/office/word/2026/wordml/cei" xmlns:w16cex="http://schemas.microsoft.com/office/word/2018/wordml/cex" xmlns:w16cid="http://schemas.microsoft.com/office/word/2016/wordml/cid" xmlns:w16="http://schemas.microsoft.com/office/word/2018/wordml" xmlns:w16du="http://schemas.microsoft.com/office/word/2023/wordml/word16du" xmlns:w16sdtdh="http://schemas.microsoft.com/office/word/2020/wordml/sdtdatahash" xmlns:w16sdtfl="http://schemas.microsoft.com/office/word/2024/wordml/sdtformatlock" xmlns:w16se="http://schemas.microsoft.com/office/word/2015/wordml/symex" xmlns:wpg="http://schemas.microsoft.com/office/word/2010/wordprocessingGroup" xmlns:wpi="http://schemas.microsoft.com/office/word/2010/wordprocessingInk" xmlns:wne="http://schemas.microsoft.com/office/word/2006/wordml" xmlns:wps="http://schemas.microsoft.com/office/word/2010/wordprocessingShape" mc:Ignorable="w14 w15 w16se w16cid w16 w16cex w16sdtdh w16sdtfl w16du wp14">
   <w:body>
     <w:p>
       <w:pPr>
@@ -58,7 +58,7 @@
     </w:p>
     <w:tbl>
       <w:tblPr>
-        <w:tblStyle w:val="TableGrid"/>
+        <w:tblStyle w:val="PlainTable5"/>
         <w:tblW w:w="0" w:type="auto"/>
         <w:tblLook w:val="04A0" w:firstRow="1" w:lastRow="0" w:firstColumn="1" w:lastColumn="0" w:noHBand="0" w:noVBand="1"/>
       </w:tblPr>
@@ -67,8 +67,12 @@
         <w:gridCol w:w="4680"/>
       </w:tblGrid>
       <w:tr>
-        <w:tc>
-          <w:tcPr>
+        <w:trPr>
+          <w:cnfStyle w:val="100000000000" w:firstRow="1" w:lastRow="0" w:firstColumn="0" w:lastColumn="0" w:oddVBand="0" w:evenVBand="0" w:oddHBand="0" w:evenHBand="0" w:firstRowFirstColumn="0" w:firstRowLastColumn="0" w:lastRowFirstColumn="0" w:lastRowLastColumn="0"/>
+        </w:trPr>
+        <w:tc>
+          <w:tcPr>
+            <w:cnfStyle w:val="001000000100" w:firstRow="0" w:lastRow="0" w:firstColumn="1" w:lastColumn="0" w:oddVBand="0" w:evenVBand="0" w:oddHBand="0" w:evenHBand="0" w:firstRowFirstColumn="1" w:firstRowLastColumn="0" w:lastRowFirstColumn="0" w:lastRowLastColumn="0"/>
             <w:tcW w:w="4680" w:type="dxa"/>
           </w:tcPr>
           <w:p>
@@ -86,6 +90,9 @@
             <w:tcW w:w="4680" w:type="dxa"/>
           </w:tcPr>
           <w:p>
+            <w:pPr>
+              <w:cnfStyle w:val="100000000000" w:firstRow="1" w:lastRow="0" w:firstColumn="0" w:lastColumn="0" w:oddVBand="0" w:evenVBand="0" w:oddHBand="0" w:evenHBand="0" w:firstRowFirstColumn="0" w:firstRowLastColumn="0" w:lastRowFirstColumn="0" w:lastRowLastColumn="0"/>
+            </w:pPr>
             <w:r>
               <w:rPr>
                 <w:b/>
@@ -97,8 +104,12 @@
         </w:tc>
       </w:tr>
       <w:tr>
-        <w:tc>
-          <w:tcPr>
+        <w:trPr>
+          <w:cnfStyle w:val="000000100000" w:firstRow="0" w:lastRow="0" w:firstColumn="0" w:lastColumn="0" w:oddVBand="0" w:evenVBand="0" w:oddHBand="1" w:evenHBand="0" w:firstRowFirstColumn="0" w:firstRowLastColumn="0" w:lastRowFirstColumn="0" w:lastRowLastColumn="0"/>
+        </w:trPr>
+        <w:tc>
+          <w:tcPr>
+            <w:cnfStyle w:val="001000000000" w:firstRow="0" w:lastRow="0" w:firstColumn="1" w:lastColumn="0" w:oddVBand="0" w:evenVBand="0" w:oddHBand="0" w:evenHBand="0" w:firstRowFirstColumn="0" w:firstRowLastColumn="0" w:lastRowFirstColumn="0" w:lastRowLastColumn="0"/>
             <w:tcW w:w="4680" w:type="dxa"/>
           </w:tcPr>
           <w:p>
@@ -117,6 +128,7 @@
           <w:p>
             <w:pPr>
               <w:jc w:val="right"/>
+              <w:cnfStyle w:val="000000100000" w:firstRow="0" w:lastRow="0" w:firstColumn="0" w:lastColumn="0" w:oddVBand="0" w:evenVBand="0" w:oddHBand="1" w:evenHBand="0" w:firstRowFirstColumn="0" w:firstRowLastColumn="0" w:lastRowFirstColumn="0" w:lastRowLastColumn="0"/>
             </w:pPr>
             <w:r>
               <w:rPr>
@@ -130,6 +142,7 @@
       <w:tr>
         <w:tc>
           <w:tcPr>
+            <w:cnfStyle w:val="001000000000" w:firstRow="0" w:lastRow="0" w:firstColumn="1" w:lastColumn="0" w:oddVBand="0" w:evenVBand="0" w:oddHBand="0" w:evenHBand="0" w:firstRowFirstColumn="0" w:firstRowLastColumn="0" w:lastRowFirstColumn="0" w:lastRowLastColumn="0"/>
             <w:tcW w:w="4680" w:type="dxa"/>
           </w:tcPr>
           <w:p>
@@ -148,6 +161,7 @@
           <w:p>
             <w:pPr>
               <w:jc w:val="right"/>
+              <w:cnfStyle w:val="000000000000" w:firstRow="0" w:lastRow="0" w:firstColumn="0" w:lastColumn="0" w:oddVBand="0" w:evenVBand="0" w:oddHBand="0" w:evenHBand="0" w:firstRowFirstColumn="0" w:firstRowLastColumn="0" w:lastRowFirstColumn="0" w:lastRowLastColumn="0"/>
             </w:pPr>
             <w:r>
               <w:rPr>
@@ -159,8 +173,12 @@
         </w:tc>
       </w:tr>
       <w:tr>
-        <w:tc>
-          <w:tcPr>
+        <w:trPr>
+          <w:cnfStyle w:val="000000100000" w:firstRow="0" w:lastRow="0" w:firstColumn="0" w:lastColumn="0" w:oddVBand="0" w:evenVBand="0" w:oddHBand="1" w:evenHBand="0" w:firstRowFirstColumn="0" w:firstRowLastColumn="0" w:lastRowFirstColumn="0" w:lastRowLastColumn="0"/>
+        </w:trPr>
+        <w:tc>
+          <w:tcPr>
+            <w:cnfStyle w:val="001000000000" w:firstRow="0" w:lastRow="0" w:firstColumn="1" w:lastColumn="0" w:oddVBand="0" w:evenVBand="0" w:oddHBand="0" w:evenHBand="0" w:firstRowFirstColumn="0" w:firstRowLastColumn="0" w:lastRowFirstColumn="0" w:lastRowLastColumn="0"/>
             <w:tcW w:w="4680" w:type="dxa"/>
           </w:tcPr>
           <w:p>
@@ -179,6 +197,7 @@
           <w:p>
             <w:pPr>
               <w:jc w:val="right"/>
+              <w:cnfStyle w:val="000000100000" w:firstRow="0" w:lastRow="0" w:firstColumn="0" w:lastColumn="0" w:oddVBand="0" w:evenVBand="0" w:oddHBand="1" w:evenHBand="0" w:firstRowFirstColumn="0" w:firstRowLastColumn="0" w:lastRowFirstColumn="0" w:lastRowLastColumn="0"/>
             </w:pPr>
             <w:r>
               <w:rPr>
@@ -192,6 +211,7 @@
       <w:tr>
         <w:tc>
           <w:tcPr>
+            <w:cnfStyle w:val="001000000000" w:firstRow="0" w:lastRow="0" w:firstColumn="1" w:lastColumn="0" w:oddVBand="0" w:evenVBand="0" w:oddHBand="0" w:evenHBand="0" w:firstRowFirstColumn="0" w:firstRowLastColumn="0" w:lastRowFirstColumn="0" w:lastRowLastColumn="0"/>
             <w:tcW w:w="4680" w:type="dxa"/>
           </w:tcPr>
           <w:p>
@@ -210,6 +230,7 @@
           <w:p>
             <w:pPr>
               <w:jc w:val="right"/>
+              <w:cnfStyle w:val="000000000000" w:firstRow="0" w:lastRow="0" w:firstColumn="0" w:lastColumn="0" w:oddVBand="0" w:evenVBand="0" w:oddHBand="0" w:evenHBand="0" w:firstRowFirstColumn="0" w:firstRowLastColumn="0" w:lastRowFirstColumn="0" w:lastRowLastColumn="0"/>
             </w:pPr>
             <w:r>
               <w:rPr>
@@ -250,7 +271,7 @@
     </w:p>
     <w:tbl>
       <w:tblPr>
-        <w:tblStyle w:val="TableGrid"/>
+        <w:tblStyle w:val="PlainTable5"/>
         <w:tblW w:w="9067" w:type="dxa"/>
         <w:tblLook w:val="04A0" w:firstRow="1" w:lastRow="0" w:firstColumn="1" w:lastColumn="0" w:noHBand="0" w:noVBand="1"/>
       </w:tblPr>
@@ -263,8 +284,12 @@
         <w:gridCol w:w="1084"/>
       </w:tblGrid>
       <w:tr>
-        <w:tc>
-          <w:tcPr>
+        <w:trPr>
+          <w:cnfStyle w:val="100000000000" w:firstRow="1" w:lastRow="0" w:firstColumn="0" w:lastColumn="0" w:oddVBand="0" w:evenVBand="0" w:oddHBand="0" w:evenHBand="0" w:firstRowFirstColumn="0" w:firstRowLastColumn="0" w:lastRowFirstColumn="0" w:lastRowLastColumn="0"/>
+        </w:trPr>
+        <w:tc>
+          <w:tcPr>
+            <w:cnfStyle w:val="001000000100" w:firstRow="0" w:lastRow="0" w:firstColumn="1" w:lastColumn="0" w:oddVBand="0" w:evenVBand="0" w:oddHBand="0" w:evenHBand="0" w:firstRowFirstColumn="1" w:firstRowLastColumn="0" w:lastRowFirstColumn="0" w:lastRowLastColumn="0"/>
             <w:tcW w:w="2889" w:type="dxa"/>
           </w:tcPr>
           <w:p>
@@ -282,6 +307,9 @@
             <w:tcW w:w="1555" w:type="dxa"/>
           </w:tcPr>
           <w:p>
+            <w:pPr>
+              <w:cnfStyle w:val="100000000000" w:firstRow="1" w:lastRow="0" w:firstColumn="0" w:lastColumn="0" w:oddVBand="0" w:evenVBand="0" w:oddHBand="0" w:evenHBand="0" w:firstRowFirstColumn="0" w:firstRowLastColumn="0" w:lastRowFirstColumn="0" w:lastRowLastColumn="0"/>
+            </w:pPr>
             <w:r>
               <w:rPr>
                 <w:b/>
@@ -296,6 +324,9 @@
             <w:tcW w:w="1363" w:type="dxa"/>
           </w:tcPr>
           <w:p>
+            <w:pPr>
+              <w:cnfStyle w:val="100000000000" w:firstRow="1" w:lastRow="0" w:firstColumn="0" w:lastColumn="0" w:oddVBand="0" w:evenVBand="0" w:oddHBand="0" w:evenHBand="0" w:firstRowFirstColumn="0" w:firstRowLastColumn="0" w:lastRowFirstColumn="0" w:lastRowLastColumn="0"/>
+            </w:pPr>
             <w:r>
               <w:rPr>
                 <w:b/>
@@ -310,6 +341,9 @@
             <w:tcW w:w="1105" w:type="dxa"/>
           </w:tcPr>
           <w:p>
+            <w:pPr>
+              <w:cnfStyle w:val="100000000000" w:firstRow="1" w:lastRow="0" w:firstColumn="0" w:lastColumn="0" w:oddVBand="0" w:evenVBand="0" w:oddHBand="0" w:evenHBand="0" w:firstRowFirstColumn="0" w:firstRowLastColumn="0" w:lastRowFirstColumn="0" w:lastRowLastColumn="0"/>
+            </w:pPr>
             <w:r>
               <w:rPr>
                 <w:b/>
@@ -324,6 +358,9 @@
             <w:tcW w:w="1071" w:type="dxa"/>
           </w:tcPr>
           <w:p>
+            <w:pPr>
+              <w:cnfStyle w:val="100000000000" w:firstRow="1" w:lastRow="0" w:firstColumn="0" w:lastColumn="0" w:oddVBand="0" w:evenVBand="0" w:oddHBand="0" w:evenHBand="0" w:firstRowFirstColumn="0" w:firstRowLastColumn="0" w:lastRowFirstColumn="0" w:lastRowLastColumn="0"/>
+            </w:pPr>
             <w:r>
               <w:rPr>
                 <w:b/>
@@ -338,6 +375,9 @@
             <w:tcW w:w="1084" w:type="dxa"/>
           </w:tcPr>
           <w:p>
+            <w:pPr>
+              <w:cnfStyle w:val="100000000000" w:firstRow="1" w:lastRow="0" w:firstColumn="0" w:lastColumn="0" w:oddVBand="0" w:evenVBand="0" w:oddHBand="0" w:evenHBand="0" w:firstRowFirstColumn="0" w:firstRowLastColumn="0" w:lastRowFirstColumn="0" w:lastRowLastColumn="0"/>
+            </w:pPr>
             <w:r>
               <w:rPr>
                 <w:b/>
@@ -349,8 +389,12 @@
         </w:tc>
       </w:tr>
       <w:tr>
-        <w:tc>
-          <w:tcPr>
+        <w:trPr>
+          <w:cnfStyle w:val="000000100000" w:firstRow="0" w:lastRow="0" w:firstColumn="0" w:lastColumn="0" w:oddVBand="0" w:evenVBand="0" w:oddHBand="1" w:evenHBand="0" w:firstRowFirstColumn="0" w:firstRowLastColumn="0" w:lastRowFirstColumn="0" w:lastRowLastColumn="0"/>
+        </w:trPr>
+        <w:tc>
+          <w:tcPr>
+            <w:cnfStyle w:val="001000000000" w:firstRow="0" w:lastRow="0" w:firstColumn="1" w:lastColumn="0" w:oddVBand="0" w:evenVBand="0" w:oddHBand="0" w:evenHBand="0" w:firstRowFirstColumn="0" w:firstRowLastColumn="0" w:lastRowFirstColumn="0" w:lastRowLastColumn="0"/>
             <w:tcW w:w="2889" w:type="dxa"/>
           </w:tcPr>
           <w:p>
@@ -369,6 +413,7 @@
           <w:p>
             <w:pPr>
               <w:jc w:val="right"/>
+              <w:cnfStyle w:val="000000100000" w:firstRow="0" w:lastRow="0" w:firstColumn="0" w:lastColumn="0" w:oddVBand="0" w:evenVBand="0" w:oddHBand="1" w:evenHBand="0" w:firstRowFirstColumn="0" w:firstRowLastColumn="0" w:lastRowFirstColumn="0" w:lastRowLastColumn="0"/>
             </w:pPr>
             <w:r>
               <w:rPr>
@@ -385,6 +430,7 @@
           <w:p>
             <w:pPr>
               <w:jc w:val="right"/>
+              <w:cnfStyle w:val="000000100000" w:firstRow="0" w:lastRow="0" w:firstColumn="0" w:lastColumn="0" w:oddVBand="0" w:evenVBand="0" w:oddHBand="1" w:evenHBand="0" w:firstRowFirstColumn="0" w:firstRowLastColumn="0" w:lastRowFirstColumn="0" w:lastRowLastColumn="0"/>
             </w:pPr>
             <w:r>
               <w:rPr>
@@ -401,6 +447,7 @@
           <w:p>
             <w:pPr>
               <w:jc w:val="right"/>
+              <w:cnfStyle w:val="000000100000" w:firstRow="0" w:lastRow="0" w:firstColumn="0" w:lastColumn="0" w:oddVBand="0" w:evenVBand="0" w:oddHBand="1" w:evenHBand="0" w:firstRowFirstColumn="0" w:firstRowLastColumn="0" w:lastRowFirstColumn="0" w:lastRowLastColumn="0"/>
             </w:pPr>
             <w:r>
               <w:rPr>
@@ -417,6 +464,7 @@
           <w:p>
             <w:pPr>
               <w:jc w:val="right"/>
+              <w:cnfStyle w:val="000000100000" w:firstRow="0" w:lastRow="0" w:firstColumn="0" w:lastColumn="0" w:oddVBand="0" w:evenVBand="0" w:oddHBand="1" w:evenHBand="0" w:firstRowFirstColumn="0" w:firstRowLastColumn="0" w:lastRowFirstColumn="0" w:lastRowLastColumn="0"/>
             </w:pPr>
             <w:r>
               <w:rPr>
@@ -433,6 +481,7 @@
           <w:p>
             <w:pPr>
               <w:jc w:val="right"/>
+              <w:cnfStyle w:val="000000100000" w:firstRow="0" w:lastRow="0" w:firstColumn="0" w:lastColumn="0" w:oddVBand="0" w:evenVBand="0" w:oddHBand="1" w:evenHBand="0" w:firstRowFirstColumn="0" w:firstRowLastColumn="0" w:lastRowFirstColumn="0" w:lastRowLastColumn="0"/>
             </w:pPr>
             <w:r>
               <w:rPr>
@@ -446,6 +495,7 @@
       <w:tr>
         <w:tc>
           <w:tcPr>
+            <w:cnfStyle w:val="001000000000" w:firstRow="0" w:lastRow="0" w:firstColumn="1" w:lastColumn="0" w:oddVBand="0" w:evenVBand="0" w:oddHBand="0" w:evenHBand="0" w:firstRowFirstColumn="0" w:firstRowLastColumn="0" w:lastRowFirstColumn="0" w:lastRowLastColumn="0"/>
             <w:tcW w:w="2889" w:type="dxa"/>
           </w:tcPr>
           <w:p>
@@ -464,6 +514,7 @@
           <w:p>
             <w:pPr>
               <w:jc w:val="right"/>
+              <w:cnfStyle w:val="000000000000" w:firstRow="0" w:lastRow="0" w:firstColumn="0" w:lastColumn="0" w:oddVBand="0" w:evenVBand="0" w:oddHBand="0" w:evenHBand="0" w:firstRowFirstColumn="0" w:firstRowLastColumn="0" w:lastRowFirstColumn="0" w:lastRowLastColumn="0"/>
             </w:pPr>
             <w:r>
               <w:rPr>
@@ -480,6 +531,7 @@
           <w:p>
             <w:pPr>
               <w:jc w:val="right"/>
+              <w:cnfStyle w:val="000000000000" w:firstRow="0" w:lastRow="0" w:firstColumn="0" w:lastColumn="0" w:oddVBand="0" w:evenVBand="0" w:oddHBand="0" w:evenHBand="0" w:firstRowFirstColumn="0" w:firstRowLastColumn="0" w:lastRowFirstColumn="0" w:lastRowLastColumn="0"/>
             </w:pPr>
             <w:r>
               <w:rPr>
@@ -496,6 +548,7 @@
           <w:p>
             <w:pPr>
               <w:jc w:val="right"/>
+              <w:cnfStyle w:val="000000000000" w:firstRow="0" w:lastRow="0" w:firstColumn="0" w:lastColumn="0" w:oddVBand="0" w:evenVBand="0" w:oddHBand="0" w:evenHBand="0" w:firstRowFirstColumn="0" w:firstRowLastColumn="0" w:lastRowFirstColumn="0" w:lastRowLastColumn="0"/>
             </w:pPr>
             <w:r>
               <w:rPr>
@@ -512,6 +565,7 @@
           <w:p>
             <w:pPr>
               <w:jc w:val="right"/>
+              <w:cnfStyle w:val="000000000000" w:firstRow="0" w:lastRow="0" w:firstColumn="0" w:lastColumn="0" w:oddVBand="0" w:evenVBand="0" w:oddHBand="0" w:evenHBand="0" w:firstRowFirstColumn="0" w:firstRowLastColumn="0" w:lastRowFirstColumn="0" w:lastRowLastColumn="0"/>
             </w:pPr>
             <w:r>
               <w:rPr>
@@ -528,6 +582,7 @@
           <w:p>
             <w:pPr>
               <w:jc w:val="right"/>
+              <w:cnfStyle w:val="000000000000" w:firstRow="0" w:lastRow="0" w:firstColumn="0" w:lastColumn="0" w:oddVBand="0" w:evenVBand="0" w:oddHBand="0" w:evenHBand="0" w:firstRowFirstColumn="0" w:firstRowLastColumn="0" w:lastRowFirstColumn="0" w:lastRowLastColumn="0"/>
             </w:pPr>
             <w:r>
               <w:rPr>
@@ -539,8 +594,12 @@
         </w:tc>
       </w:tr>
       <w:tr>
-        <w:tc>
-          <w:tcPr>
+        <w:trPr>
+          <w:cnfStyle w:val="000000100000" w:firstRow="0" w:lastRow="0" w:firstColumn="0" w:lastColumn="0" w:oddVBand="0" w:evenVBand="0" w:oddHBand="1" w:evenHBand="0" w:firstRowFirstColumn="0" w:firstRowLastColumn="0" w:lastRowFirstColumn="0" w:lastRowLastColumn="0"/>
+        </w:trPr>
+        <w:tc>
+          <w:tcPr>
+            <w:cnfStyle w:val="001000000000" w:firstRow="0" w:lastRow="0" w:firstColumn="1" w:lastColumn="0" w:oddVBand="0" w:evenVBand="0" w:oddHBand="0" w:evenHBand="0" w:firstRowFirstColumn="0" w:firstRowLastColumn="0" w:lastRowFirstColumn="0" w:lastRowLastColumn="0"/>
             <w:tcW w:w="2889" w:type="dxa"/>
           </w:tcPr>
           <w:p>
@@ -560,6 +619,7 @@
           <w:p>
             <w:pPr>
               <w:jc w:val="right"/>
+              <w:cnfStyle w:val="000000100000" w:firstRow="0" w:lastRow="0" w:firstColumn="0" w:lastColumn="0" w:oddVBand="0" w:evenVBand="0" w:oddHBand="1" w:evenHBand="0" w:firstRowFirstColumn="0" w:firstRowLastColumn="0" w:lastRowFirstColumn="0" w:lastRowLastColumn="0"/>
             </w:pPr>
             <w:r>
               <w:rPr>
@@ -576,6 +636,7 @@
           <w:p>
             <w:pPr>
               <w:jc w:val="right"/>
+              <w:cnfStyle w:val="000000100000" w:firstRow="0" w:lastRow="0" w:firstColumn="0" w:lastColumn="0" w:oddVBand="0" w:evenVBand="0" w:oddHBand="1" w:evenHBand="0" w:firstRowFirstColumn="0" w:firstRowLastColumn="0" w:lastRowFirstColumn="0" w:lastRowLastColumn="0"/>
             </w:pPr>
             <w:r>
               <w:rPr>
@@ -592,6 +653,7 @@
           <w:p>
             <w:pPr>
               <w:jc w:val="right"/>
+              <w:cnfStyle w:val="000000100000" w:firstRow="0" w:lastRow="0" w:firstColumn="0" w:lastColumn="0" w:oddVBand="0" w:evenVBand="0" w:oddHBand="1" w:evenHBand="0" w:firstRowFirstColumn="0" w:firstRowLastColumn="0" w:lastRowFirstColumn="0" w:lastRowLastColumn="0"/>
             </w:pPr>
             <w:r>
               <w:rPr>
@@ -608,6 +670,7 @@
           <w:p>
             <w:pPr>
               <w:jc w:val="right"/>
+              <w:cnfStyle w:val="000000100000" w:firstRow="0" w:lastRow="0" w:firstColumn="0" w:lastColumn="0" w:oddVBand="0" w:evenVBand="0" w:oddHBand="1" w:evenHBand="0" w:firstRowFirstColumn="0" w:firstRowLastColumn="0" w:lastRowFirstColumn="0" w:lastRowLastColumn="0"/>
             </w:pPr>
             <w:r>
               <w:rPr>
@@ -624,6 +687,7 @@
           <w:p>
             <w:pPr>
               <w:jc w:val="right"/>
+              <w:cnfStyle w:val="000000100000" w:firstRow="0" w:lastRow="0" w:firstColumn="0" w:lastColumn="0" w:oddVBand="0" w:evenVBand="0" w:oddHBand="1" w:evenHBand="0" w:firstRowFirstColumn="0" w:firstRowLastColumn="0" w:lastRowFirstColumn="0" w:lastRowLastColumn="0"/>
             </w:pPr>
             <w:r>
               <w:rPr>
@@ -637,6 +701,7 @@
       <w:tr>
         <w:tc>
           <w:tcPr>
+            <w:cnfStyle w:val="001000000000" w:firstRow="0" w:lastRow="0" w:firstColumn="1" w:lastColumn="0" w:oddVBand="0" w:evenVBand="0" w:oddHBand="0" w:evenHBand="0" w:firstRowFirstColumn="0" w:firstRowLastColumn="0" w:lastRowFirstColumn="0" w:lastRowLastColumn="0"/>
             <w:tcW w:w="2889" w:type="dxa"/>
           </w:tcPr>
           <w:p>
@@ -655,6 +720,7 @@
           <w:p>
             <w:pPr>
               <w:jc w:val="right"/>
+              <w:cnfStyle w:val="000000000000" w:firstRow="0" w:lastRow="0" w:firstColumn="0" w:lastColumn="0" w:oddVBand="0" w:evenVBand="0" w:oddHBand="0" w:evenHBand="0" w:firstRowFirstColumn="0" w:firstRowLastColumn="0" w:lastRowFirstColumn="0" w:lastRowLastColumn="0"/>
             </w:pPr>
             <w:r>
               <w:rPr>
@@ -671,6 +737,7 @@
           <w:p>
             <w:pPr>
               <w:jc w:val="right"/>
+              <w:cnfStyle w:val="000000000000" w:firstRow="0" w:lastRow="0" w:firstColumn="0" w:lastColumn="0" w:oddVBand="0" w:evenVBand="0" w:oddHBand="0" w:evenHBand="0" w:firstRowFirstColumn="0" w:firstRowLastColumn="0" w:lastRowFirstColumn="0" w:lastRowLastColumn="0"/>
             </w:pPr>
             <w:r>
               <w:rPr>
@@ -687,6 +754,7 @@
           <w:p>
             <w:pPr>
               <w:jc w:val="right"/>
+              <w:cnfStyle w:val="000000000000" w:firstRow="0" w:lastRow="0" w:firstColumn="0" w:lastColumn="0" w:oddVBand="0" w:evenVBand="0" w:oddHBand="0" w:evenHBand="0" w:firstRowFirstColumn="0" w:firstRowLastColumn="0" w:lastRowFirstColumn="0" w:lastRowLastColumn="0"/>
             </w:pPr>
             <w:r>
               <w:rPr>
@@ -703,6 +771,7 @@
           <w:p>
             <w:pPr>
               <w:jc w:val="right"/>
+              <w:cnfStyle w:val="000000000000" w:firstRow="0" w:lastRow="0" w:firstColumn="0" w:lastColumn="0" w:oddVBand="0" w:evenVBand="0" w:oddHBand="0" w:evenHBand="0" w:firstRowFirstColumn="0" w:firstRowLastColumn="0" w:lastRowFirstColumn="0" w:lastRowLastColumn="0"/>
             </w:pPr>
             <w:r>
               <w:rPr>
@@ -719,6 +788,7 @@
           <w:p>
             <w:pPr>
               <w:jc w:val="right"/>
+              <w:cnfStyle w:val="000000000000" w:firstRow="0" w:lastRow="0" w:firstColumn="0" w:lastColumn="0" w:oddVBand="0" w:evenVBand="0" w:oddHBand="0" w:evenHBand="0" w:firstRowFirstColumn="0" w:firstRowLastColumn="0" w:lastRowFirstColumn="0" w:lastRowLastColumn="0"/>
             </w:pPr>
             <w:r>
               <w:rPr>
@@ -730,8 +800,12 @@
         </w:tc>
       </w:tr>
       <w:tr>
-        <w:tc>
-          <w:tcPr>
+        <w:trPr>
+          <w:cnfStyle w:val="000000100000" w:firstRow="0" w:lastRow="0" w:firstColumn="0" w:lastColumn="0" w:oddVBand="0" w:evenVBand="0" w:oddHBand="1" w:evenHBand="0" w:firstRowFirstColumn="0" w:firstRowLastColumn="0" w:lastRowFirstColumn="0" w:lastRowLastColumn="0"/>
+        </w:trPr>
+        <w:tc>
+          <w:tcPr>
+            <w:cnfStyle w:val="001000000000" w:firstRow="0" w:lastRow="0" w:firstColumn="1" w:lastColumn="0" w:oddVBand="0" w:evenVBand="0" w:oddHBand="0" w:evenHBand="0" w:firstRowFirstColumn="0" w:firstRowLastColumn="0" w:lastRowFirstColumn="0" w:lastRowLastColumn="0"/>
             <w:tcW w:w="2889" w:type="dxa"/>
           </w:tcPr>
           <w:p>
@@ -750,6 +824,7 @@
           <w:p>
             <w:pPr>
               <w:jc w:val="right"/>
+              <w:cnfStyle w:val="000000100000" w:firstRow="0" w:lastRow="0" w:firstColumn="0" w:lastColumn="0" w:oddVBand="0" w:evenVBand="0" w:oddHBand="1" w:evenHBand="0" w:firstRowFirstColumn="0" w:firstRowLastColumn="0" w:lastRowFirstColumn="0" w:lastRowLastColumn="0"/>
             </w:pPr>
             <w:r>
               <w:rPr>
@@ -766,6 +841,7 @@
           <w:p>
             <w:pPr>
               <w:jc w:val="right"/>
+              <w:cnfStyle w:val="000000100000" w:firstRow="0" w:lastRow="0" w:firstColumn="0" w:lastColumn="0" w:oddVBand="0" w:evenVBand="0" w:oddHBand="1" w:evenHBand="0" w:firstRowFirstColumn="0" w:firstRowLastColumn="0" w:lastRowFirstColumn="0" w:lastRowLastColumn="0"/>
             </w:pPr>
             <w:r>
               <w:rPr>
@@ -782,6 +858,7 @@
           <w:p>
             <w:pPr>
               <w:jc w:val="right"/>
+              <w:cnfStyle w:val="000000100000" w:firstRow="0" w:lastRow="0" w:firstColumn="0" w:lastColumn="0" w:oddVBand="0" w:evenVBand="0" w:oddHBand="1" w:evenHBand="0" w:firstRowFirstColumn="0" w:firstRowLastColumn="0" w:lastRowFirstColumn="0" w:lastRowLastColumn="0"/>
             </w:pPr>
             <w:r>
               <w:rPr>
@@ -798,6 +875,7 @@
           <w:p>
             <w:pPr>
               <w:jc w:val="right"/>
+              <w:cnfStyle w:val="000000100000" w:firstRow="0" w:lastRow="0" w:firstColumn="0" w:lastColumn="0" w:oddVBand="0" w:evenVBand="0" w:oddHBand="1" w:evenHBand="0" w:firstRowFirstColumn="0" w:firstRowLastColumn="0" w:lastRowFirstColumn="0" w:lastRowLastColumn="0"/>
             </w:pPr>
             <w:r>
               <w:rPr>
@@ -814,6 +892,7 @@
           <w:p>
             <w:pPr>
               <w:jc w:val="right"/>
+              <w:cnfStyle w:val="000000100000" w:firstRow="0" w:lastRow="0" w:firstColumn="0" w:lastColumn="0" w:oddVBand="0" w:evenVBand="0" w:oddHBand="1" w:evenHBand="0" w:firstRowFirstColumn="0" w:firstRowLastColumn="0" w:lastRowFirstColumn="0" w:lastRowLastColumn="0"/>
             </w:pPr>
             <w:r>
               <w:rPr>
@@ -827,6 +906,7 @@
       <w:tr>
         <w:tc>
           <w:tcPr>
+            <w:cnfStyle w:val="001000000000" w:firstRow="0" w:lastRow="0" w:firstColumn="1" w:lastColumn="0" w:oddVBand="0" w:evenVBand="0" w:oddHBand="0" w:evenHBand="0" w:firstRowFirstColumn="0" w:firstRowLastColumn="0" w:lastRowFirstColumn="0" w:lastRowLastColumn="0"/>
             <w:tcW w:w="2889" w:type="dxa"/>
           </w:tcPr>
           <w:p>
@@ -845,6 +925,7 @@
           <w:p>
             <w:pPr>
               <w:jc w:val="right"/>
+              <w:cnfStyle w:val="000000000000" w:firstRow="0" w:lastRow="0" w:firstColumn="0" w:lastColumn="0" w:oddVBand="0" w:evenVBand="0" w:oddHBand="0" w:evenHBand="0" w:firstRowFirstColumn="0" w:firstRowLastColumn="0" w:lastRowFirstColumn="0" w:lastRowLastColumn="0"/>
             </w:pPr>
             <w:r>
               <w:rPr>
@@ -861,6 +942,7 @@
           <w:p>
             <w:pPr>
               <w:jc w:val="right"/>
+              <w:cnfStyle w:val="000000000000" w:firstRow="0" w:lastRow="0" w:firstColumn="0" w:lastColumn="0" w:oddVBand="0" w:evenVBand="0" w:oddHBand="0" w:evenHBand="0" w:firstRowFirstColumn="0" w:firstRowLastColumn="0" w:lastRowFirstColumn="0" w:lastRowLastColumn="0"/>
             </w:pPr>
             <w:r>
               <w:rPr>
@@ -877,6 +959,7 @@
           <w:p>
             <w:pPr>
               <w:jc w:val="right"/>
+              <w:cnfStyle w:val="000000000000" w:firstRow="0" w:lastRow="0" w:firstColumn="0" w:lastColumn="0" w:oddVBand="0" w:evenVBand="0" w:oddHBand="0" w:evenHBand="0" w:firstRowFirstColumn="0" w:firstRowLastColumn="0" w:lastRowFirstColumn="0" w:lastRowLastColumn="0"/>
             </w:pPr>
             <w:r>
               <w:rPr>
@@ -893,6 +976,7 @@
           <w:p>
             <w:pPr>
               <w:jc w:val="right"/>
+              <w:cnfStyle w:val="000000000000" w:firstRow="0" w:lastRow="0" w:firstColumn="0" w:lastColumn="0" w:oddVBand="0" w:evenVBand="0" w:oddHBand="0" w:evenHBand="0" w:firstRowFirstColumn="0" w:firstRowLastColumn="0" w:lastRowFirstColumn="0" w:lastRowLastColumn="0"/>
             </w:pPr>
             <w:r>
               <w:rPr>
@@ -909,6 +993,7 @@
           <w:p>
             <w:pPr>
               <w:jc w:val="right"/>
+              <w:cnfStyle w:val="000000000000" w:firstRow="0" w:lastRow="0" w:firstColumn="0" w:lastColumn="0" w:oddVBand="0" w:evenVBand="0" w:oddHBand="0" w:evenHBand="0" w:firstRowFirstColumn="0" w:firstRowLastColumn="0" w:lastRowFirstColumn="0" w:lastRowLastColumn="0"/>
             </w:pPr>
             <w:r>
               <w:rPr>
@@ -957,11 +1042,10 @@
         <w:rPr>
           <w:noProof/>
         </w:rPr>
-        <w:lastRenderedPageBreak/>
         <w:drawing>
-          <wp:inline distT="0" distB="0" distL="0" distR="0" wp14:anchorId="3A403675" wp14:editId="4C75EDFC">
-            <wp:extent cx="5486400" cy="5206838"/>
-            <wp:effectExtent l="0" t="0" r="0" b="0"/>
+          <wp:inline distT="0" distB="0" distL="0" distR="0" wp14:anchorId="3A403675" wp14:editId="52EAA6D6">
+            <wp:extent cx="3562234" cy="3380719"/>
+            <wp:effectExtent l="0" t="0" r="635" b="0"/>
             <wp:docPr id="1" name="Picture 1"/>
             <wp:cNvGraphicFramePr>
               <a:graphicFrameLocks xmlns:a="http://schemas.openxmlformats.org/drawingml/2006/main" noChangeAspect="1"/>
@@ -982,7 +1066,7 @@
                   <pic:spPr>
                     <a:xfrm>
                       <a:off x="0" y="0"/>
-                      <a:ext cx="5486400" cy="5206838"/>
+                      <a:ext cx="3572399" cy="3390366"/>
                     </a:xfrm>
                     <a:prstGeom prst="rect">
                       <a:avLst/>
@@ -1009,6 +1093,7 @@
     </w:p>
     <w:p>
       <w:r>
+        <w:lastRenderedPageBreak/>
         <w:t>The matrix holds 38 substitutions spread across 36 distinct cells. Only two cells reach a count of two, AA replaced by AH and EH replaced by ER. Every other cell holds a single event. Thirty-six distinct confusions from 38 substitutions means the errors do not repeat: the model does not confuse one particular sound for another in a consistent way that could be corrected with a targeted rule. The sample is small enough that a systematic pattern could still emerge at larger scale, so this describes the current data without ruling that out.</w:t>
       </w:r>
     </w:p>
@@ -1019,7 +1104,6 @@
     </w:p>
     <w:p>
       <w:r>
-        <w:lastRenderedPageBreak/>
         <w:t>For completeness: an earlier version of this matrix was computed incorrectly. It joined each phoneme sequence into one unbroken string before aligning, which made it compare individual letters and produce meaningless pairs such as the letter A against the letter E. That computation has been replaced by the sound-level matrix shown here, and any earlier figure built from it should be disregarded.</w:t>
       </w:r>
     </w:p>
@@ -1038,7 +1122,7 @@
     </w:p>
     <w:tbl>
       <w:tblPr>
-        <w:tblStyle w:val="TableGrid"/>
+        <w:tblStyle w:val="PlainTable5"/>
         <w:tblW w:w="8620" w:type="dxa"/>
         <w:tblLook w:val="04A0" w:firstRow="1" w:lastRow="0" w:firstColumn="1" w:lastColumn="0" w:noHBand="0" w:noVBand="1"/>
       </w:tblPr>
@@ -1050,8 +1134,12 @@
         <w:gridCol w:w="1847"/>
       </w:tblGrid>
       <w:tr>
-        <w:tc>
-          <w:tcPr>
+        <w:trPr>
+          <w:cnfStyle w:val="100000000000" w:firstRow="1" w:lastRow="0" w:firstColumn="0" w:lastColumn="0" w:oddVBand="0" w:evenVBand="0" w:oddHBand="0" w:evenHBand="0" w:firstRowFirstColumn="0" w:firstRowLastColumn="0" w:lastRowFirstColumn="0" w:lastRowLastColumn="0"/>
+        </w:trPr>
+        <w:tc>
+          <w:tcPr>
+            <w:cnfStyle w:val="001000000100" w:firstRow="0" w:lastRow="0" w:firstColumn="1" w:lastColumn="0" w:oddVBand="0" w:evenVBand="0" w:oddHBand="0" w:evenHBand="0" w:firstRowFirstColumn="1" w:firstRowLastColumn="0" w:lastRowFirstColumn="0" w:lastRowLastColumn="0"/>
             <w:tcW w:w="1719" w:type="dxa"/>
           </w:tcPr>
           <w:p>
@@ -1069,6 +1157,9 @@
             <w:tcW w:w="1363" w:type="dxa"/>
           </w:tcPr>
           <w:p>
+            <w:pPr>
+              <w:cnfStyle w:val="100000000000" w:firstRow="1" w:lastRow="0" w:firstColumn="0" w:lastColumn="0" w:oddVBand="0" w:evenVBand="0" w:oddHBand="0" w:evenHBand="0" w:firstRowFirstColumn="0" w:firstRowLastColumn="0" w:lastRowFirstColumn="0" w:lastRowLastColumn="0"/>
+            </w:pPr>
             <w:r>
               <w:rPr>
                 <w:b/>
@@ -1083,6 +1174,9 @@
             <w:tcW w:w="2994" w:type="dxa"/>
           </w:tcPr>
           <w:p>
+            <w:pPr>
+              <w:cnfStyle w:val="100000000000" w:firstRow="1" w:lastRow="0" w:firstColumn="0" w:lastColumn="0" w:oddVBand="0" w:evenVBand="0" w:oddHBand="0" w:evenHBand="0" w:firstRowFirstColumn="0" w:firstRowLastColumn="0" w:lastRowFirstColumn="0" w:lastRowLastColumn="0"/>
+            </w:pPr>
             <w:r>
               <w:rPr>
                 <w:b/>
@@ -1097,6 +1191,9 @@
             <w:tcW w:w="697" w:type="dxa"/>
           </w:tcPr>
           <w:p>
+            <w:pPr>
+              <w:cnfStyle w:val="100000000000" w:firstRow="1" w:lastRow="0" w:firstColumn="0" w:lastColumn="0" w:oddVBand="0" w:evenVBand="0" w:oddHBand="0" w:evenHBand="0" w:firstRowFirstColumn="0" w:firstRowLastColumn="0" w:lastRowFirstColumn="0" w:lastRowLastColumn="0"/>
+            </w:pPr>
             <w:r>
               <w:rPr>
                 <w:b/>
@@ -1111,6 +1208,9 @@
             <w:tcW w:w="1847" w:type="dxa"/>
           </w:tcPr>
           <w:p>
+            <w:pPr>
+              <w:cnfStyle w:val="100000000000" w:firstRow="1" w:lastRow="0" w:firstColumn="0" w:lastColumn="0" w:oddVBand="0" w:evenVBand="0" w:oddHBand="0" w:evenHBand="0" w:firstRowFirstColumn="0" w:firstRowLastColumn="0" w:lastRowFirstColumn="0" w:lastRowLastColumn="0"/>
+            </w:pPr>
             <w:r>
               <w:rPr>
                 <w:b/>
@@ -1122,8 +1222,12 @@
         </w:tc>
       </w:tr>
       <w:tr>
-        <w:tc>
-          <w:tcPr>
+        <w:trPr>
+          <w:cnfStyle w:val="000000100000" w:firstRow="0" w:lastRow="0" w:firstColumn="0" w:lastColumn="0" w:oddVBand="0" w:evenVBand="0" w:oddHBand="1" w:evenHBand="0" w:firstRowFirstColumn="0" w:firstRowLastColumn="0" w:lastRowFirstColumn="0" w:lastRowLastColumn="0"/>
+        </w:trPr>
+        <w:tc>
+          <w:tcPr>
+            <w:cnfStyle w:val="001000000000" w:firstRow="0" w:lastRow="0" w:firstColumn="1" w:lastColumn="0" w:oddVBand="0" w:evenVBand="0" w:oddHBand="0" w:evenHBand="0" w:firstRowFirstColumn="0" w:firstRowLastColumn="0" w:lastRowFirstColumn="0" w:lastRowLastColumn="0"/>
             <w:tcW w:w="1719" w:type="dxa"/>
           </w:tcPr>
           <w:p>
@@ -1142,6 +1246,7 @@
           <w:p>
             <w:pPr>
               <w:jc w:val="right"/>
+              <w:cnfStyle w:val="000000100000" w:firstRow="0" w:lastRow="0" w:firstColumn="0" w:lastColumn="0" w:oddVBand="0" w:evenVBand="0" w:oddHBand="1" w:evenHBand="0" w:firstRowFirstColumn="0" w:firstRowLastColumn="0" w:lastRowFirstColumn="0" w:lastRowLastColumn="0"/>
             </w:pPr>
             <w:r>
               <w:rPr>
@@ -1158,6 +1263,7 @@
           <w:p>
             <w:pPr>
               <w:jc w:val="right"/>
+              <w:cnfStyle w:val="000000100000" w:firstRow="0" w:lastRow="0" w:firstColumn="0" w:lastColumn="0" w:oddVBand="0" w:evenVBand="0" w:oddHBand="1" w:evenHBand="0" w:firstRowFirstColumn="0" w:firstRowLastColumn="0" w:lastRowFirstColumn="0" w:lastRowLastColumn="0"/>
             </w:pPr>
             <w:r>
               <w:rPr>
@@ -1174,6 +1280,7 @@
           <w:p>
             <w:pPr>
               <w:jc w:val="right"/>
+              <w:cnfStyle w:val="000000100000" w:firstRow="0" w:lastRow="0" w:firstColumn="0" w:lastColumn="0" w:oddVBand="0" w:evenVBand="0" w:oddHBand="1" w:evenHBand="0" w:firstRowFirstColumn="0" w:firstRowLastColumn="0" w:lastRowFirstColumn="0" w:lastRowLastColumn="0"/>
             </w:pPr>
             <w:r>
               <w:rPr>
@@ -1188,6 +1295,9 @@
             <w:tcW w:w="1847" w:type="dxa"/>
           </w:tcPr>
           <w:p>
+            <w:pPr>
+              <w:cnfStyle w:val="000000100000" w:firstRow="0" w:lastRow="0" w:firstColumn="0" w:lastColumn="0" w:oddVBand="0" w:evenVBand="0" w:oddHBand="1" w:evenHBand="0" w:firstRowFirstColumn="0" w:firstRowLastColumn="0" w:lastRowFirstColumn="0" w:lastRowLastColumn="0"/>
+            </w:pPr>
             <w:r>
               <w:rPr>
                 <w:sz w:val="19"/>
@@ -1198,8 +1308,12 @@
         </w:tc>
       </w:tr>
       <w:tr>
-        <w:tc>
-          <w:tcPr>
+        <w:trPr>
+          <w:trHeight w:val="137"/>
+        </w:trPr>
+        <w:tc>
+          <w:tcPr>
+            <w:cnfStyle w:val="001000000000" w:firstRow="0" w:lastRow="0" w:firstColumn="1" w:lastColumn="0" w:oddVBand="0" w:evenVBand="0" w:oddHBand="0" w:evenHBand="0" w:firstRowFirstColumn="0" w:firstRowLastColumn="0" w:lastRowFirstColumn="0" w:lastRowLastColumn="0"/>
             <w:tcW w:w="1719" w:type="dxa"/>
           </w:tcPr>
           <w:p>
@@ -1218,6 +1332,7 @@
           <w:p>
             <w:pPr>
               <w:jc w:val="right"/>
+              <w:cnfStyle w:val="000000000000" w:firstRow="0" w:lastRow="0" w:firstColumn="0" w:lastColumn="0" w:oddVBand="0" w:evenVBand="0" w:oddHBand="0" w:evenHBand="0" w:firstRowFirstColumn="0" w:firstRowLastColumn="0" w:lastRowFirstColumn="0" w:lastRowLastColumn="0"/>
             </w:pPr>
             <w:r>
               <w:rPr>
@@ -1234,6 +1349,7 @@
           <w:p>
             <w:pPr>
               <w:jc w:val="right"/>
+              <w:cnfStyle w:val="000000000000" w:firstRow="0" w:lastRow="0" w:firstColumn="0" w:lastColumn="0" w:oddVBand="0" w:evenVBand="0" w:oddHBand="0" w:evenHBand="0" w:firstRowFirstColumn="0" w:firstRowLastColumn="0" w:lastRowFirstColumn="0" w:lastRowLastColumn="0"/>
             </w:pPr>
             <w:r>
               <w:rPr>
@@ -1250,6 +1366,7 @@
           <w:p>
             <w:pPr>
               <w:jc w:val="right"/>
+              <w:cnfStyle w:val="000000000000" w:firstRow="0" w:lastRow="0" w:firstColumn="0" w:lastColumn="0" w:oddVBand="0" w:evenVBand="0" w:oddHBand="0" w:evenHBand="0" w:firstRowFirstColumn="0" w:firstRowLastColumn="0" w:lastRowFirstColumn="0" w:lastRowLastColumn="0"/>
             </w:pPr>
             <w:r>
               <w:rPr>
@@ -1264,6 +1381,9 @@
             <w:tcW w:w="1847" w:type="dxa"/>
           </w:tcPr>
           <w:p>
+            <w:pPr>
+              <w:cnfStyle w:val="000000000000" w:firstRow="0" w:lastRow="0" w:firstColumn="0" w:lastColumn="0" w:oddVBand="0" w:evenVBand="0" w:oddHBand="0" w:evenHBand="0" w:firstRowFirstColumn="0" w:firstRowLastColumn="0" w:lastRowFirstColumn="0" w:lastRowLastColumn="0"/>
+            </w:pPr>
             <w:r>
               <w:rPr>
                 <w:sz w:val="19"/>
@@ -1274,8 +1394,12 @@
         </w:tc>
       </w:tr>
       <w:tr>
-        <w:tc>
-          <w:tcPr>
+        <w:trPr>
+          <w:cnfStyle w:val="000000100000" w:firstRow="0" w:lastRow="0" w:firstColumn="0" w:lastColumn="0" w:oddVBand="0" w:evenVBand="0" w:oddHBand="1" w:evenHBand="0" w:firstRowFirstColumn="0" w:firstRowLastColumn="0" w:lastRowFirstColumn="0" w:lastRowLastColumn="0"/>
+        </w:trPr>
+        <w:tc>
+          <w:tcPr>
+            <w:cnfStyle w:val="001000000000" w:firstRow="0" w:lastRow="0" w:firstColumn="1" w:lastColumn="0" w:oddVBand="0" w:evenVBand="0" w:oddHBand="0" w:evenHBand="0" w:firstRowFirstColumn="0" w:firstRowLastColumn="0" w:lastRowFirstColumn="0" w:lastRowLastColumn="0"/>
             <w:tcW w:w="1719" w:type="dxa"/>
           </w:tcPr>
           <w:p>
@@ -1294,6 +1418,7 @@
           <w:p>
             <w:pPr>
               <w:jc w:val="right"/>
+              <w:cnfStyle w:val="000000100000" w:firstRow="0" w:lastRow="0" w:firstColumn="0" w:lastColumn="0" w:oddVBand="0" w:evenVBand="0" w:oddHBand="1" w:evenHBand="0" w:firstRowFirstColumn="0" w:firstRowLastColumn="0" w:lastRowFirstColumn="0" w:lastRowLastColumn="0"/>
             </w:pPr>
             <w:r>
               <w:rPr>
@@ -1310,6 +1435,7 @@
           <w:p>
             <w:pPr>
               <w:jc w:val="right"/>
+              <w:cnfStyle w:val="000000100000" w:firstRow="0" w:lastRow="0" w:firstColumn="0" w:lastColumn="0" w:oddVBand="0" w:evenVBand="0" w:oddHBand="1" w:evenHBand="0" w:firstRowFirstColumn="0" w:firstRowLastColumn="0" w:lastRowFirstColumn="0" w:lastRowLastColumn="0"/>
             </w:pPr>
             <w:r>
               <w:rPr>
@@ -1326,6 +1452,7 @@
           <w:p>
             <w:pPr>
               <w:jc w:val="right"/>
+              <w:cnfStyle w:val="000000100000" w:firstRow="0" w:lastRow="0" w:firstColumn="0" w:lastColumn="0" w:oddVBand="0" w:evenVBand="0" w:oddHBand="1" w:evenHBand="0" w:firstRowFirstColumn="0" w:firstRowLastColumn="0" w:lastRowFirstColumn="0" w:lastRowLastColumn="0"/>
             </w:pPr>
             <w:r>
               <w:rPr>
@@ -1340,6 +1467,9 @@
             <w:tcW w:w="1847" w:type="dxa"/>
           </w:tcPr>
           <w:p>
+            <w:pPr>
+              <w:cnfStyle w:val="000000100000" w:firstRow="0" w:lastRow="0" w:firstColumn="0" w:lastColumn="0" w:oddVBand="0" w:evenVBand="0" w:oddHBand="1" w:evenHBand="0" w:firstRowFirstColumn="0" w:firstRowLastColumn="0" w:lastRowFirstColumn="0" w:lastRowLastColumn="0"/>
+            </w:pPr>
             <w:r>
               <w:rPr>
                 <w:sz w:val="19"/>
@@ -1352,6 +1482,7 @@
       <w:tr>
         <w:tc>
           <w:tcPr>
+            <w:cnfStyle w:val="001000000000" w:firstRow="0" w:lastRow="0" w:firstColumn="1" w:lastColumn="0" w:oddVBand="0" w:evenVBand="0" w:oddHBand="0" w:evenHBand="0" w:firstRowFirstColumn="0" w:firstRowLastColumn="0" w:lastRowFirstColumn="0" w:lastRowLastColumn="0"/>
             <w:tcW w:w="1719" w:type="dxa"/>
           </w:tcPr>
           <w:p>
@@ -1370,6 +1501,7 @@
           <w:p>
             <w:pPr>
               <w:jc w:val="right"/>
+              <w:cnfStyle w:val="000000000000" w:firstRow="0" w:lastRow="0" w:firstColumn="0" w:lastColumn="0" w:oddVBand="0" w:evenVBand="0" w:oddHBand="0" w:evenHBand="0" w:firstRowFirstColumn="0" w:firstRowLastColumn="0" w:lastRowFirstColumn="0" w:lastRowLastColumn="0"/>
             </w:pPr>
             <w:r>
               <w:rPr>
@@ -1386,6 +1518,7 @@
           <w:p>
             <w:pPr>
               <w:jc w:val="right"/>
+              <w:cnfStyle w:val="000000000000" w:firstRow="0" w:lastRow="0" w:firstColumn="0" w:lastColumn="0" w:oddVBand="0" w:evenVBand="0" w:oddHBand="0" w:evenHBand="0" w:firstRowFirstColumn="0" w:firstRowLastColumn="0" w:lastRowFirstColumn="0" w:lastRowLastColumn="0"/>
             </w:pPr>
             <w:r>
               <w:rPr>
@@ -1402,6 +1535,7 @@
           <w:p>
             <w:pPr>
               <w:jc w:val="right"/>
+              <w:cnfStyle w:val="000000000000" w:firstRow="0" w:lastRow="0" w:firstColumn="0" w:lastColumn="0" w:oddVBand="0" w:evenVBand="0" w:oddHBand="0" w:evenHBand="0" w:firstRowFirstColumn="0" w:firstRowLastColumn="0" w:lastRowFirstColumn="0" w:lastRowLastColumn="0"/>
             </w:pPr>
             <w:r>
               <w:rPr>
@@ -1416,6 +1550,9 @@
             <w:tcW w:w="1847" w:type="dxa"/>
           </w:tcPr>
           <w:p>
+            <w:pPr>
+              <w:cnfStyle w:val="000000000000" w:firstRow="0" w:lastRow="0" w:firstColumn="0" w:lastColumn="0" w:oddVBand="0" w:evenVBand="0" w:oddHBand="0" w:evenHBand="0" w:firstRowFirstColumn="0" w:firstRowLastColumn="0" w:lastRowFirstColumn="0" w:lastRowLastColumn="0"/>
+            </w:pPr>
             <w:r>
               <w:rPr>
                 <w:sz w:val="19"/>
@@ -1426,8 +1563,12 @@
         </w:tc>
       </w:tr>
       <w:tr>
-        <w:tc>
-          <w:tcPr>
+        <w:trPr>
+          <w:cnfStyle w:val="000000100000" w:firstRow="0" w:lastRow="0" w:firstColumn="0" w:lastColumn="0" w:oddVBand="0" w:evenVBand="0" w:oddHBand="1" w:evenHBand="0" w:firstRowFirstColumn="0" w:firstRowLastColumn="0" w:lastRowFirstColumn="0" w:lastRowLastColumn="0"/>
+        </w:trPr>
+        <w:tc>
+          <w:tcPr>
+            <w:cnfStyle w:val="001000000000" w:firstRow="0" w:lastRow="0" w:firstColumn="1" w:lastColumn="0" w:oddVBand="0" w:evenVBand="0" w:oddHBand="0" w:evenHBand="0" w:firstRowFirstColumn="0" w:firstRowLastColumn="0" w:lastRowFirstColumn="0" w:lastRowLastColumn="0"/>
             <w:tcW w:w="1719" w:type="dxa"/>
           </w:tcPr>
           <w:p>
@@ -1446,6 +1587,7 @@
           <w:p>
             <w:pPr>
               <w:jc w:val="right"/>
+              <w:cnfStyle w:val="000000100000" w:firstRow="0" w:lastRow="0" w:firstColumn="0" w:lastColumn="0" w:oddVBand="0" w:evenVBand="0" w:oddHBand="1" w:evenHBand="0" w:firstRowFirstColumn="0" w:firstRowLastColumn="0" w:lastRowFirstColumn="0" w:lastRowLastColumn="0"/>
             </w:pPr>
             <w:r>
               <w:rPr>
@@ -1462,6 +1604,7 @@
           <w:p>
             <w:pPr>
               <w:jc w:val="right"/>
+              <w:cnfStyle w:val="000000100000" w:firstRow="0" w:lastRow="0" w:firstColumn="0" w:lastColumn="0" w:oddVBand="0" w:evenVBand="0" w:oddHBand="1" w:evenHBand="0" w:firstRowFirstColumn="0" w:firstRowLastColumn="0" w:lastRowFirstColumn="0" w:lastRowLastColumn="0"/>
             </w:pPr>
             <w:r>
               <w:rPr>
@@ -1478,6 +1621,7 @@
           <w:p>
             <w:pPr>
               <w:jc w:val="right"/>
+              <w:cnfStyle w:val="000000100000" w:firstRow="0" w:lastRow="0" w:firstColumn="0" w:lastColumn="0" w:oddVBand="0" w:evenVBand="0" w:oddHBand="1" w:evenHBand="0" w:firstRowFirstColumn="0" w:firstRowLastColumn="0" w:lastRowFirstColumn="0" w:lastRowLastColumn="0"/>
             </w:pPr>
             <w:r>
               <w:rPr>
@@ -1492,6 +1636,9 @@
             <w:tcW w:w="1847" w:type="dxa"/>
           </w:tcPr>
           <w:p>
+            <w:pPr>
+              <w:cnfStyle w:val="000000100000" w:firstRow="0" w:lastRow="0" w:firstColumn="0" w:lastColumn="0" w:oddVBand="0" w:evenVBand="0" w:oddHBand="1" w:evenHBand="0" w:firstRowFirstColumn="0" w:firstRowLastColumn="0" w:lastRowFirstColumn="0" w:lastRowLastColumn="0"/>
+            </w:pPr>
             <w:r>
               <w:rPr>
                 <w:sz w:val="19"/>
@@ -1504,6 +1651,7 @@
       <w:tr>
         <w:tc>
           <w:tcPr>
+            <w:cnfStyle w:val="001000000000" w:firstRow="0" w:lastRow="0" w:firstColumn="1" w:lastColumn="0" w:oddVBand="0" w:evenVBand="0" w:oddHBand="0" w:evenHBand="0" w:firstRowFirstColumn="0" w:firstRowLastColumn="0" w:lastRowFirstColumn="0" w:lastRowLastColumn="0"/>
             <w:tcW w:w="1719" w:type="dxa"/>
           </w:tcPr>
           <w:p>
@@ -1522,6 +1670,7 @@
           <w:p>
             <w:pPr>
               <w:jc w:val="right"/>
+              <w:cnfStyle w:val="000000000000" w:firstRow="0" w:lastRow="0" w:firstColumn="0" w:lastColumn="0" w:oddVBand="0" w:evenVBand="0" w:oddHBand="0" w:evenHBand="0" w:firstRowFirstColumn="0" w:firstRowLastColumn="0" w:lastRowFirstColumn="0" w:lastRowLastColumn="0"/>
             </w:pPr>
             <w:r>
               <w:rPr>
@@ -1538,6 +1687,7 @@
           <w:p>
             <w:pPr>
               <w:jc w:val="right"/>
+              <w:cnfStyle w:val="000000000000" w:firstRow="0" w:lastRow="0" w:firstColumn="0" w:lastColumn="0" w:oddVBand="0" w:evenVBand="0" w:oddHBand="0" w:evenHBand="0" w:firstRowFirstColumn="0" w:firstRowLastColumn="0" w:lastRowFirstColumn="0" w:lastRowLastColumn="0"/>
             </w:pPr>
             <w:r>
               <w:rPr>
@@ -1554,6 +1704,7 @@
           <w:p>
             <w:pPr>
               <w:jc w:val="right"/>
+              <w:cnfStyle w:val="000000000000" w:firstRow="0" w:lastRow="0" w:firstColumn="0" w:lastColumn="0" w:oddVBand="0" w:evenVBand="0" w:oddHBand="0" w:evenHBand="0" w:firstRowFirstColumn="0" w:firstRowLastColumn="0" w:lastRowFirstColumn="0" w:lastRowLastColumn="0"/>
             </w:pPr>
             <w:r>
               <w:rPr>
@@ -1568,6 +1719,9 @@
             <w:tcW w:w="1847" w:type="dxa"/>
           </w:tcPr>
           <w:p>
+            <w:pPr>
+              <w:cnfStyle w:val="000000000000" w:firstRow="0" w:lastRow="0" w:firstColumn="0" w:lastColumn="0" w:oddVBand="0" w:evenVBand="0" w:oddHBand="0" w:evenHBand="0" w:firstRowFirstColumn="0" w:firstRowLastColumn="0" w:lastRowFirstColumn="0" w:lastRowLastColumn="0"/>
+            </w:pPr>
             <w:r>
               <w:rPr>
                 <w:sz w:val="19"/>
@@ -1578,8 +1732,12 @@
         </w:tc>
       </w:tr>
       <w:tr>
-        <w:tc>
-          <w:tcPr>
+        <w:trPr>
+          <w:cnfStyle w:val="000000100000" w:firstRow="0" w:lastRow="0" w:firstColumn="0" w:lastColumn="0" w:oddVBand="0" w:evenVBand="0" w:oddHBand="1" w:evenHBand="0" w:firstRowFirstColumn="0" w:firstRowLastColumn="0" w:lastRowFirstColumn="0" w:lastRowLastColumn="0"/>
+        </w:trPr>
+        <w:tc>
+          <w:tcPr>
+            <w:cnfStyle w:val="001000000000" w:firstRow="0" w:lastRow="0" w:firstColumn="1" w:lastColumn="0" w:oddVBand="0" w:evenVBand="0" w:oddHBand="0" w:evenHBand="0" w:firstRowFirstColumn="0" w:firstRowLastColumn="0" w:lastRowFirstColumn="0" w:lastRowLastColumn="0"/>
             <w:tcW w:w="1719" w:type="dxa"/>
           </w:tcPr>
           <w:p>
@@ -1598,6 +1756,7 @@
           <w:p>
             <w:pPr>
               <w:jc w:val="right"/>
+              <w:cnfStyle w:val="000000100000" w:firstRow="0" w:lastRow="0" w:firstColumn="0" w:lastColumn="0" w:oddVBand="0" w:evenVBand="0" w:oddHBand="1" w:evenHBand="0" w:firstRowFirstColumn="0" w:firstRowLastColumn="0" w:lastRowFirstColumn="0" w:lastRowLastColumn="0"/>
             </w:pPr>
             <w:r>
               <w:rPr>
@@ -1614,6 +1773,7 @@
           <w:p>
             <w:pPr>
               <w:jc w:val="right"/>
+              <w:cnfStyle w:val="000000100000" w:firstRow="0" w:lastRow="0" w:firstColumn="0" w:lastColumn="0" w:oddVBand="0" w:evenVBand="0" w:oddHBand="1" w:evenHBand="0" w:firstRowFirstColumn="0" w:firstRowLastColumn="0" w:lastRowFirstColumn="0" w:lastRowLastColumn="0"/>
             </w:pPr>
             <w:r>
               <w:rPr>
@@ -1630,6 +1790,7 @@
           <w:p>
             <w:pPr>
               <w:jc w:val="right"/>
+              <w:cnfStyle w:val="000000100000" w:firstRow="0" w:lastRow="0" w:firstColumn="0" w:lastColumn="0" w:oddVBand="0" w:evenVBand="0" w:oddHBand="1" w:evenHBand="0" w:firstRowFirstColumn="0" w:firstRowLastColumn="0" w:lastRowFirstColumn="0" w:lastRowLastColumn="0"/>
             </w:pPr>
             <w:r>
               <w:rPr>
@@ -1644,6 +1805,9 @@
             <w:tcW w:w="1847" w:type="dxa"/>
           </w:tcPr>
           <w:p>
+            <w:pPr>
+              <w:cnfStyle w:val="000000100000" w:firstRow="0" w:lastRow="0" w:firstColumn="0" w:lastColumn="0" w:oddVBand="0" w:evenVBand="0" w:oddHBand="1" w:evenHBand="0" w:firstRowFirstColumn="0" w:firstRowLastColumn="0" w:lastRowFirstColumn="0" w:lastRowLastColumn="0"/>
+            </w:pPr>
             <w:r>
               <w:rPr>
                 <w:sz w:val="19"/>
@@ -1656,6 +1820,7 @@
       <w:tr>
         <w:tc>
           <w:tcPr>
+            <w:cnfStyle w:val="001000000000" w:firstRow="0" w:lastRow="0" w:firstColumn="1" w:lastColumn="0" w:oddVBand="0" w:evenVBand="0" w:oddHBand="0" w:evenHBand="0" w:firstRowFirstColumn="0" w:firstRowLastColumn="0" w:lastRowFirstColumn="0" w:lastRowLastColumn="0"/>
             <w:tcW w:w="1719" w:type="dxa"/>
           </w:tcPr>
           <w:p>
@@ -1674,6 +1839,7 @@
           <w:p>
             <w:pPr>
               <w:jc w:val="right"/>
+              <w:cnfStyle w:val="000000000000" w:firstRow="0" w:lastRow="0" w:firstColumn="0" w:lastColumn="0" w:oddVBand="0" w:evenVBand="0" w:oddHBand="0" w:evenHBand="0" w:firstRowFirstColumn="0" w:firstRowLastColumn="0" w:lastRowFirstColumn="0" w:lastRowLastColumn="0"/>
             </w:pPr>
             <w:r>
               <w:rPr>
@@ -1690,6 +1856,7 @@
           <w:p>
             <w:pPr>
               <w:jc w:val="right"/>
+              <w:cnfStyle w:val="000000000000" w:firstRow="0" w:lastRow="0" w:firstColumn="0" w:lastColumn="0" w:oddVBand="0" w:evenVBand="0" w:oddHBand="0" w:evenHBand="0" w:firstRowFirstColumn="0" w:firstRowLastColumn="0" w:lastRowFirstColumn="0" w:lastRowLastColumn="0"/>
             </w:pPr>
             <w:r>
               <w:rPr>
@@ -1706,6 +1873,7 @@
           <w:p>
             <w:pPr>
               <w:jc w:val="right"/>
+              <w:cnfStyle w:val="000000000000" w:firstRow="0" w:lastRow="0" w:firstColumn="0" w:lastColumn="0" w:oddVBand="0" w:evenVBand="0" w:oddHBand="0" w:evenHBand="0" w:firstRowFirstColumn="0" w:firstRowLastColumn="0" w:lastRowFirstColumn="0" w:lastRowLastColumn="0"/>
             </w:pPr>
             <w:r>
               <w:rPr>
@@ -1720,6 +1888,9 @@
             <w:tcW w:w="1847" w:type="dxa"/>
           </w:tcPr>
           <w:p>
+            <w:pPr>
+              <w:cnfStyle w:val="000000000000" w:firstRow="0" w:lastRow="0" w:firstColumn="0" w:lastColumn="0" w:oddVBand="0" w:evenVBand="0" w:oddHBand="0" w:evenHBand="0" w:firstRowFirstColumn="0" w:firstRowLastColumn="0" w:lastRowFirstColumn="0" w:lastRowLastColumn="0"/>
+            </w:pPr>
             <w:r>
               <w:rPr>
                 <w:sz w:val="19"/>
@@ -1743,6 +1914,7 @@
     </w:p>
     <w:p>
       <w:r>
+        <w:lastRenderedPageBreak/>
         <w:t>The replacement column shows the same dispersion as the matrix. AA is replaced by four different vowels across its five substitutions, and EH by three across its four, so where a sound fails more than once it tends to fail in a different direction each time.</w:t>
       </w:r>
     </w:p>
@@ -1753,7 +1925,7 @@
     </w:p>
     <w:tbl>
       <w:tblPr>
-        <w:tblStyle w:val="TableGrid"/>
+        <w:tblStyle w:val="PlainTable5"/>
         <w:tblW w:w="0" w:type="auto"/>
         <w:tblLook w:val="04A0" w:firstRow="1" w:lastRow="0" w:firstColumn="1" w:lastColumn="0" w:noHBand="0" w:noVBand="1"/>
       </w:tblPr>
@@ -1765,8 +1937,12 @@
         <w:gridCol w:w="1872"/>
       </w:tblGrid>
       <w:tr>
-        <w:tc>
-          <w:tcPr>
+        <w:trPr>
+          <w:cnfStyle w:val="100000000000" w:firstRow="1" w:lastRow="0" w:firstColumn="0" w:lastColumn="0" w:oddVBand="0" w:evenVBand="0" w:oddHBand="0" w:evenHBand="0" w:firstRowFirstColumn="0" w:firstRowLastColumn="0" w:lastRowFirstColumn="0" w:lastRowLastColumn="0"/>
+        </w:trPr>
+        <w:tc>
+          <w:tcPr>
+            <w:cnfStyle w:val="001000000100" w:firstRow="0" w:lastRow="0" w:firstColumn="1" w:lastColumn="0" w:oddVBand="0" w:evenVBand="0" w:oddHBand="0" w:evenHBand="0" w:firstRowFirstColumn="1" w:firstRowLastColumn="0" w:lastRowFirstColumn="0" w:lastRowLastColumn="0"/>
             <w:tcW w:w="1872" w:type="dxa"/>
           </w:tcPr>
           <w:p>
@@ -1784,6 +1960,9 @@
             <w:tcW w:w="1872" w:type="dxa"/>
           </w:tcPr>
           <w:p>
+            <w:pPr>
+              <w:cnfStyle w:val="100000000000" w:firstRow="1" w:lastRow="0" w:firstColumn="0" w:lastColumn="0" w:oddVBand="0" w:evenVBand="0" w:oddHBand="0" w:evenHBand="0" w:firstRowFirstColumn="0" w:firstRowLastColumn="0" w:lastRowFirstColumn="0" w:lastRowLastColumn="0"/>
+            </w:pPr>
             <w:r>
               <w:rPr>
                 <w:b/>
@@ -1798,6 +1977,9 @@
             <w:tcW w:w="1872" w:type="dxa"/>
           </w:tcPr>
           <w:p>
+            <w:pPr>
+              <w:cnfStyle w:val="100000000000" w:firstRow="1" w:lastRow="0" w:firstColumn="0" w:lastColumn="0" w:oddVBand="0" w:evenVBand="0" w:oddHBand="0" w:evenHBand="0" w:firstRowFirstColumn="0" w:firstRowLastColumn="0" w:lastRowFirstColumn="0" w:lastRowLastColumn="0"/>
+            </w:pPr>
             <w:r>
               <w:rPr>
                 <w:b/>
@@ -1812,6 +1994,9 @@
             <w:tcW w:w="1872" w:type="dxa"/>
           </w:tcPr>
           <w:p>
+            <w:pPr>
+              <w:cnfStyle w:val="100000000000" w:firstRow="1" w:lastRow="0" w:firstColumn="0" w:lastColumn="0" w:oddVBand="0" w:evenVBand="0" w:oddHBand="0" w:evenHBand="0" w:firstRowFirstColumn="0" w:firstRowLastColumn="0" w:lastRowFirstColumn="0" w:lastRowLastColumn="0"/>
+            </w:pPr>
             <w:r>
               <w:rPr>
                 <w:b/>
@@ -1826,6 +2011,9 @@
             <w:tcW w:w="1872" w:type="dxa"/>
           </w:tcPr>
           <w:p>
+            <w:pPr>
+              <w:cnfStyle w:val="100000000000" w:firstRow="1" w:lastRow="0" w:firstColumn="0" w:lastColumn="0" w:oddVBand="0" w:evenVBand="0" w:oddHBand="0" w:evenHBand="0" w:firstRowFirstColumn="0" w:firstRowLastColumn="0" w:lastRowFirstColumn="0" w:lastRowLastColumn="0"/>
+            </w:pPr>
             <w:r>
               <w:rPr>
                 <w:b/>
@@ -1837,8 +2025,12 @@
         </w:tc>
       </w:tr>
       <w:tr>
-        <w:tc>
-          <w:tcPr>
+        <w:trPr>
+          <w:cnfStyle w:val="000000100000" w:firstRow="0" w:lastRow="0" w:firstColumn="0" w:lastColumn="0" w:oddVBand="0" w:evenVBand="0" w:oddHBand="1" w:evenHBand="0" w:firstRowFirstColumn="0" w:firstRowLastColumn="0" w:lastRowFirstColumn="0" w:lastRowLastColumn="0"/>
+        </w:trPr>
+        <w:tc>
+          <w:tcPr>
+            <w:cnfStyle w:val="001000000000" w:firstRow="0" w:lastRow="0" w:firstColumn="1" w:lastColumn="0" w:oddVBand="0" w:evenVBand="0" w:oddHBand="0" w:evenHBand="0" w:firstRowFirstColumn="0" w:firstRowLastColumn="0" w:lastRowFirstColumn="0" w:lastRowLastColumn="0"/>
             <w:tcW w:w="1872" w:type="dxa"/>
           </w:tcPr>
           <w:p>
@@ -1857,6 +2049,7 @@
           <w:p>
             <w:pPr>
               <w:jc w:val="right"/>
+              <w:cnfStyle w:val="000000100000" w:firstRow="0" w:lastRow="0" w:firstColumn="0" w:lastColumn="0" w:oddVBand="0" w:evenVBand="0" w:oddHBand="1" w:evenHBand="0" w:firstRowFirstColumn="0" w:firstRowLastColumn="0" w:lastRowFirstColumn="0" w:lastRowLastColumn="0"/>
             </w:pPr>
             <w:r>
               <w:rPr>
@@ -1873,6 +2066,7 @@
           <w:p>
             <w:pPr>
               <w:jc w:val="right"/>
+              <w:cnfStyle w:val="000000100000" w:firstRow="0" w:lastRow="0" w:firstColumn="0" w:lastColumn="0" w:oddVBand="0" w:evenVBand="0" w:oddHBand="1" w:evenHBand="0" w:firstRowFirstColumn="0" w:firstRowLastColumn="0" w:lastRowFirstColumn="0" w:lastRowLastColumn="0"/>
             </w:pPr>
             <w:r>
               <w:rPr>
@@ -1889,6 +2083,7 @@
           <w:p>
             <w:pPr>
               <w:jc w:val="right"/>
+              <w:cnfStyle w:val="000000100000" w:firstRow="0" w:lastRow="0" w:firstColumn="0" w:lastColumn="0" w:oddVBand="0" w:evenVBand="0" w:oddHBand="1" w:evenHBand="0" w:firstRowFirstColumn="0" w:firstRowLastColumn="0" w:lastRowFirstColumn="0" w:lastRowLastColumn="0"/>
             </w:pPr>
             <w:r>
               <w:rPr>
@@ -1905,6 +2100,7 @@
           <w:p>
             <w:pPr>
               <w:jc w:val="right"/>
+              <w:cnfStyle w:val="000000100000" w:firstRow="0" w:lastRow="0" w:firstColumn="0" w:lastColumn="0" w:oddVBand="0" w:evenVBand="0" w:oddHBand="1" w:evenHBand="0" w:firstRowFirstColumn="0" w:firstRowLastColumn="0" w:lastRowFirstColumn="0" w:lastRowLastColumn="0"/>
             </w:pPr>
             <w:r>
               <w:rPr>
@@ -1918,6 +2114,7 @@
       <w:tr>
         <w:tc>
           <w:tcPr>
+            <w:cnfStyle w:val="001000000000" w:firstRow="0" w:lastRow="0" w:firstColumn="1" w:lastColumn="0" w:oddVBand="0" w:evenVBand="0" w:oddHBand="0" w:evenHBand="0" w:firstRowFirstColumn="0" w:firstRowLastColumn="0" w:lastRowFirstColumn="0" w:lastRowLastColumn="0"/>
             <w:tcW w:w="1872" w:type="dxa"/>
           </w:tcPr>
           <w:p>
@@ -1936,6 +2133,7 @@
           <w:p>
             <w:pPr>
               <w:jc w:val="right"/>
+              <w:cnfStyle w:val="000000000000" w:firstRow="0" w:lastRow="0" w:firstColumn="0" w:lastColumn="0" w:oddVBand="0" w:evenVBand="0" w:oddHBand="0" w:evenHBand="0" w:firstRowFirstColumn="0" w:firstRowLastColumn="0" w:lastRowFirstColumn="0" w:lastRowLastColumn="0"/>
             </w:pPr>
             <w:r>
               <w:rPr>
@@ -1952,6 +2150,7 @@
           <w:p>
             <w:pPr>
               <w:jc w:val="right"/>
+              <w:cnfStyle w:val="000000000000" w:firstRow="0" w:lastRow="0" w:firstColumn="0" w:lastColumn="0" w:oddVBand="0" w:evenVBand="0" w:oddHBand="0" w:evenHBand="0" w:firstRowFirstColumn="0" w:firstRowLastColumn="0" w:lastRowFirstColumn="0" w:lastRowLastColumn="0"/>
             </w:pPr>
             <w:r>
               <w:rPr>
@@ -1968,6 +2167,7 @@
           <w:p>
             <w:pPr>
               <w:jc w:val="right"/>
+              <w:cnfStyle w:val="000000000000" w:firstRow="0" w:lastRow="0" w:firstColumn="0" w:lastColumn="0" w:oddVBand="0" w:evenVBand="0" w:oddHBand="0" w:evenHBand="0" w:firstRowFirstColumn="0" w:firstRowLastColumn="0" w:lastRowFirstColumn="0" w:lastRowLastColumn="0"/>
             </w:pPr>
             <w:r>
               <w:rPr>
@@ -1984,6 +2184,7 @@
           <w:p>
             <w:pPr>
               <w:jc w:val="right"/>
+              <w:cnfStyle w:val="000000000000" w:firstRow="0" w:lastRow="0" w:firstColumn="0" w:lastColumn="0" w:oddVBand="0" w:evenVBand="0" w:oddHBand="0" w:evenHBand="0" w:firstRowFirstColumn="0" w:firstRowLastColumn="0" w:lastRowFirstColumn="0" w:lastRowLastColumn="0"/>
             </w:pPr>
             <w:r>
               <w:rPr>
@@ -1995,8 +2196,12 @@
         </w:tc>
       </w:tr>
       <w:tr>
-        <w:tc>
-          <w:tcPr>
+        <w:trPr>
+          <w:cnfStyle w:val="000000100000" w:firstRow="0" w:lastRow="0" w:firstColumn="0" w:lastColumn="0" w:oddVBand="0" w:evenVBand="0" w:oddHBand="1" w:evenHBand="0" w:firstRowFirstColumn="0" w:firstRowLastColumn="0" w:lastRowFirstColumn="0" w:lastRowLastColumn="0"/>
+        </w:trPr>
+        <w:tc>
+          <w:tcPr>
+            <w:cnfStyle w:val="001000000000" w:firstRow="0" w:lastRow="0" w:firstColumn="1" w:lastColumn="0" w:oddVBand="0" w:evenVBand="0" w:oddHBand="0" w:evenHBand="0" w:firstRowFirstColumn="0" w:firstRowLastColumn="0" w:lastRowFirstColumn="0" w:lastRowLastColumn="0"/>
             <w:tcW w:w="1872" w:type="dxa"/>
           </w:tcPr>
           <w:p>
@@ -2015,6 +2220,7 @@
           <w:p>
             <w:pPr>
               <w:jc w:val="right"/>
+              <w:cnfStyle w:val="000000100000" w:firstRow="0" w:lastRow="0" w:firstColumn="0" w:lastColumn="0" w:oddVBand="0" w:evenVBand="0" w:oddHBand="1" w:evenHBand="0" w:firstRowFirstColumn="0" w:firstRowLastColumn="0" w:lastRowFirstColumn="0" w:lastRowLastColumn="0"/>
             </w:pPr>
             <w:r>
               <w:rPr>
@@ -2031,6 +2237,7 @@
           <w:p>
             <w:pPr>
               <w:jc w:val="right"/>
+              <w:cnfStyle w:val="000000100000" w:firstRow="0" w:lastRow="0" w:firstColumn="0" w:lastColumn="0" w:oddVBand="0" w:evenVBand="0" w:oddHBand="1" w:evenHBand="0" w:firstRowFirstColumn="0" w:firstRowLastColumn="0" w:lastRowFirstColumn="0" w:lastRowLastColumn="0"/>
             </w:pPr>
             <w:r>
               <w:rPr>
@@ -2047,6 +2254,7 @@
           <w:p>
             <w:pPr>
               <w:jc w:val="right"/>
+              <w:cnfStyle w:val="000000100000" w:firstRow="0" w:lastRow="0" w:firstColumn="0" w:lastColumn="0" w:oddVBand="0" w:evenVBand="0" w:oddHBand="1" w:evenHBand="0" w:firstRowFirstColumn="0" w:firstRowLastColumn="0" w:lastRowFirstColumn="0" w:lastRowLastColumn="0"/>
             </w:pPr>
             <w:r>
               <w:rPr>
@@ -2063,6 +2271,7 @@
           <w:p>
             <w:pPr>
               <w:jc w:val="right"/>
+              <w:cnfStyle w:val="000000100000" w:firstRow="0" w:lastRow="0" w:firstColumn="0" w:lastColumn="0" w:oddVBand="0" w:evenVBand="0" w:oddHBand="1" w:evenHBand="0" w:firstRowFirstColumn="0" w:firstRowLastColumn="0" w:lastRowFirstColumn="0" w:lastRowLastColumn="0"/>
             </w:pPr>
             <w:r>
               <w:rPr>
@@ -2077,7 +2286,6 @@
     <w:p/>
     <w:p>
       <w:r>
-        <w:lastRenderedPageBreak/>
         <w:t>Voicing is preserved least often at 26%, which suggests voicing errors tend to miss by a full articulatory step. Homophone rows preserve place and manner about half the time while non-homophone rows preserve them less often, which is consistent with errors in homophone sentences being closer to the target than errors elsewhere. The non-homophone figures rest on 11 substitutions, so this difference is suggestive rather than established.</w:t>
       </w:r>
     </w:p>
@@ -2096,24 +2304,26 @@
     </w:p>
     <w:tbl>
       <w:tblPr>
-        <w:tblStyle w:val="TableGrid"/>
+        <w:tblStyle w:val="PlainTable5"/>
         <w:tblW w:w="0" w:type="auto"/>
         <w:tblLook w:val="04A0" w:firstRow="1" w:lastRow="0" w:firstColumn="1" w:lastColumn="0" w:noHBand="0" w:noVBand="1"/>
       </w:tblPr>
       <w:tblGrid>
-        <w:gridCol w:w="2860"/>
-        <w:gridCol w:w="843"/>
-        <w:gridCol w:w="2604"/>
-        <w:gridCol w:w="1509"/>
-        <w:gridCol w:w="1043"/>
+        <w:gridCol w:w="2955"/>
+        <w:gridCol w:w="870"/>
+        <w:gridCol w:w="2691"/>
+        <w:gridCol w:w="1558"/>
+        <w:gridCol w:w="1078"/>
       </w:tblGrid>
       <w:tr>
         <w:trPr>
-          <w:trHeight w:val="439"/>
+          <w:cnfStyle w:val="100000000000" w:firstRow="1" w:lastRow="0" w:firstColumn="0" w:lastColumn="0" w:oddVBand="0" w:evenVBand="0" w:oddHBand="0" w:evenHBand="0" w:firstRowFirstColumn="0" w:firstRowLastColumn="0" w:lastRowFirstColumn="0" w:lastRowLastColumn="0"/>
+          <w:trHeight w:val="218"/>
         </w:trPr>
         <w:tc>
           <w:tcPr>
-            <w:tcW w:w="2860" w:type="dxa"/>
+            <w:cnfStyle w:val="001000000100" w:firstRow="0" w:lastRow="0" w:firstColumn="1" w:lastColumn="0" w:oddVBand="0" w:evenVBand="0" w:oddHBand="0" w:evenHBand="0" w:firstRowFirstColumn="1" w:firstRowLastColumn="0" w:lastRowFirstColumn="0" w:lastRowLastColumn="0"/>
+            <w:tcW w:w="2955" w:type="dxa"/>
           </w:tcPr>
           <w:p>
             <w:r>
@@ -2127,9 +2337,12 @@
         </w:tc>
         <w:tc>
           <w:tcPr>
-            <w:tcW w:w="843" w:type="dxa"/>
-          </w:tcPr>
-          <w:p>
+            <w:tcW w:w="870" w:type="dxa"/>
+          </w:tcPr>
+          <w:p>
+            <w:pPr>
+              <w:cnfStyle w:val="100000000000" w:firstRow="1" w:lastRow="0" w:firstColumn="0" w:lastColumn="0" w:oddVBand="0" w:evenVBand="0" w:oddHBand="0" w:evenHBand="0" w:firstRowFirstColumn="0" w:firstRowLastColumn="0" w:lastRowFirstColumn="0" w:lastRowLastColumn="0"/>
+            </w:pPr>
             <w:r>
               <w:rPr>
                 <w:b/>
@@ -2141,9 +2354,12 @@
         </w:tc>
         <w:tc>
           <w:tcPr>
-            <w:tcW w:w="2604" w:type="dxa"/>
-          </w:tcPr>
-          <w:p>
+            <w:tcW w:w="2691" w:type="dxa"/>
+          </w:tcPr>
+          <w:p>
+            <w:pPr>
+              <w:cnfStyle w:val="100000000000" w:firstRow="1" w:lastRow="0" w:firstColumn="0" w:lastColumn="0" w:oddVBand="0" w:evenVBand="0" w:oddHBand="0" w:evenHBand="0" w:firstRowFirstColumn="0" w:firstRowLastColumn="0" w:lastRowFirstColumn="0" w:lastRowLastColumn="0"/>
+            </w:pPr>
             <w:r>
               <w:rPr>
                 <w:b/>
@@ -2155,9 +2371,12 @@
         </w:tc>
         <w:tc>
           <w:tcPr>
-            <w:tcW w:w="1509" w:type="dxa"/>
-          </w:tcPr>
-          <w:p>
+            <w:tcW w:w="1558" w:type="dxa"/>
+          </w:tcPr>
+          <w:p>
+            <w:pPr>
+              <w:cnfStyle w:val="100000000000" w:firstRow="1" w:lastRow="0" w:firstColumn="0" w:lastColumn="0" w:oddVBand="0" w:evenVBand="0" w:oddHBand="0" w:evenHBand="0" w:firstRowFirstColumn="0" w:firstRowLastColumn="0" w:lastRowFirstColumn="0" w:lastRowLastColumn="0"/>
+            </w:pPr>
             <w:r>
               <w:rPr>
                 <w:b/>
@@ -2169,9 +2388,12 @@
         </w:tc>
         <w:tc>
           <w:tcPr>
-            <w:tcW w:w="1043" w:type="dxa"/>
-          </w:tcPr>
-          <w:p>
+            <w:tcW w:w="1078" w:type="dxa"/>
+          </w:tcPr>
+          <w:p>
+            <w:pPr>
+              <w:cnfStyle w:val="100000000000" w:firstRow="1" w:lastRow="0" w:firstColumn="0" w:lastColumn="0" w:oddVBand="0" w:evenVBand="0" w:oddHBand="0" w:evenHBand="0" w:firstRowFirstColumn="0" w:firstRowLastColumn="0" w:lastRowFirstColumn="0" w:lastRowLastColumn="0"/>
+            </w:pPr>
             <w:r>
               <w:rPr>
                 <w:b/>
@@ -2184,11 +2406,13 @@
       </w:tr>
       <w:tr>
         <w:trPr>
-          <w:trHeight w:val="439"/>
+          <w:cnfStyle w:val="000000100000" w:firstRow="0" w:lastRow="0" w:firstColumn="0" w:lastColumn="0" w:oddVBand="0" w:evenVBand="0" w:oddHBand="1" w:evenHBand="0" w:firstRowFirstColumn="0" w:firstRowLastColumn="0" w:lastRowFirstColumn="0" w:lastRowLastColumn="0"/>
+          <w:trHeight w:val="218"/>
         </w:trPr>
         <w:tc>
           <w:tcPr>
-            <w:tcW w:w="2860" w:type="dxa"/>
+            <w:cnfStyle w:val="001000000000" w:firstRow="0" w:lastRow="0" w:firstColumn="1" w:lastColumn="0" w:oddVBand="0" w:evenVBand="0" w:oddHBand="0" w:evenHBand="0" w:firstRowFirstColumn="0" w:firstRowLastColumn="0" w:lastRowFirstColumn="0" w:lastRowLastColumn="0"/>
+            <w:tcW w:w="2955" w:type="dxa"/>
           </w:tcPr>
           <w:p>
             <w:r>
@@ -2201,11 +2425,12 @@
         </w:tc>
         <w:tc>
           <w:tcPr>
-            <w:tcW w:w="843" w:type="dxa"/>
+            <w:tcW w:w="870" w:type="dxa"/>
           </w:tcPr>
           <w:p>
             <w:pPr>
               <w:jc w:val="right"/>
+              <w:cnfStyle w:val="000000100000" w:firstRow="0" w:lastRow="0" w:firstColumn="0" w:lastColumn="0" w:oddVBand="0" w:evenVBand="0" w:oddHBand="1" w:evenHBand="0" w:firstRowFirstColumn="0" w:firstRowLastColumn="0" w:lastRowFirstColumn="0" w:lastRowLastColumn="0"/>
             </w:pPr>
             <w:r>
               <w:rPr>
@@ -2217,11 +2442,12 @@
         </w:tc>
         <w:tc>
           <w:tcPr>
-            <w:tcW w:w="2604" w:type="dxa"/>
+            <w:tcW w:w="2691" w:type="dxa"/>
           </w:tcPr>
           <w:p>
             <w:pPr>
               <w:jc w:val="right"/>
+              <w:cnfStyle w:val="000000100000" w:firstRow="0" w:lastRow="0" w:firstColumn="0" w:lastColumn="0" w:oddVBand="0" w:evenVBand="0" w:oddHBand="1" w:evenHBand="0" w:firstRowFirstColumn="0" w:firstRowLastColumn="0" w:lastRowFirstColumn="0" w:lastRowLastColumn="0"/>
             </w:pPr>
             <w:r>
               <w:rPr>
@@ -2233,11 +2459,12 @@
         </w:tc>
         <w:tc>
           <w:tcPr>
-            <w:tcW w:w="1509" w:type="dxa"/>
+            <w:tcW w:w="1558" w:type="dxa"/>
           </w:tcPr>
           <w:p>
             <w:pPr>
               <w:jc w:val="right"/>
+              <w:cnfStyle w:val="000000100000" w:firstRow="0" w:lastRow="0" w:firstColumn="0" w:lastColumn="0" w:oddVBand="0" w:evenVBand="0" w:oddHBand="1" w:evenHBand="0" w:firstRowFirstColumn="0" w:firstRowLastColumn="0" w:lastRowFirstColumn="0" w:lastRowLastColumn="0"/>
             </w:pPr>
             <w:r>
               <w:rPr>
@@ -2249,11 +2476,12 @@
         </w:tc>
         <w:tc>
           <w:tcPr>
-            <w:tcW w:w="1043" w:type="dxa"/>
+            <w:tcW w:w="1078" w:type="dxa"/>
           </w:tcPr>
           <w:p>
             <w:pPr>
               <w:jc w:val="right"/>
+              <w:cnfStyle w:val="000000100000" w:firstRow="0" w:lastRow="0" w:firstColumn="0" w:lastColumn="0" w:oddVBand="0" w:evenVBand="0" w:oddHBand="1" w:evenHBand="0" w:firstRowFirstColumn="0" w:firstRowLastColumn="0" w:lastRowFirstColumn="0" w:lastRowLastColumn="0"/>
             </w:pPr>
             <w:r>
               <w:rPr>
@@ -2266,11 +2494,12 @@
       </w:tr>
       <w:tr>
         <w:trPr>
-          <w:trHeight w:val="439"/>
+          <w:trHeight w:val="218"/>
         </w:trPr>
         <w:tc>
           <w:tcPr>
-            <w:tcW w:w="2860" w:type="dxa"/>
+            <w:cnfStyle w:val="001000000000" w:firstRow="0" w:lastRow="0" w:firstColumn="1" w:lastColumn="0" w:oddVBand="0" w:evenVBand="0" w:oddHBand="0" w:evenHBand="0" w:firstRowFirstColumn="0" w:firstRowLastColumn="0" w:lastRowFirstColumn="0" w:lastRowLastColumn="0"/>
+            <w:tcW w:w="2955" w:type="dxa"/>
           </w:tcPr>
           <w:p>
             <w:r>
@@ -2283,11 +2512,12 @@
         </w:tc>
         <w:tc>
           <w:tcPr>
-            <w:tcW w:w="843" w:type="dxa"/>
+            <w:tcW w:w="870" w:type="dxa"/>
           </w:tcPr>
           <w:p>
             <w:pPr>
               <w:jc w:val="right"/>
+              <w:cnfStyle w:val="000000000000" w:firstRow="0" w:lastRow="0" w:firstColumn="0" w:lastColumn="0" w:oddVBand="0" w:evenVBand="0" w:oddHBand="0" w:evenHBand="0" w:firstRowFirstColumn="0" w:firstRowLastColumn="0" w:lastRowFirstColumn="0" w:lastRowLastColumn="0"/>
             </w:pPr>
             <w:r>
               <w:rPr>
@@ -2299,11 +2529,12 @@
         </w:tc>
         <w:tc>
           <w:tcPr>
-            <w:tcW w:w="2604" w:type="dxa"/>
+            <w:tcW w:w="2691" w:type="dxa"/>
           </w:tcPr>
           <w:p>
             <w:pPr>
               <w:jc w:val="right"/>
+              <w:cnfStyle w:val="000000000000" w:firstRow="0" w:lastRow="0" w:firstColumn="0" w:lastColumn="0" w:oddVBand="0" w:evenVBand="0" w:oddHBand="0" w:evenHBand="0" w:firstRowFirstColumn="0" w:firstRowLastColumn="0" w:lastRowFirstColumn="0" w:lastRowLastColumn="0"/>
             </w:pPr>
             <w:r>
               <w:rPr>
@@ -2315,11 +2546,12 @@
         </w:tc>
         <w:tc>
           <w:tcPr>
-            <w:tcW w:w="1509" w:type="dxa"/>
+            <w:tcW w:w="1558" w:type="dxa"/>
           </w:tcPr>
           <w:p>
             <w:pPr>
               <w:jc w:val="right"/>
+              <w:cnfStyle w:val="000000000000" w:firstRow="0" w:lastRow="0" w:firstColumn="0" w:lastColumn="0" w:oddVBand="0" w:evenVBand="0" w:oddHBand="0" w:evenHBand="0" w:firstRowFirstColumn="0" w:firstRowLastColumn="0" w:lastRowFirstColumn="0" w:lastRowLastColumn="0"/>
             </w:pPr>
             <w:r>
               <w:rPr>
@@ -2331,11 +2563,12 @@
         </w:tc>
         <w:tc>
           <w:tcPr>
-            <w:tcW w:w="1043" w:type="dxa"/>
+            <w:tcW w:w="1078" w:type="dxa"/>
           </w:tcPr>
           <w:p>
             <w:pPr>
               <w:jc w:val="right"/>
+              <w:cnfStyle w:val="000000000000" w:firstRow="0" w:lastRow="0" w:firstColumn="0" w:lastColumn="0" w:oddVBand="0" w:evenVBand="0" w:oddHBand="0" w:evenHBand="0" w:firstRowFirstColumn="0" w:firstRowLastColumn="0" w:lastRowFirstColumn="0" w:lastRowLastColumn="0"/>
             </w:pPr>
             <w:r>
               <w:rPr>
@@ -2348,11 +2581,13 @@
       </w:tr>
       <w:tr>
         <w:trPr>
-          <w:trHeight w:val="439"/>
+          <w:cnfStyle w:val="000000100000" w:firstRow="0" w:lastRow="0" w:firstColumn="0" w:lastColumn="0" w:oddVBand="0" w:evenVBand="0" w:oddHBand="1" w:evenHBand="0" w:firstRowFirstColumn="0" w:firstRowLastColumn="0" w:lastRowFirstColumn="0" w:lastRowLastColumn="0"/>
+          <w:trHeight w:val="218"/>
         </w:trPr>
         <w:tc>
           <w:tcPr>
-            <w:tcW w:w="2860" w:type="dxa"/>
+            <w:cnfStyle w:val="001000000000" w:firstRow="0" w:lastRow="0" w:firstColumn="1" w:lastColumn="0" w:oddVBand="0" w:evenVBand="0" w:oddHBand="0" w:evenHBand="0" w:firstRowFirstColumn="0" w:firstRowLastColumn="0" w:lastRowFirstColumn="0" w:lastRowLastColumn="0"/>
+            <w:tcW w:w="2955" w:type="dxa"/>
           </w:tcPr>
           <w:p>
             <w:r>
@@ -2365,11 +2600,12 @@
         </w:tc>
         <w:tc>
           <w:tcPr>
-            <w:tcW w:w="843" w:type="dxa"/>
+            <w:tcW w:w="870" w:type="dxa"/>
           </w:tcPr>
           <w:p>
             <w:pPr>
               <w:jc w:val="right"/>
+              <w:cnfStyle w:val="000000100000" w:firstRow="0" w:lastRow="0" w:firstColumn="0" w:lastColumn="0" w:oddVBand="0" w:evenVBand="0" w:oddHBand="1" w:evenHBand="0" w:firstRowFirstColumn="0" w:firstRowLastColumn="0" w:lastRowFirstColumn="0" w:lastRowLastColumn="0"/>
             </w:pPr>
             <w:r>
               <w:rPr>
@@ -2381,11 +2617,12 @@
         </w:tc>
         <w:tc>
           <w:tcPr>
-            <w:tcW w:w="2604" w:type="dxa"/>
+            <w:tcW w:w="2691" w:type="dxa"/>
           </w:tcPr>
           <w:p>
             <w:pPr>
               <w:jc w:val="right"/>
+              <w:cnfStyle w:val="000000100000" w:firstRow="0" w:lastRow="0" w:firstColumn="0" w:lastColumn="0" w:oddVBand="0" w:evenVBand="0" w:oddHBand="1" w:evenHBand="0" w:firstRowFirstColumn="0" w:firstRowLastColumn="0" w:lastRowFirstColumn="0" w:lastRowLastColumn="0"/>
             </w:pPr>
             <w:r>
               <w:rPr>
@@ -2397,11 +2634,12 @@
         </w:tc>
         <w:tc>
           <w:tcPr>
-            <w:tcW w:w="1509" w:type="dxa"/>
+            <w:tcW w:w="1558" w:type="dxa"/>
           </w:tcPr>
           <w:p>
             <w:pPr>
               <w:jc w:val="right"/>
+              <w:cnfStyle w:val="000000100000" w:firstRow="0" w:lastRow="0" w:firstColumn="0" w:lastColumn="0" w:oddVBand="0" w:evenVBand="0" w:oddHBand="1" w:evenHBand="0" w:firstRowFirstColumn="0" w:firstRowLastColumn="0" w:lastRowFirstColumn="0" w:lastRowLastColumn="0"/>
             </w:pPr>
             <w:r>
               <w:rPr>
@@ -2413,11 +2651,12 @@
         </w:tc>
         <w:tc>
           <w:tcPr>
-            <w:tcW w:w="1043" w:type="dxa"/>
+            <w:tcW w:w="1078" w:type="dxa"/>
           </w:tcPr>
           <w:p>
             <w:pPr>
               <w:jc w:val="right"/>
+              <w:cnfStyle w:val="000000100000" w:firstRow="0" w:lastRow="0" w:firstColumn="0" w:lastColumn="0" w:oddVBand="0" w:evenVBand="0" w:oddHBand="1" w:evenHBand="0" w:firstRowFirstColumn="0" w:firstRowLastColumn="0" w:lastRowFirstColumn="0" w:lastRowLastColumn="0"/>
             </w:pPr>
             <w:r>
               <w:rPr>
@@ -2430,11 +2669,12 @@
       </w:tr>
       <w:tr>
         <w:trPr>
-          <w:trHeight w:val="439"/>
+          <w:trHeight w:val="218"/>
         </w:trPr>
         <w:tc>
           <w:tcPr>
-            <w:tcW w:w="2860" w:type="dxa"/>
+            <w:cnfStyle w:val="001000000000" w:firstRow="0" w:lastRow="0" w:firstColumn="1" w:lastColumn="0" w:oddVBand="0" w:evenVBand="0" w:oddHBand="0" w:evenHBand="0" w:firstRowFirstColumn="0" w:firstRowLastColumn="0" w:lastRowFirstColumn="0" w:lastRowLastColumn="0"/>
+            <w:tcW w:w="2955" w:type="dxa"/>
           </w:tcPr>
           <w:p>
             <w:r>
@@ -2447,11 +2687,12 @@
         </w:tc>
         <w:tc>
           <w:tcPr>
-            <w:tcW w:w="843" w:type="dxa"/>
+            <w:tcW w:w="870" w:type="dxa"/>
           </w:tcPr>
           <w:p>
             <w:pPr>
               <w:jc w:val="right"/>
+              <w:cnfStyle w:val="000000000000" w:firstRow="0" w:lastRow="0" w:firstColumn="0" w:lastColumn="0" w:oddVBand="0" w:evenVBand="0" w:oddHBand="0" w:evenHBand="0" w:firstRowFirstColumn="0" w:firstRowLastColumn="0" w:lastRowFirstColumn="0" w:lastRowLastColumn="0"/>
             </w:pPr>
             <w:r>
               <w:rPr>
@@ -2463,11 +2704,12 @@
         </w:tc>
         <w:tc>
           <w:tcPr>
-            <w:tcW w:w="2604" w:type="dxa"/>
+            <w:tcW w:w="2691" w:type="dxa"/>
           </w:tcPr>
           <w:p>
             <w:pPr>
               <w:jc w:val="right"/>
+              <w:cnfStyle w:val="000000000000" w:firstRow="0" w:lastRow="0" w:firstColumn="0" w:lastColumn="0" w:oddVBand="0" w:evenVBand="0" w:oddHBand="0" w:evenHBand="0" w:firstRowFirstColumn="0" w:firstRowLastColumn="0" w:lastRowFirstColumn="0" w:lastRowLastColumn="0"/>
             </w:pPr>
             <w:r>
               <w:rPr>
@@ -2479,11 +2721,12 @@
         </w:tc>
         <w:tc>
           <w:tcPr>
-            <w:tcW w:w="1509" w:type="dxa"/>
+            <w:tcW w:w="1558" w:type="dxa"/>
           </w:tcPr>
           <w:p>
             <w:pPr>
               <w:jc w:val="right"/>
+              <w:cnfStyle w:val="000000000000" w:firstRow="0" w:lastRow="0" w:firstColumn="0" w:lastColumn="0" w:oddVBand="0" w:evenVBand="0" w:oddHBand="0" w:evenHBand="0" w:firstRowFirstColumn="0" w:firstRowLastColumn="0" w:lastRowFirstColumn="0" w:lastRowLastColumn="0"/>
             </w:pPr>
             <w:r>
               <w:rPr>
@@ -2495,11 +2738,12 @@
         </w:tc>
         <w:tc>
           <w:tcPr>
-            <w:tcW w:w="1043" w:type="dxa"/>
+            <w:tcW w:w="1078" w:type="dxa"/>
           </w:tcPr>
           <w:p>
             <w:pPr>
               <w:jc w:val="right"/>
+              <w:cnfStyle w:val="000000000000" w:firstRow="0" w:lastRow="0" w:firstColumn="0" w:lastColumn="0" w:oddVBand="0" w:evenVBand="0" w:oddHBand="0" w:evenHBand="0" w:firstRowFirstColumn="0" w:firstRowLastColumn="0" w:lastRowFirstColumn="0" w:lastRowLastColumn="0"/>
             </w:pPr>
             <w:r>
               <w:rPr>
@@ -2527,6 +2771,7 @@
         <w:pStyle w:val="Heading2"/>
       </w:pPr>
       <w:r>
+        <w:lastRenderedPageBreak/>
         <w:t>Stage 3: Hierarchical error analysis</w:t>
       </w:r>
     </w:p>
@@ -2550,7 +2795,7 @@
     </w:p>
     <w:tbl>
       <w:tblPr>
-        <w:tblStyle w:val="TableGrid"/>
+        <w:tblStyle w:val="PlainTable5"/>
         <w:tblW w:w="9107" w:type="dxa"/>
         <w:tblLook w:val="04A0" w:firstRow="1" w:lastRow="0" w:firstColumn="1" w:lastColumn="0" w:noHBand="0" w:noVBand="1"/>
       </w:tblPr>
@@ -2562,8 +2807,12 @@
         <w:gridCol w:w="3341"/>
       </w:tblGrid>
       <w:tr>
-        <w:tc>
-          <w:tcPr>
+        <w:trPr>
+          <w:cnfStyle w:val="100000000000" w:firstRow="1" w:lastRow="0" w:firstColumn="0" w:lastColumn="0" w:oddVBand="0" w:evenVBand="0" w:oddHBand="0" w:evenHBand="0" w:firstRowFirstColumn="0" w:firstRowLastColumn="0" w:lastRowFirstColumn="0" w:lastRowLastColumn="0"/>
+        </w:trPr>
+        <w:tc>
+          <w:tcPr>
+            <w:cnfStyle w:val="001000000100" w:firstRow="0" w:lastRow="0" w:firstColumn="1" w:lastColumn="0" w:oddVBand="0" w:evenVBand="0" w:oddHBand="0" w:evenHBand="0" w:firstRowFirstColumn="1" w:firstRowLastColumn="0" w:lastRowFirstColumn="0" w:lastRowLastColumn="0"/>
             <w:tcW w:w="2203" w:type="dxa"/>
           </w:tcPr>
           <w:p>
@@ -2581,6 +2830,9 @@
             <w:tcW w:w="2255" w:type="dxa"/>
           </w:tcPr>
           <w:p>
+            <w:pPr>
+              <w:cnfStyle w:val="100000000000" w:firstRow="1" w:lastRow="0" w:firstColumn="0" w:lastColumn="0" w:oddVBand="0" w:evenVBand="0" w:oddHBand="0" w:evenHBand="0" w:firstRowFirstColumn="0" w:firstRowLastColumn="0" w:lastRowFirstColumn="0" w:lastRowLastColumn="0"/>
+            </w:pPr>
             <w:r>
               <w:rPr>
                 <w:b/>
@@ -2595,6 +2847,9 @@
             <w:tcW w:w="514" w:type="dxa"/>
           </w:tcPr>
           <w:p>
+            <w:pPr>
+              <w:cnfStyle w:val="100000000000" w:firstRow="1" w:lastRow="0" w:firstColumn="0" w:lastColumn="0" w:oddVBand="0" w:evenVBand="0" w:oddHBand="0" w:evenHBand="0" w:firstRowFirstColumn="0" w:firstRowLastColumn="0" w:lastRowFirstColumn="0" w:lastRowLastColumn="0"/>
+            </w:pPr>
             <w:r>
               <w:rPr>
                 <w:b/>
@@ -2609,6 +2864,9 @@
             <w:tcW w:w="794" w:type="dxa"/>
           </w:tcPr>
           <w:p>
+            <w:pPr>
+              <w:cnfStyle w:val="100000000000" w:firstRow="1" w:lastRow="0" w:firstColumn="0" w:lastColumn="0" w:oddVBand="0" w:evenVBand="0" w:oddHBand="0" w:evenHBand="0" w:firstRowFirstColumn="0" w:firstRowLastColumn="0" w:lastRowFirstColumn="0" w:lastRowLastColumn="0"/>
+            </w:pPr>
             <w:r>
               <w:rPr>
                 <w:b/>
@@ -2623,6 +2881,9 @@
             <w:tcW w:w="3341" w:type="dxa"/>
           </w:tcPr>
           <w:p>
+            <w:pPr>
+              <w:cnfStyle w:val="100000000000" w:firstRow="1" w:lastRow="0" w:firstColumn="0" w:lastColumn="0" w:oddVBand="0" w:evenVBand="0" w:oddHBand="0" w:evenHBand="0" w:firstRowFirstColumn="0" w:firstRowLastColumn="0" w:lastRowFirstColumn="0" w:lastRowLastColumn="0"/>
+            </w:pPr>
             <w:r>
               <w:rPr>
                 <w:b/>
@@ -2634,8 +2895,12 @@
         </w:tc>
       </w:tr>
       <w:tr>
-        <w:tc>
-          <w:tcPr>
+        <w:trPr>
+          <w:cnfStyle w:val="000000100000" w:firstRow="0" w:lastRow="0" w:firstColumn="0" w:lastColumn="0" w:oddVBand="0" w:evenVBand="0" w:oddHBand="1" w:evenHBand="0" w:firstRowFirstColumn="0" w:firstRowLastColumn="0" w:lastRowFirstColumn="0" w:lastRowLastColumn="0"/>
+        </w:trPr>
+        <w:tc>
+          <w:tcPr>
+            <w:cnfStyle w:val="001000000000" w:firstRow="0" w:lastRow="0" w:firstColumn="1" w:lastColumn="0" w:oddVBand="0" w:evenVBand="0" w:oddHBand="0" w:evenHBand="0" w:firstRowFirstColumn="0" w:firstRowLastColumn="0" w:lastRowFirstColumn="0" w:lastRowLastColumn="0"/>
             <w:tcW w:w="2203" w:type="dxa"/>
           </w:tcPr>
           <w:p>
@@ -2652,6 +2917,9 @@
             <w:tcW w:w="2255" w:type="dxa"/>
           </w:tcPr>
           <w:p>
+            <w:pPr>
+              <w:cnfStyle w:val="000000100000" w:firstRow="0" w:lastRow="0" w:firstColumn="0" w:lastColumn="0" w:oddVBand="0" w:evenVBand="0" w:oddHBand="1" w:evenHBand="0" w:firstRowFirstColumn="0" w:firstRowLastColumn="0" w:lastRowFirstColumn="0" w:lastRowLastColumn="0"/>
+            </w:pPr>
             <w:r>
               <w:rPr>
                 <w:sz w:val="19"/>
@@ -2667,6 +2935,7 @@
           <w:p>
             <w:pPr>
               <w:jc w:val="right"/>
+              <w:cnfStyle w:val="000000100000" w:firstRow="0" w:lastRow="0" w:firstColumn="0" w:lastColumn="0" w:oddVBand="0" w:evenVBand="0" w:oddHBand="1" w:evenHBand="0" w:firstRowFirstColumn="0" w:firstRowLastColumn="0" w:lastRowFirstColumn="0" w:lastRowLastColumn="0"/>
             </w:pPr>
             <w:r>
               <w:rPr>
@@ -2683,6 +2952,7 @@
           <w:p>
             <w:pPr>
               <w:jc w:val="right"/>
+              <w:cnfStyle w:val="000000100000" w:firstRow="0" w:lastRow="0" w:firstColumn="0" w:lastColumn="0" w:oddVBand="0" w:evenVBand="0" w:oddHBand="1" w:evenHBand="0" w:firstRowFirstColumn="0" w:firstRowLastColumn="0" w:lastRowFirstColumn="0" w:lastRowLastColumn="0"/>
             </w:pPr>
             <w:r>
               <w:rPr>
@@ -2697,6 +2967,9 @@
             <w:tcW w:w="3341" w:type="dxa"/>
           </w:tcPr>
           <w:p>
+            <w:pPr>
+              <w:cnfStyle w:val="000000100000" w:firstRow="0" w:lastRow="0" w:firstColumn="0" w:lastColumn="0" w:oddVBand="0" w:evenVBand="0" w:oddHBand="1" w:evenHBand="0" w:firstRowFirstColumn="0" w:firstRowLastColumn="0" w:lastRowFirstColumn="0" w:lastRowLastColumn="0"/>
+            </w:pPr>
             <w:r>
               <w:rPr>
                 <w:sz w:val="19"/>
@@ -2709,6 +2982,7 @@
       <w:tr>
         <w:tc>
           <w:tcPr>
+            <w:cnfStyle w:val="001000000000" w:firstRow="0" w:lastRow="0" w:firstColumn="1" w:lastColumn="0" w:oddVBand="0" w:evenVBand="0" w:oddHBand="0" w:evenHBand="0" w:firstRowFirstColumn="0" w:firstRowLastColumn="0" w:lastRowFirstColumn="0" w:lastRowLastColumn="0"/>
             <w:tcW w:w="2203" w:type="dxa"/>
           </w:tcPr>
           <w:p>
@@ -2725,6 +2999,9 @@
             <w:tcW w:w="2255" w:type="dxa"/>
           </w:tcPr>
           <w:p>
+            <w:pPr>
+              <w:cnfStyle w:val="000000000000" w:firstRow="0" w:lastRow="0" w:firstColumn="0" w:lastColumn="0" w:oddVBand="0" w:evenVBand="0" w:oddHBand="0" w:evenHBand="0" w:firstRowFirstColumn="0" w:firstRowLastColumn="0" w:lastRowFirstColumn="0" w:lastRowLastColumn="0"/>
+            </w:pPr>
             <w:r>
               <w:rPr>
                 <w:sz w:val="19"/>
@@ -2740,6 +3017,7 @@
           <w:p>
             <w:pPr>
               <w:jc w:val="right"/>
+              <w:cnfStyle w:val="000000000000" w:firstRow="0" w:lastRow="0" w:firstColumn="0" w:lastColumn="0" w:oddVBand="0" w:evenVBand="0" w:oddHBand="0" w:evenHBand="0" w:firstRowFirstColumn="0" w:firstRowLastColumn="0" w:lastRowFirstColumn="0" w:lastRowLastColumn="0"/>
             </w:pPr>
             <w:r>
               <w:rPr>
@@ -2756,6 +3034,7 @@
           <w:p>
             <w:pPr>
               <w:jc w:val="right"/>
+              <w:cnfStyle w:val="000000000000" w:firstRow="0" w:lastRow="0" w:firstColumn="0" w:lastColumn="0" w:oddVBand="0" w:evenVBand="0" w:oddHBand="0" w:evenHBand="0" w:firstRowFirstColumn="0" w:firstRowLastColumn="0" w:lastRowFirstColumn="0" w:lastRowLastColumn="0"/>
             </w:pPr>
             <w:r>
               <w:rPr>
@@ -2770,6 +3049,9 @@
             <w:tcW w:w="3341" w:type="dxa"/>
           </w:tcPr>
           <w:p>
+            <w:pPr>
+              <w:cnfStyle w:val="000000000000" w:firstRow="0" w:lastRow="0" w:firstColumn="0" w:lastColumn="0" w:oddVBand="0" w:evenVBand="0" w:oddHBand="0" w:evenHBand="0" w:firstRowFirstColumn="0" w:firstRowLastColumn="0" w:lastRowFirstColumn="0" w:lastRowLastColumn="0"/>
+            </w:pPr>
             <w:r>
               <w:rPr>
                 <w:sz w:val="19"/>
@@ -2780,8 +3062,12 @@
         </w:tc>
       </w:tr>
       <w:tr>
-        <w:tc>
-          <w:tcPr>
+        <w:trPr>
+          <w:cnfStyle w:val="000000100000" w:firstRow="0" w:lastRow="0" w:firstColumn="0" w:lastColumn="0" w:oddVBand="0" w:evenVBand="0" w:oddHBand="1" w:evenHBand="0" w:firstRowFirstColumn="0" w:firstRowLastColumn="0" w:lastRowFirstColumn="0" w:lastRowLastColumn="0"/>
+        </w:trPr>
+        <w:tc>
+          <w:tcPr>
+            <w:cnfStyle w:val="001000000000" w:firstRow="0" w:lastRow="0" w:firstColumn="1" w:lastColumn="0" w:oddVBand="0" w:evenVBand="0" w:oddHBand="0" w:evenHBand="0" w:firstRowFirstColumn="0" w:firstRowLastColumn="0" w:lastRowFirstColumn="0" w:lastRowLastColumn="0"/>
             <w:tcW w:w="2203" w:type="dxa"/>
           </w:tcPr>
           <w:p>
@@ -2789,7 +3075,6 @@
               <w:rPr>
                 <w:sz w:val="19"/>
               </w:rPr>
-              <w:lastRenderedPageBreak/>
               <w:t>Out of vocabulary</w:t>
             </w:r>
           </w:p>
@@ -2799,6 +3084,9 @@
             <w:tcW w:w="2255" w:type="dxa"/>
           </w:tcPr>
           <w:p>
+            <w:pPr>
+              <w:cnfStyle w:val="000000100000" w:firstRow="0" w:lastRow="0" w:firstColumn="0" w:lastColumn="0" w:oddVBand="0" w:evenVBand="0" w:oddHBand="1" w:evenHBand="0" w:firstRowFirstColumn="0" w:firstRowLastColumn="0" w:lastRowFirstColumn="0" w:lastRowLastColumn="0"/>
+            </w:pPr>
             <w:r>
               <w:rPr>
                 <w:sz w:val="19"/>
@@ -2814,6 +3102,7 @@
           <w:p>
             <w:pPr>
               <w:jc w:val="right"/>
+              <w:cnfStyle w:val="000000100000" w:firstRow="0" w:lastRow="0" w:firstColumn="0" w:lastColumn="0" w:oddVBand="0" w:evenVBand="0" w:oddHBand="1" w:evenHBand="0" w:firstRowFirstColumn="0" w:firstRowLastColumn="0" w:lastRowFirstColumn="0" w:lastRowLastColumn="0"/>
             </w:pPr>
             <w:r>
               <w:rPr>
@@ -2830,6 +3119,7 @@
           <w:p>
             <w:pPr>
               <w:jc w:val="right"/>
+              <w:cnfStyle w:val="000000100000" w:firstRow="0" w:lastRow="0" w:firstColumn="0" w:lastColumn="0" w:oddVBand="0" w:evenVBand="0" w:oddHBand="1" w:evenHBand="0" w:firstRowFirstColumn="0" w:firstRowLastColumn="0" w:lastRowFirstColumn="0" w:lastRowLastColumn="0"/>
             </w:pPr>
             <w:r>
               <w:rPr>
@@ -2844,6 +3134,9 @@
             <w:tcW w:w="3341" w:type="dxa"/>
           </w:tcPr>
           <w:p>
+            <w:pPr>
+              <w:cnfStyle w:val="000000100000" w:firstRow="0" w:lastRow="0" w:firstColumn="0" w:lastColumn="0" w:oddVBand="0" w:evenVBand="0" w:oddHBand="1" w:evenHBand="0" w:firstRowFirstColumn="0" w:firstRowLastColumn="0" w:lastRowFirstColumn="0" w:lastRowLastColumn="0"/>
+            </w:pPr>
             <w:r>
               <w:rPr>
                 <w:sz w:val="19"/>
@@ -2856,6 +3149,7 @@
       <w:tr>
         <w:tc>
           <w:tcPr>
+            <w:cnfStyle w:val="001000000000" w:firstRow="0" w:lastRow="0" w:firstColumn="1" w:lastColumn="0" w:oddVBand="0" w:evenVBand="0" w:oddHBand="0" w:evenHBand="0" w:firstRowFirstColumn="0" w:firstRowLastColumn="0" w:lastRowFirstColumn="0" w:lastRowLastColumn="0"/>
             <w:tcW w:w="2203" w:type="dxa"/>
           </w:tcPr>
           <w:p>
@@ -2872,6 +3166,9 @@
             <w:tcW w:w="2255" w:type="dxa"/>
           </w:tcPr>
           <w:p>
+            <w:pPr>
+              <w:cnfStyle w:val="000000000000" w:firstRow="0" w:lastRow="0" w:firstColumn="0" w:lastColumn="0" w:oddVBand="0" w:evenVBand="0" w:oddHBand="0" w:evenHBand="0" w:firstRowFirstColumn="0" w:firstRowLastColumn="0" w:lastRowFirstColumn="0" w:lastRowLastColumn="0"/>
+            </w:pPr>
             <w:r>
               <w:rPr>
                 <w:sz w:val="19"/>
@@ -2887,6 +3184,7 @@
           <w:p>
             <w:pPr>
               <w:jc w:val="right"/>
+              <w:cnfStyle w:val="000000000000" w:firstRow="0" w:lastRow="0" w:firstColumn="0" w:lastColumn="0" w:oddVBand="0" w:evenVBand="0" w:oddHBand="0" w:evenHBand="0" w:firstRowFirstColumn="0" w:firstRowLastColumn="0" w:lastRowFirstColumn="0" w:lastRowLastColumn="0"/>
             </w:pPr>
             <w:r>
               <w:rPr>
@@ -2903,6 +3201,7 @@
           <w:p>
             <w:pPr>
               <w:jc w:val="right"/>
+              <w:cnfStyle w:val="000000000000" w:firstRow="0" w:lastRow="0" w:firstColumn="0" w:lastColumn="0" w:oddVBand="0" w:evenVBand="0" w:oddHBand="0" w:evenHBand="0" w:firstRowFirstColumn="0" w:firstRowLastColumn="0" w:lastRowFirstColumn="0" w:lastRowLastColumn="0"/>
             </w:pPr>
             <w:r>
               <w:rPr>
@@ -2917,6 +3216,9 @@
             <w:tcW w:w="3341" w:type="dxa"/>
           </w:tcPr>
           <w:p>
+            <w:pPr>
+              <w:cnfStyle w:val="000000000000" w:firstRow="0" w:lastRow="0" w:firstColumn="0" w:lastColumn="0" w:oddVBand="0" w:evenVBand="0" w:oddHBand="0" w:evenHBand="0" w:firstRowFirstColumn="0" w:firstRowLastColumn="0" w:lastRowFirstColumn="0" w:lastRowLastColumn="0"/>
+            </w:pPr>
             <w:r>
               <w:rPr>
                 <w:sz w:val="19"/>
@@ -2927,8 +3229,12 @@
         </w:tc>
       </w:tr>
       <w:tr>
-        <w:tc>
-          <w:tcPr>
+        <w:trPr>
+          <w:cnfStyle w:val="000000100000" w:firstRow="0" w:lastRow="0" w:firstColumn="0" w:lastColumn="0" w:oddVBand="0" w:evenVBand="0" w:oddHBand="1" w:evenHBand="0" w:firstRowFirstColumn="0" w:firstRowLastColumn="0" w:lastRowFirstColumn="0" w:lastRowLastColumn="0"/>
+        </w:trPr>
+        <w:tc>
+          <w:tcPr>
+            <w:cnfStyle w:val="001000000000" w:firstRow="0" w:lastRow="0" w:firstColumn="1" w:lastColumn="0" w:oddVBand="0" w:evenVBand="0" w:oddHBand="0" w:evenHBand="0" w:firstRowFirstColumn="0" w:firstRowLastColumn="0" w:lastRowFirstColumn="0" w:lastRowLastColumn="0"/>
             <w:tcW w:w="2203" w:type="dxa"/>
           </w:tcPr>
           <w:p>
@@ -2945,6 +3251,9 @@
             <w:tcW w:w="2255" w:type="dxa"/>
           </w:tcPr>
           <w:p>
+            <w:pPr>
+              <w:cnfStyle w:val="000000100000" w:firstRow="0" w:lastRow="0" w:firstColumn="0" w:lastColumn="0" w:oddVBand="0" w:evenVBand="0" w:oddHBand="1" w:evenHBand="0" w:firstRowFirstColumn="0" w:firstRowLastColumn="0" w:lastRowFirstColumn="0" w:lastRowLastColumn="0"/>
+            </w:pPr>
             <w:r>
               <w:rPr>
                 <w:sz w:val="19"/>
@@ -2960,6 +3269,7 @@
           <w:p>
             <w:pPr>
               <w:jc w:val="right"/>
+              <w:cnfStyle w:val="000000100000" w:firstRow="0" w:lastRow="0" w:firstColumn="0" w:lastColumn="0" w:oddVBand="0" w:evenVBand="0" w:oddHBand="1" w:evenHBand="0" w:firstRowFirstColumn="0" w:firstRowLastColumn="0" w:lastRowFirstColumn="0" w:lastRowLastColumn="0"/>
             </w:pPr>
             <w:r>
               <w:rPr>
@@ -2976,6 +3286,7 @@
           <w:p>
             <w:pPr>
               <w:jc w:val="right"/>
+              <w:cnfStyle w:val="000000100000" w:firstRow="0" w:lastRow="0" w:firstColumn="0" w:lastColumn="0" w:oddVBand="0" w:evenVBand="0" w:oddHBand="1" w:evenHBand="0" w:firstRowFirstColumn="0" w:firstRowLastColumn="0" w:lastRowFirstColumn="0" w:lastRowLastColumn="0"/>
             </w:pPr>
             <w:r>
               <w:rPr>
@@ -2990,6 +3301,9 @@
             <w:tcW w:w="3341" w:type="dxa"/>
           </w:tcPr>
           <w:p>
+            <w:pPr>
+              <w:cnfStyle w:val="000000100000" w:firstRow="0" w:lastRow="0" w:firstColumn="0" w:lastColumn="0" w:oddVBand="0" w:evenVBand="0" w:oddHBand="1" w:evenHBand="0" w:firstRowFirstColumn="0" w:firstRowLastColumn="0" w:lastRowFirstColumn="0" w:lastRowLastColumn="0"/>
+            </w:pPr>
             <w:r>
               <w:rPr>
                 <w:sz w:val="19"/>
@@ -3002,6 +3316,7 @@
       <w:tr>
         <w:tc>
           <w:tcPr>
+            <w:cnfStyle w:val="001000000000" w:firstRow="0" w:lastRow="0" w:firstColumn="1" w:lastColumn="0" w:oddVBand="0" w:evenVBand="0" w:oddHBand="0" w:evenHBand="0" w:firstRowFirstColumn="0" w:firstRowLastColumn="0" w:lastRowFirstColumn="0" w:lastRowLastColumn="0"/>
             <w:tcW w:w="2203" w:type="dxa"/>
           </w:tcPr>
           <w:p>
@@ -3018,6 +3333,9 @@
             <w:tcW w:w="2255" w:type="dxa"/>
           </w:tcPr>
           <w:p>
+            <w:pPr>
+              <w:cnfStyle w:val="000000000000" w:firstRow="0" w:lastRow="0" w:firstColumn="0" w:lastColumn="0" w:oddVBand="0" w:evenVBand="0" w:oddHBand="0" w:evenHBand="0" w:firstRowFirstColumn="0" w:firstRowLastColumn="0" w:lastRowFirstColumn="0" w:lastRowLastColumn="0"/>
+            </w:pPr>
             <w:r>
               <w:rPr>
                 <w:sz w:val="19"/>
@@ -3033,6 +3351,7 @@
           <w:p>
             <w:pPr>
               <w:jc w:val="right"/>
+              <w:cnfStyle w:val="000000000000" w:firstRow="0" w:lastRow="0" w:firstColumn="0" w:lastColumn="0" w:oddVBand="0" w:evenVBand="0" w:oddHBand="0" w:evenHBand="0" w:firstRowFirstColumn="0" w:firstRowLastColumn="0" w:lastRowFirstColumn="0" w:lastRowLastColumn="0"/>
             </w:pPr>
             <w:r>
               <w:rPr>
@@ -3049,6 +3368,7 @@
           <w:p>
             <w:pPr>
               <w:jc w:val="right"/>
+              <w:cnfStyle w:val="000000000000" w:firstRow="0" w:lastRow="0" w:firstColumn="0" w:lastColumn="0" w:oddVBand="0" w:evenVBand="0" w:oddHBand="0" w:evenHBand="0" w:firstRowFirstColumn="0" w:firstRowLastColumn="0" w:lastRowFirstColumn="0" w:lastRowLastColumn="0"/>
             </w:pPr>
             <w:r>
               <w:rPr>
@@ -3063,6 +3383,9 @@
             <w:tcW w:w="3341" w:type="dxa"/>
           </w:tcPr>
           <w:p>
+            <w:pPr>
+              <w:cnfStyle w:val="000000000000" w:firstRow="0" w:lastRow="0" w:firstColumn="0" w:lastColumn="0" w:oddVBand="0" w:evenVBand="0" w:oddHBand="0" w:evenHBand="0" w:firstRowFirstColumn="0" w:firstRowLastColumn="0" w:lastRowFirstColumn="0" w:lastRowLastColumn="0"/>
+            </w:pPr>
             <w:r>
               <w:rPr>
                 <w:sz w:val="19"/>
@@ -3073,8 +3396,12 @@
         </w:tc>
       </w:tr>
       <w:tr>
-        <w:tc>
-          <w:tcPr>
+        <w:trPr>
+          <w:cnfStyle w:val="000000100000" w:firstRow="0" w:lastRow="0" w:firstColumn="0" w:lastColumn="0" w:oddVBand="0" w:evenVBand="0" w:oddHBand="1" w:evenHBand="0" w:firstRowFirstColumn="0" w:firstRowLastColumn="0" w:lastRowFirstColumn="0" w:lastRowLastColumn="0"/>
+        </w:trPr>
+        <w:tc>
+          <w:tcPr>
+            <w:cnfStyle w:val="001000000000" w:firstRow="0" w:lastRow="0" w:firstColumn="1" w:lastColumn="0" w:oddVBand="0" w:evenVBand="0" w:oddHBand="0" w:evenHBand="0" w:firstRowFirstColumn="0" w:firstRowLastColumn="0" w:lastRowFirstColumn="0" w:lastRowLastColumn="0"/>
             <w:tcW w:w="2203" w:type="dxa"/>
           </w:tcPr>
           <w:p>
@@ -3091,6 +3418,9 @@
             <w:tcW w:w="2255" w:type="dxa"/>
           </w:tcPr>
           <w:p>
+            <w:pPr>
+              <w:cnfStyle w:val="000000100000" w:firstRow="0" w:lastRow="0" w:firstColumn="0" w:lastColumn="0" w:oddVBand="0" w:evenVBand="0" w:oddHBand="1" w:evenHBand="0" w:firstRowFirstColumn="0" w:firstRowLastColumn="0" w:lastRowFirstColumn="0" w:lastRowLastColumn="0"/>
+            </w:pPr>
             <w:r>
               <w:rPr>
                 <w:sz w:val="19"/>
@@ -3106,6 +3436,7 @@
           <w:p>
             <w:pPr>
               <w:jc w:val="right"/>
+              <w:cnfStyle w:val="000000100000" w:firstRow="0" w:lastRow="0" w:firstColumn="0" w:lastColumn="0" w:oddVBand="0" w:evenVBand="0" w:oddHBand="1" w:evenHBand="0" w:firstRowFirstColumn="0" w:firstRowLastColumn="0" w:lastRowFirstColumn="0" w:lastRowLastColumn="0"/>
             </w:pPr>
             <w:r>
               <w:rPr>
@@ -3122,6 +3453,7 @@
           <w:p>
             <w:pPr>
               <w:jc w:val="right"/>
+              <w:cnfStyle w:val="000000100000" w:firstRow="0" w:lastRow="0" w:firstColumn="0" w:lastColumn="0" w:oddVBand="0" w:evenVBand="0" w:oddHBand="1" w:evenHBand="0" w:firstRowFirstColumn="0" w:firstRowLastColumn="0" w:lastRowFirstColumn="0" w:lastRowLastColumn="0"/>
             </w:pPr>
             <w:r>
               <w:rPr>
@@ -3136,6 +3468,9 @@
             <w:tcW w:w="3341" w:type="dxa"/>
           </w:tcPr>
           <w:p>
+            <w:pPr>
+              <w:cnfStyle w:val="000000100000" w:firstRow="0" w:lastRow="0" w:firstColumn="0" w:lastColumn="0" w:oddVBand="0" w:evenVBand="0" w:oddHBand="1" w:evenHBand="0" w:firstRowFirstColumn="0" w:firstRowLastColumn="0" w:lastRowFirstColumn="0" w:lastRowLastColumn="0"/>
+            </w:pPr>
             <w:r>
               <w:rPr>
                 <w:sz w:val="19"/>
@@ -3148,6 +3483,7 @@
       <w:tr>
         <w:tc>
           <w:tcPr>
+            <w:cnfStyle w:val="001000000000" w:firstRow="0" w:lastRow="0" w:firstColumn="1" w:lastColumn="0" w:oddVBand="0" w:evenVBand="0" w:oddHBand="0" w:evenHBand="0" w:firstRowFirstColumn="0" w:firstRowLastColumn="0" w:lastRowFirstColumn="0" w:lastRowLastColumn="0"/>
             <w:tcW w:w="2203" w:type="dxa"/>
           </w:tcPr>
           <w:p>
@@ -3164,6 +3500,9 @@
             <w:tcW w:w="2255" w:type="dxa"/>
           </w:tcPr>
           <w:p>
+            <w:pPr>
+              <w:cnfStyle w:val="000000000000" w:firstRow="0" w:lastRow="0" w:firstColumn="0" w:lastColumn="0" w:oddVBand="0" w:evenVBand="0" w:oddHBand="0" w:evenHBand="0" w:firstRowFirstColumn="0" w:firstRowLastColumn="0" w:lastRowFirstColumn="0" w:lastRowLastColumn="0"/>
+            </w:pPr>
             <w:r>
               <w:rPr>
                 <w:sz w:val="19"/>
@@ -3179,6 +3518,7 @@
           <w:p>
             <w:pPr>
               <w:jc w:val="right"/>
+              <w:cnfStyle w:val="000000000000" w:firstRow="0" w:lastRow="0" w:firstColumn="0" w:lastColumn="0" w:oddVBand="0" w:evenVBand="0" w:oddHBand="0" w:evenHBand="0" w:firstRowFirstColumn="0" w:firstRowLastColumn="0" w:lastRowFirstColumn="0" w:lastRowLastColumn="0"/>
             </w:pPr>
             <w:r>
               <w:rPr>
@@ -3195,6 +3535,7 @@
           <w:p>
             <w:pPr>
               <w:jc w:val="right"/>
+              <w:cnfStyle w:val="000000000000" w:firstRow="0" w:lastRow="0" w:firstColumn="0" w:lastColumn="0" w:oddVBand="0" w:evenVBand="0" w:oddHBand="0" w:evenHBand="0" w:firstRowFirstColumn="0" w:firstRowLastColumn="0" w:lastRowFirstColumn="0" w:lastRowLastColumn="0"/>
             </w:pPr>
             <w:r>
               <w:rPr>
@@ -3209,6 +3550,9 @@
             <w:tcW w:w="3341" w:type="dxa"/>
           </w:tcPr>
           <w:p>
+            <w:pPr>
+              <w:cnfStyle w:val="000000000000" w:firstRow="0" w:lastRow="0" w:firstColumn="0" w:lastColumn="0" w:oddVBand="0" w:evenVBand="0" w:oddHBand="0" w:evenHBand="0" w:firstRowFirstColumn="0" w:firstRowLastColumn="0" w:lastRowFirstColumn="0" w:lastRowLastColumn="0"/>
+            </w:pPr>
             <w:r>
               <w:rPr>
                 <w:sz w:val="19"/>
@@ -3251,6 +3595,7 @@
         <w:pStyle w:val="Heading3"/>
       </w:pPr>
       <w:r>
+        <w:lastRenderedPageBreak/>
         <w:t>3.2 Contextual analysis</w:t>
       </w:r>
     </w:p>
@@ -3279,7 +3624,6 @@
         <w:pStyle w:val="Heading3"/>
       </w:pPr>
       <w:r>
-        <w:lastRenderedPageBreak/>
         <w:t>3.3 Semantic analysis</w:t>
       </w:r>
     </w:p>
@@ -3290,18 +3634,25 @@
     </w:p>
     <w:tbl>
       <w:tblPr>
-        <w:tblStyle w:val="TableGrid"/>
+        <w:tblStyle w:val="PlainTable5"/>
         <w:tblW w:w="0" w:type="auto"/>
+        <w:jc w:val="center"/>
         <w:tblLook w:val="04A0" w:firstRow="1" w:lastRow="0" w:firstColumn="1" w:lastColumn="0" w:noHBand="0" w:noVBand="1"/>
       </w:tblPr>
       <w:tblGrid>
-        <w:gridCol w:w="4680"/>
-        <w:gridCol w:w="4680"/>
+        <w:gridCol w:w="3370"/>
+        <w:gridCol w:w="2686"/>
       </w:tblGrid>
       <w:tr>
-        <w:tc>
-          <w:tcPr>
-            <w:tcW w:w="4680" w:type="dxa"/>
+        <w:trPr>
+          <w:cnfStyle w:val="100000000000" w:firstRow="1" w:lastRow="0" w:firstColumn="0" w:lastColumn="0" w:oddVBand="0" w:evenVBand="0" w:oddHBand="0" w:evenHBand="0" w:firstRowFirstColumn="0" w:firstRowLastColumn="0" w:lastRowFirstColumn="0" w:lastRowLastColumn="0"/>
+          <w:trHeight w:val="308"/>
+          <w:jc w:val="center"/>
+        </w:trPr>
+        <w:tc>
+          <w:tcPr>
+            <w:cnfStyle w:val="001000000100" w:firstRow="0" w:lastRow="0" w:firstColumn="1" w:lastColumn="0" w:oddVBand="0" w:evenVBand="0" w:oddHBand="0" w:evenHBand="0" w:firstRowFirstColumn="1" w:firstRowLastColumn="0" w:lastRowFirstColumn="0" w:lastRowLastColumn="0"/>
+            <w:tcW w:w="3370" w:type="dxa"/>
           </w:tcPr>
           <w:p>
             <w:r>
@@ -3315,9 +3666,12 @@
         </w:tc>
         <w:tc>
           <w:tcPr>
-            <w:tcW w:w="4680" w:type="dxa"/>
-          </w:tcPr>
-          <w:p>
+            <w:tcW w:w="2686" w:type="dxa"/>
+          </w:tcPr>
+          <w:p>
+            <w:pPr>
+              <w:cnfStyle w:val="100000000000" w:firstRow="1" w:lastRow="0" w:firstColumn="0" w:lastColumn="0" w:oddVBand="0" w:evenVBand="0" w:oddHBand="0" w:evenHBand="0" w:firstRowFirstColumn="0" w:firstRowLastColumn="0" w:lastRowFirstColumn="0" w:lastRowLastColumn="0"/>
+            </w:pPr>
             <w:r>
               <w:rPr>
                 <w:b/>
@@ -3329,9 +3683,15 @@
         </w:tc>
       </w:tr>
       <w:tr>
-        <w:tc>
-          <w:tcPr>
-            <w:tcW w:w="4680" w:type="dxa"/>
+        <w:trPr>
+          <w:cnfStyle w:val="000000100000" w:firstRow="0" w:lastRow="0" w:firstColumn="0" w:lastColumn="0" w:oddVBand="0" w:evenVBand="0" w:oddHBand="1" w:evenHBand="0" w:firstRowFirstColumn="0" w:firstRowLastColumn="0" w:lastRowFirstColumn="0" w:lastRowLastColumn="0"/>
+          <w:trHeight w:val="308"/>
+          <w:jc w:val="center"/>
+        </w:trPr>
+        <w:tc>
+          <w:tcPr>
+            <w:cnfStyle w:val="001000000000" w:firstRow="0" w:lastRow="0" w:firstColumn="1" w:lastColumn="0" w:oddVBand="0" w:evenVBand="0" w:oddHBand="0" w:evenHBand="0" w:firstRowFirstColumn="0" w:firstRowLastColumn="0" w:lastRowFirstColumn="0" w:lastRowLastColumn="0"/>
+            <w:tcW w:w="3370" w:type="dxa"/>
           </w:tcPr>
           <w:p>
             <w:r>
@@ -3344,11 +3704,11 @@
         </w:tc>
         <w:tc>
           <w:tcPr>
-            <w:tcW w:w="4680" w:type="dxa"/>
-          </w:tcPr>
-          <w:p>
-            <w:pPr>
-              <w:jc w:val="right"/>
+            <w:tcW w:w="2686" w:type="dxa"/>
+          </w:tcPr>
+          <w:p>
+            <w:pPr>
+              <w:cnfStyle w:val="000000100000" w:firstRow="0" w:lastRow="0" w:firstColumn="0" w:lastColumn="0" w:oddVBand="0" w:evenVBand="0" w:oddHBand="1" w:evenHBand="0" w:firstRowFirstColumn="0" w:firstRowLastColumn="0" w:lastRowFirstColumn="0" w:lastRowLastColumn="0"/>
             </w:pPr>
             <w:r>
               <w:rPr>
@@ -3360,9 +3720,14 @@
         </w:tc>
       </w:tr>
       <w:tr>
-        <w:tc>
-          <w:tcPr>
-            <w:tcW w:w="4680" w:type="dxa"/>
+        <w:trPr>
+          <w:trHeight w:val="308"/>
+          <w:jc w:val="center"/>
+        </w:trPr>
+        <w:tc>
+          <w:tcPr>
+            <w:cnfStyle w:val="001000000000" w:firstRow="0" w:lastRow="0" w:firstColumn="1" w:lastColumn="0" w:oddVBand="0" w:evenVBand="0" w:oddHBand="0" w:evenHBand="0" w:firstRowFirstColumn="0" w:firstRowLastColumn="0" w:lastRowFirstColumn="0" w:lastRowLastColumn="0"/>
+            <w:tcW w:w="3370" w:type="dxa"/>
           </w:tcPr>
           <w:p>
             <w:r>
@@ -3375,11 +3740,11 @@
         </w:tc>
         <w:tc>
           <w:tcPr>
-            <w:tcW w:w="4680" w:type="dxa"/>
-          </w:tcPr>
-          <w:p>
-            <w:pPr>
-              <w:jc w:val="right"/>
+            <w:tcW w:w="2686" w:type="dxa"/>
+          </w:tcPr>
+          <w:p>
+            <w:pPr>
+              <w:cnfStyle w:val="000000000000" w:firstRow="0" w:lastRow="0" w:firstColumn="0" w:lastColumn="0" w:oddVBand="0" w:evenVBand="0" w:oddHBand="0" w:evenHBand="0" w:firstRowFirstColumn="0" w:firstRowLastColumn="0" w:lastRowFirstColumn="0" w:lastRowLastColumn="0"/>
             </w:pPr>
             <w:r>
               <w:rPr>
@@ -3391,9 +3756,15 @@
         </w:tc>
       </w:tr>
       <w:tr>
-        <w:tc>
-          <w:tcPr>
-            <w:tcW w:w="4680" w:type="dxa"/>
+        <w:trPr>
+          <w:cnfStyle w:val="000000100000" w:firstRow="0" w:lastRow="0" w:firstColumn="0" w:lastColumn="0" w:oddVBand="0" w:evenVBand="0" w:oddHBand="1" w:evenHBand="0" w:firstRowFirstColumn="0" w:firstRowLastColumn="0" w:lastRowFirstColumn="0" w:lastRowLastColumn="0"/>
+          <w:trHeight w:val="301"/>
+          <w:jc w:val="center"/>
+        </w:trPr>
+        <w:tc>
+          <w:tcPr>
+            <w:cnfStyle w:val="001000000000" w:firstRow="0" w:lastRow="0" w:firstColumn="1" w:lastColumn="0" w:oddVBand="0" w:evenVBand="0" w:oddHBand="0" w:evenHBand="0" w:firstRowFirstColumn="0" w:firstRowLastColumn="0" w:lastRowFirstColumn="0" w:lastRowLastColumn="0"/>
+            <w:tcW w:w="3370" w:type="dxa"/>
           </w:tcPr>
           <w:p>
             <w:r>
@@ -3406,9 +3777,12 @@
         </w:tc>
         <w:tc>
           <w:tcPr>
-            <w:tcW w:w="4680" w:type="dxa"/>
-          </w:tcPr>
-          <w:p>
+            <w:tcW w:w="2686" w:type="dxa"/>
+          </w:tcPr>
+          <w:p>
+            <w:pPr>
+              <w:cnfStyle w:val="000000100000" w:firstRow="0" w:lastRow="0" w:firstColumn="0" w:lastColumn="0" w:oddVBand="0" w:evenVBand="0" w:oddHBand="1" w:evenHBand="0" w:firstRowFirstColumn="0" w:firstRowLastColumn="0" w:lastRowFirstColumn="0" w:lastRowLastColumn="0"/>
+            </w:pPr>
             <w:r>
               <w:rPr>
                 <w:sz w:val="19"/>
@@ -3419,9 +3793,14 @@
         </w:tc>
       </w:tr>
       <w:tr>
-        <w:tc>
-          <w:tcPr>
-            <w:tcW w:w="4680" w:type="dxa"/>
+        <w:trPr>
+          <w:trHeight w:val="308"/>
+          <w:jc w:val="center"/>
+        </w:trPr>
+        <w:tc>
+          <w:tcPr>
+            <w:cnfStyle w:val="001000000000" w:firstRow="0" w:lastRow="0" w:firstColumn="1" w:lastColumn="0" w:oddVBand="0" w:evenVBand="0" w:oddHBand="0" w:evenHBand="0" w:firstRowFirstColumn="0" w:firstRowLastColumn="0" w:lastRowFirstColumn="0" w:lastRowLastColumn="0"/>
+            <w:tcW w:w="3370" w:type="dxa"/>
           </w:tcPr>
           <w:p>
             <w:r>
@@ -3434,9 +3813,12 @@
         </w:tc>
         <w:tc>
           <w:tcPr>
-            <w:tcW w:w="4680" w:type="dxa"/>
-          </w:tcPr>
-          <w:p>
+            <w:tcW w:w="2686" w:type="dxa"/>
+          </w:tcPr>
+          <w:p>
+            <w:pPr>
+              <w:cnfStyle w:val="000000000000" w:firstRow="0" w:lastRow="0" w:firstColumn="0" w:lastColumn="0" w:oddVBand="0" w:evenVBand="0" w:oddHBand="0" w:evenHBand="0" w:firstRowFirstColumn="0" w:firstRowLastColumn="0" w:lastRowFirstColumn="0" w:lastRowLastColumn="0"/>
+            </w:pPr>
             <w:r>
               <w:rPr>
                 <w:sz w:val="19"/>
@@ -3447,9 +3829,15 @@
         </w:tc>
       </w:tr>
       <w:tr>
-        <w:tc>
-          <w:tcPr>
-            <w:tcW w:w="4680" w:type="dxa"/>
+        <w:trPr>
+          <w:cnfStyle w:val="000000100000" w:firstRow="0" w:lastRow="0" w:firstColumn="0" w:lastColumn="0" w:oddVBand="0" w:evenVBand="0" w:oddHBand="1" w:evenHBand="0" w:firstRowFirstColumn="0" w:firstRowLastColumn="0" w:lastRowFirstColumn="0" w:lastRowLastColumn="0"/>
+          <w:trHeight w:val="308"/>
+          <w:jc w:val="center"/>
+        </w:trPr>
+        <w:tc>
+          <w:tcPr>
+            <w:cnfStyle w:val="001000000000" w:firstRow="0" w:lastRow="0" w:firstColumn="1" w:lastColumn="0" w:oddVBand="0" w:evenVBand="0" w:oddHBand="0" w:evenHBand="0" w:firstRowFirstColumn="0" w:firstRowLastColumn="0" w:lastRowFirstColumn="0" w:lastRowLastColumn="0"/>
+            <w:tcW w:w="3370" w:type="dxa"/>
           </w:tcPr>
           <w:p>
             <w:r>
@@ -3462,9 +3850,12 @@
         </w:tc>
         <w:tc>
           <w:tcPr>
-            <w:tcW w:w="4680" w:type="dxa"/>
-          </w:tcPr>
-          <w:p>
+            <w:tcW w:w="2686" w:type="dxa"/>
+          </w:tcPr>
+          <w:p>
+            <w:pPr>
+              <w:cnfStyle w:val="000000100000" w:firstRow="0" w:lastRow="0" w:firstColumn="0" w:lastColumn="0" w:oddVBand="0" w:evenVBand="0" w:oddHBand="1" w:evenHBand="0" w:firstRowFirstColumn="0" w:firstRowLastColumn="0" w:lastRowFirstColumn="0" w:lastRowLastColumn="0"/>
+            </w:pPr>
             <w:r>
               <w:rPr>
                 <w:sz w:val="19"/>
@@ -3501,7 +3892,7 @@
     </w:p>
     <w:tbl>
       <w:tblPr>
-        <w:tblStyle w:val="TableGrid"/>
+        <w:tblStyle w:val="PlainTable5"/>
         <w:tblW w:w="8894" w:type="dxa"/>
         <w:tblLook w:val="04A0" w:firstRow="1" w:lastRow="0" w:firstColumn="1" w:lastColumn="0" w:noHBand="0" w:noVBand="1"/>
       </w:tblPr>
@@ -3513,10 +3904,12 @@
       </w:tblGrid>
       <w:tr>
         <w:trPr>
+          <w:cnfStyle w:val="100000000000" w:firstRow="1" w:lastRow="0" w:firstColumn="0" w:lastColumn="0" w:oddVBand="0" w:evenVBand="0" w:oddHBand="0" w:evenHBand="0" w:firstRowFirstColumn="0" w:firstRowLastColumn="0" w:lastRowFirstColumn="0" w:lastRowLastColumn="0"/>
           <w:trHeight w:val="430"/>
         </w:trPr>
         <w:tc>
           <w:tcPr>
+            <w:cnfStyle w:val="001000000100" w:firstRow="0" w:lastRow="0" w:firstColumn="1" w:lastColumn="0" w:oddVBand="0" w:evenVBand="0" w:oddHBand="0" w:evenHBand="0" w:firstRowFirstColumn="1" w:firstRowLastColumn="0" w:lastRowFirstColumn="0" w:lastRowLastColumn="0"/>
             <w:tcW w:w="1163" w:type="dxa"/>
           </w:tcPr>
           <w:p>
@@ -3534,6 +3927,9 @@
             <w:tcW w:w="5888" w:type="dxa"/>
           </w:tcPr>
           <w:p>
+            <w:pPr>
+              <w:cnfStyle w:val="100000000000" w:firstRow="1" w:lastRow="0" w:firstColumn="0" w:lastColumn="0" w:oddVBand="0" w:evenVBand="0" w:oddHBand="0" w:evenHBand="0" w:firstRowFirstColumn="0" w:firstRowLastColumn="0" w:lastRowFirstColumn="0" w:lastRowLastColumn="0"/>
+            </w:pPr>
             <w:r>
               <w:rPr>
                 <w:b/>
@@ -3548,6 +3944,9 @@
             <w:tcW w:w="894" w:type="dxa"/>
           </w:tcPr>
           <w:p>
+            <w:pPr>
+              <w:cnfStyle w:val="100000000000" w:firstRow="1" w:lastRow="0" w:firstColumn="0" w:lastColumn="0" w:oddVBand="0" w:evenVBand="0" w:oddHBand="0" w:evenHBand="0" w:firstRowFirstColumn="0" w:firstRowLastColumn="0" w:lastRowFirstColumn="0" w:lastRowLastColumn="0"/>
+            </w:pPr>
             <w:r>
               <w:rPr>
                 <w:b/>
@@ -3562,12 +3961,85 @@
             <w:tcW w:w="949" w:type="dxa"/>
           </w:tcPr>
           <w:p>
+            <w:pPr>
+              <w:cnfStyle w:val="100000000000" w:firstRow="1" w:lastRow="0" w:firstColumn="0" w:lastColumn="0" w:oddVBand="0" w:evenVBand="0" w:oddHBand="0" w:evenHBand="0" w:firstRowFirstColumn="0" w:firstRowLastColumn="0" w:lastRowFirstColumn="0" w:lastRowLastColumn="0"/>
+            </w:pPr>
             <w:r>
               <w:rPr>
                 <w:b/>
                 <w:sz w:val="19"/>
               </w:rPr>
               <w:t>Share</w:t>
+            </w:r>
+          </w:p>
+        </w:tc>
+      </w:tr>
+      <w:tr>
+        <w:trPr>
+          <w:cnfStyle w:val="000000100000" w:firstRow="0" w:lastRow="0" w:firstColumn="0" w:lastColumn="0" w:oddVBand="0" w:evenVBand="0" w:oddHBand="1" w:evenHBand="0" w:firstRowFirstColumn="0" w:firstRowLastColumn="0" w:lastRowFirstColumn="0" w:lastRowLastColumn="0"/>
+          <w:trHeight w:val="430"/>
+        </w:trPr>
+        <w:tc>
+          <w:tcPr>
+            <w:cnfStyle w:val="001000000000" w:firstRow="0" w:lastRow="0" w:firstColumn="1" w:lastColumn="0" w:oddVBand="0" w:evenVBand="0" w:oddHBand="0" w:evenHBand="0" w:firstRowFirstColumn="0" w:firstRowLastColumn="0" w:lastRowFirstColumn="0" w:lastRowLastColumn="0"/>
+            <w:tcW w:w="1163" w:type="dxa"/>
+          </w:tcPr>
+          <w:p>
+            <w:r>
+              <w:rPr>
+                <w:sz w:val="19"/>
+              </w:rPr>
+              <w:t>Low</w:t>
+            </w:r>
+          </w:p>
+        </w:tc>
+        <w:tc>
+          <w:tcPr>
+            <w:tcW w:w="5888" w:type="dxa"/>
+          </w:tcPr>
+          <w:p>
+            <w:pPr>
+              <w:cnfStyle w:val="000000100000" w:firstRow="0" w:lastRow="0" w:firstColumn="0" w:lastColumn="0" w:oddVBand="0" w:evenVBand="0" w:oddHBand="1" w:evenHBand="0" w:firstRowFirstColumn="0" w:firstRowLastColumn="0" w:lastRowFirstColumn="0" w:lastRowLastColumn="0"/>
+            </w:pPr>
+            <w:r>
+              <w:rPr>
+                <w:sz w:val="19"/>
+              </w:rPr>
+              <w:t>Number formatting, word boundary error, suffix addition</w:t>
+            </w:r>
+          </w:p>
+        </w:tc>
+        <w:tc>
+          <w:tcPr>
+            <w:tcW w:w="894" w:type="dxa"/>
+          </w:tcPr>
+          <w:p>
+            <w:pPr>
+              <w:jc w:val="right"/>
+              <w:cnfStyle w:val="000000100000" w:firstRow="0" w:lastRow="0" w:firstColumn="0" w:lastColumn="0" w:oddVBand="0" w:evenVBand="0" w:oddHBand="1" w:evenHBand="0" w:firstRowFirstColumn="0" w:firstRowLastColumn="0" w:lastRowFirstColumn="0" w:lastRowLastColumn="0"/>
+            </w:pPr>
+            <w:r>
+              <w:rPr>
+                <w:sz w:val="19"/>
+              </w:rPr>
+              <w:t>11</w:t>
+            </w:r>
+          </w:p>
+        </w:tc>
+        <w:tc>
+          <w:tcPr>
+            <w:tcW w:w="949" w:type="dxa"/>
+          </w:tcPr>
+          <w:p>
+            <w:pPr>
+              <w:jc w:val="right"/>
+              <w:cnfStyle w:val="000000100000" w:firstRow="0" w:lastRow="0" w:firstColumn="0" w:lastColumn="0" w:oddVBand="0" w:evenVBand="0" w:oddHBand="1" w:evenHBand="0" w:firstRowFirstColumn="0" w:firstRowLastColumn="0" w:lastRowFirstColumn="0" w:lastRowLastColumn="0"/>
+            </w:pPr>
+            <w:r>
+              <w:rPr>
+                <w:sz w:val="19"/>
+              </w:rPr>
+              <w:t>14.5%</w:t>
             </w:r>
           </w:p>
         </w:tc>
@@ -3578,6 +4050,7 @@
         </w:trPr>
         <w:tc>
           <w:tcPr>
+            <w:cnfStyle w:val="001000000000" w:firstRow="0" w:lastRow="0" w:firstColumn="1" w:lastColumn="0" w:oddVBand="0" w:evenVBand="0" w:oddHBand="0" w:evenHBand="0" w:firstRowFirstColumn="0" w:firstRowLastColumn="0" w:lastRowFirstColumn="0" w:lastRowLastColumn="0"/>
             <w:tcW w:w="1163" w:type="dxa"/>
           </w:tcPr>
           <w:p>
@@ -3585,7 +4058,7 @@
               <w:rPr>
                 <w:sz w:val="19"/>
               </w:rPr>
-              <w:t>Low</w:t>
+              <w:t>Medium</w:t>
             </w:r>
           </w:p>
         </w:tc>
@@ -3594,11 +4067,14 @@
             <w:tcW w:w="5888" w:type="dxa"/>
           </w:tcPr>
           <w:p>
-            <w:r>
-              <w:rPr>
-                <w:sz w:val="19"/>
-              </w:rPr>
-              <w:t>Number formatting, word boundary error, suffix addition</w:t>
+            <w:pPr>
+              <w:cnfStyle w:val="000000000000" w:firstRow="0" w:lastRow="0" w:firstColumn="0" w:lastColumn="0" w:oddVBand="0" w:evenVBand="0" w:oddHBand="0" w:evenHBand="0" w:firstRowFirstColumn="0" w:firstRowLastColumn="0" w:lastRowFirstColumn="0" w:lastRowLastColumn="0"/>
+            </w:pPr>
+            <w:r>
+              <w:rPr>
+                <w:sz w:val="19"/>
+              </w:rPr>
+              <w:t>Homophone substitution, invented spelling</w:t>
             </w:r>
           </w:p>
         </w:tc>
@@ -3609,12 +4085,13 @@
           <w:p>
             <w:pPr>
               <w:jc w:val="right"/>
-            </w:pPr>
-            <w:r>
-              <w:rPr>
-                <w:sz w:val="19"/>
-              </w:rPr>
-              <w:t>11</w:t>
+              <w:cnfStyle w:val="000000000000" w:firstRow="0" w:lastRow="0" w:firstColumn="0" w:lastColumn="0" w:oddVBand="0" w:evenVBand="0" w:oddHBand="0" w:evenHBand="0" w:firstRowFirstColumn="0" w:firstRowLastColumn="0" w:lastRowFirstColumn="0" w:lastRowLastColumn="0"/>
+            </w:pPr>
+            <w:r>
+              <w:rPr>
+                <w:sz w:val="19"/>
+              </w:rPr>
+              <w:t>51</w:t>
             </w:r>
           </w:p>
         </w:tc>
@@ -3625,12 +4102,83 @@
           <w:p>
             <w:pPr>
               <w:jc w:val="right"/>
-            </w:pPr>
-            <w:r>
-              <w:rPr>
-                <w:sz w:val="19"/>
-              </w:rPr>
-              <w:t>14.5%</w:t>
+              <w:cnfStyle w:val="000000000000" w:firstRow="0" w:lastRow="0" w:firstColumn="0" w:lastColumn="0" w:oddVBand="0" w:evenVBand="0" w:oddHBand="0" w:evenHBand="0" w:firstRowFirstColumn="0" w:firstRowLastColumn="0" w:lastRowFirstColumn="0" w:lastRowLastColumn="0"/>
+            </w:pPr>
+            <w:r>
+              <w:rPr>
+                <w:sz w:val="19"/>
+              </w:rPr>
+              <w:t>67.1%</w:t>
+            </w:r>
+          </w:p>
+        </w:tc>
+      </w:tr>
+      <w:tr>
+        <w:trPr>
+          <w:cnfStyle w:val="000000100000" w:firstRow="0" w:lastRow="0" w:firstColumn="0" w:lastColumn="0" w:oddVBand="0" w:evenVBand="0" w:oddHBand="1" w:evenHBand="0" w:firstRowFirstColumn="0" w:firstRowLastColumn="0" w:lastRowFirstColumn="0" w:lastRowLastColumn="0"/>
+          <w:trHeight w:val="430"/>
+        </w:trPr>
+        <w:tc>
+          <w:tcPr>
+            <w:cnfStyle w:val="001000000000" w:firstRow="0" w:lastRow="0" w:firstColumn="1" w:lastColumn="0" w:oddVBand="0" w:evenVBand="0" w:oddHBand="0" w:evenHBand="0" w:firstRowFirstColumn="0" w:firstRowLastColumn="0" w:lastRowFirstColumn="0" w:lastRowLastColumn="0"/>
+            <w:tcW w:w="1163" w:type="dxa"/>
+          </w:tcPr>
+          <w:p>
+            <w:r>
+              <w:rPr>
+                <w:sz w:val="19"/>
+              </w:rPr>
+              <w:t>High</w:t>
+            </w:r>
+          </w:p>
+        </w:tc>
+        <w:tc>
+          <w:tcPr>
+            <w:tcW w:w="5888" w:type="dxa"/>
+          </w:tcPr>
+          <w:p>
+            <w:pPr>
+              <w:cnfStyle w:val="000000100000" w:firstRow="0" w:lastRow="0" w:firstColumn="0" w:lastColumn="0" w:oddVBand="0" w:evenVBand="0" w:oddHBand="1" w:evenHBand="0" w:firstRowFirstColumn="0" w:firstRowLastColumn="0" w:lastRowFirstColumn="0" w:lastRowLastColumn="0"/>
+            </w:pPr>
+            <w:r>
+              <w:rPr>
+                <w:sz w:val="19"/>
+              </w:rPr>
+              <w:t>Incorrect word selection, rare word substitution, truncation</w:t>
+            </w:r>
+          </w:p>
+        </w:tc>
+        <w:tc>
+          <w:tcPr>
+            <w:tcW w:w="894" w:type="dxa"/>
+          </w:tcPr>
+          <w:p>
+            <w:pPr>
+              <w:jc w:val="right"/>
+              <w:cnfStyle w:val="000000100000" w:firstRow="0" w:lastRow="0" w:firstColumn="0" w:lastColumn="0" w:oddVBand="0" w:evenVBand="0" w:oddHBand="1" w:evenHBand="0" w:firstRowFirstColumn="0" w:firstRowLastColumn="0" w:lastRowFirstColumn="0" w:lastRowLastColumn="0"/>
+            </w:pPr>
+            <w:r>
+              <w:rPr>
+                <w:sz w:val="19"/>
+              </w:rPr>
+              <w:t>14</w:t>
+            </w:r>
+          </w:p>
+        </w:tc>
+        <w:tc>
+          <w:tcPr>
+            <w:tcW w:w="949" w:type="dxa"/>
+          </w:tcPr>
+          <w:p>
+            <w:pPr>
+              <w:jc w:val="right"/>
+              <w:cnfStyle w:val="000000100000" w:firstRow="0" w:lastRow="0" w:firstColumn="0" w:lastColumn="0" w:oddVBand="0" w:evenVBand="0" w:oddHBand="1" w:evenHBand="0" w:firstRowFirstColumn="0" w:firstRowLastColumn="0" w:lastRowFirstColumn="0" w:lastRowLastColumn="0"/>
+            </w:pPr>
+            <w:r>
+              <w:rPr>
+                <w:sz w:val="19"/>
+              </w:rPr>
+              <w:t>18.4%</w:t>
             </w:r>
           </w:p>
         </w:tc>
@@ -3641,6 +4189,7 @@
         </w:trPr>
         <w:tc>
           <w:tcPr>
+            <w:cnfStyle w:val="001000000000" w:firstRow="0" w:lastRow="0" w:firstColumn="1" w:lastColumn="0" w:oddVBand="0" w:evenVBand="0" w:oddHBand="0" w:evenHBand="0" w:firstRowFirstColumn="0" w:firstRowLastColumn="0" w:lastRowFirstColumn="0" w:lastRowLastColumn="0"/>
             <w:tcW w:w="1163" w:type="dxa"/>
           </w:tcPr>
           <w:p>
@@ -3648,7 +4197,7 @@
               <w:rPr>
                 <w:sz w:val="19"/>
               </w:rPr>
-              <w:t>Medium</w:t>
+              <w:t>Critical</w:t>
             </w:r>
           </w:p>
         </w:tc>
@@ -3657,11 +4206,14 @@
             <w:tcW w:w="5888" w:type="dxa"/>
           </w:tcPr>
           <w:p>
-            <w:r>
-              <w:rPr>
-                <w:sz w:val="19"/>
-              </w:rPr>
-              <w:t>Homophone substitution, invented spelling</w:t>
+            <w:pPr>
+              <w:cnfStyle w:val="000000000000" w:firstRow="0" w:lastRow="0" w:firstColumn="0" w:lastColumn="0" w:oddVBand="0" w:evenVBand="0" w:oddHBand="0" w:evenHBand="0" w:firstRowFirstColumn="0" w:firstRowLastColumn="0" w:lastRowFirstColumn="0" w:lastRowLastColumn="0"/>
+            </w:pPr>
+            <w:r>
+              <w:rPr>
+                <w:sz w:val="19"/>
+              </w:rPr>
+              <w:t>None</w:t>
             </w:r>
           </w:p>
         </w:tc>
@@ -3672,12 +4224,13 @@
           <w:p>
             <w:pPr>
               <w:jc w:val="right"/>
-            </w:pPr>
-            <w:r>
-              <w:rPr>
-                <w:sz w:val="19"/>
-              </w:rPr>
-              <w:t>51</w:t>
+              <w:cnfStyle w:val="000000000000" w:firstRow="0" w:lastRow="0" w:firstColumn="0" w:lastColumn="0" w:oddVBand="0" w:evenVBand="0" w:oddHBand="0" w:evenHBand="0" w:firstRowFirstColumn="0" w:firstRowLastColumn="0" w:lastRowFirstColumn="0" w:lastRowLastColumn="0"/>
+            </w:pPr>
+            <w:r>
+              <w:rPr>
+                <w:sz w:val="19"/>
+              </w:rPr>
+              <w:t>0</w:t>
             </w:r>
           </w:p>
         </w:tc>
@@ -3688,132 +4241,7 @@
           <w:p>
             <w:pPr>
               <w:jc w:val="right"/>
-            </w:pPr>
-            <w:r>
-              <w:rPr>
-                <w:sz w:val="19"/>
-              </w:rPr>
-              <w:t>67.1%</w:t>
-            </w:r>
-          </w:p>
-        </w:tc>
-      </w:tr>
-      <w:tr>
-        <w:trPr>
-          <w:trHeight w:val="430"/>
-        </w:trPr>
-        <w:tc>
-          <w:tcPr>
-            <w:tcW w:w="1163" w:type="dxa"/>
-          </w:tcPr>
-          <w:p>
-            <w:r>
-              <w:rPr>
-                <w:sz w:val="19"/>
-              </w:rPr>
-              <w:t>High</w:t>
-            </w:r>
-          </w:p>
-        </w:tc>
-        <w:tc>
-          <w:tcPr>
-            <w:tcW w:w="5888" w:type="dxa"/>
-          </w:tcPr>
-          <w:p>
-            <w:r>
-              <w:rPr>
-                <w:sz w:val="19"/>
-              </w:rPr>
-              <w:t>Incorrect word selection, rare word substitution, truncation</w:t>
-            </w:r>
-          </w:p>
-        </w:tc>
-        <w:tc>
-          <w:tcPr>
-            <w:tcW w:w="894" w:type="dxa"/>
-          </w:tcPr>
-          <w:p>
-            <w:pPr>
-              <w:jc w:val="right"/>
-            </w:pPr>
-            <w:r>
-              <w:rPr>
-                <w:sz w:val="19"/>
-              </w:rPr>
-              <w:t>14</w:t>
-            </w:r>
-          </w:p>
-        </w:tc>
-        <w:tc>
-          <w:tcPr>
-            <w:tcW w:w="949" w:type="dxa"/>
-          </w:tcPr>
-          <w:p>
-            <w:pPr>
-              <w:jc w:val="right"/>
-            </w:pPr>
-            <w:r>
-              <w:rPr>
-                <w:sz w:val="19"/>
-              </w:rPr>
-              <w:t>18.4%</w:t>
-            </w:r>
-          </w:p>
-        </w:tc>
-      </w:tr>
-      <w:tr>
-        <w:trPr>
-          <w:trHeight w:val="430"/>
-        </w:trPr>
-        <w:tc>
-          <w:tcPr>
-            <w:tcW w:w="1163" w:type="dxa"/>
-          </w:tcPr>
-          <w:p>
-            <w:r>
-              <w:rPr>
-                <w:sz w:val="19"/>
-              </w:rPr>
-              <w:t>Critical</w:t>
-            </w:r>
-          </w:p>
-        </w:tc>
-        <w:tc>
-          <w:tcPr>
-            <w:tcW w:w="5888" w:type="dxa"/>
-          </w:tcPr>
-          <w:p>
-            <w:r>
-              <w:rPr>
-                <w:sz w:val="19"/>
-              </w:rPr>
-              <w:t>None</w:t>
-            </w:r>
-          </w:p>
-        </w:tc>
-        <w:tc>
-          <w:tcPr>
-            <w:tcW w:w="894" w:type="dxa"/>
-          </w:tcPr>
-          <w:p>
-            <w:pPr>
-              <w:jc w:val="right"/>
-            </w:pPr>
-            <w:r>
-              <w:rPr>
-                <w:sz w:val="19"/>
-              </w:rPr>
-              <w:t>0</w:t>
-            </w:r>
-          </w:p>
-        </w:tc>
-        <w:tc>
-          <w:tcPr>
-            <w:tcW w:w="949" w:type="dxa"/>
-          </w:tcPr>
-          <w:p>
-            <w:pPr>
-              <w:jc w:val="right"/>
+              <w:cnfStyle w:val="000000000000" w:firstRow="0" w:lastRow="0" w:firstColumn="0" w:lastColumn="0" w:oddVBand="0" w:evenVBand="0" w:oddHBand="0" w:evenHBand="0" w:firstRowFirstColumn="0" w:firstRowLastColumn="0" w:lastRowFirstColumn="0" w:lastRowLastColumn="0"/>
             </w:pPr>
             <w:r>
               <w:rPr>
@@ -3851,26 +4279,30 @@
         <w:pStyle w:val="Heading2"/>
       </w:pPr>
       <w:r>
-        <w:lastRenderedPageBreak/>
         <w:t>Outputs: correction recommendations</w:t>
       </w:r>
     </w:p>
     <w:tbl>
       <w:tblPr>
-        <w:tblStyle w:val="TableGrid"/>
-        <w:tblW w:w="9577" w:type="dxa"/>
+        <w:tblStyle w:val="PlainTable5"/>
+        <w:tblW w:w="9967" w:type="dxa"/>
         <w:tblLook w:val="04A0" w:firstRow="1" w:lastRow="0" w:firstColumn="1" w:lastColumn="0" w:noHBand="0" w:noVBand="1"/>
       </w:tblPr>
       <w:tblGrid>
-        <w:gridCol w:w="715"/>
-        <w:gridCol w:w="2096"/>
-        <w:gridCol w:w="3383"/>
-        <w:gridCol w:w="3383"/>
+        <w:gridCol w:w="642"/>
+        <w:gridCol w:w="2126"/>
+        <w:gridCol w:w="3538"/>
+        <w:gridCol w:w="3661"/>
       </w:tblGrid>
       <w:tr>
-        <w:tc>
-          <w:tcPr>
-            <w:tcW w:w="715" w:type="dxa"/>
+        <w:trPr>
+          <w:cnfStyle w:val="100000000000" w:firstRow="1" w:lastRow="0" w:firstColumn="0" w:lastColumn="0" w:oddVBand="0" w:evenVBand="0" w:oddHBand="0" w:evenHBand="0" w:firstRowFirstColumn="0" w:firstRowLastColumn="0" w:lastRowFirstColumn="0" w:lastRowLastColumn="0"/>
+          <w:trHeight w:val="308"/>
+        </w:trPr>
+        <w:tc>
+          <w:tcPr>
+            <w:cnfStyle w:val="001000000100" w:firstRow="0" w:lastRow="0" w:firstColumn="1" w:lastColumn="0" w:oddVBand="0" w:evenVBand="0" w:oddHBand="0" w:evenHBand="0" w:firstRowFirstColumn="1" w:firstRowLastColumn="0" w:lastRowFirstColumn="0" w:lastRowLastColumn="0"/>
+            <w:tcW w:w="642" w:type="dxa"/>
           </w:tcPr>
           <w:p>
             <w:r>
@@ -3884,9 +4316,12 @@
         </w:tc>
         <w:tc>
           <w:tcPr>
-            <w:tcW w:w="2096" w:type="dxa"/>
-          </w:tcPr>
-          <w:p>
+            <w:tcW w:w="2126" w:type="dxa"/>
+          </w:tcPr>
+          <w:p>
+            <w:pPr>
+              <w:cnfStyle w:val="100000000000" w:firstRow="1" w:lastRow="0" w:firstColumn="0" w:lastColumn="0" w:oddVBand="0" w:evenVBand="0" w:oddHBand="0" w:evenHBand="0" w:firstRowFirstColumn="0" w:firstRowLastColumn="0" w:lastRowFirstColumn="0" w:lastRowLastColumn="0"/>
+            </w:pPr>
             <w:r>
               <w:rPr>
                 <w:b/>
@@ -3898,9 +4333,12 @@
         </w:tc>
         <w:tc>
           <w:tcPr>
-            <w:tcW w:w="3383" w:type="dxa"/>
-          </w:tcPr>
-          <w:p>
+            <w:tcW w:w="3538" w:type="dxa"/>
+          </w:tcPr>
+          <w:p>
+            <w:pPr>
+              <w:cnfStyle w:val="100000000000" w:firstRow="1" w:lastRow="0" w:firstColumn="0" w:lastColumn="0" w:oddVBand="0" w:evenVBand="0" w:oddHBand="0" w:evenHBand="0" w:firstRowFirstColumn="0" w:firstRowLastColumn="0" w:lastRowFirstColumn="0" w:lastRowLastColumn="0"/>
+            </w:pPr>
             <w:r>
               <w:rPr>
                 <w:b/>
@@ -3912,9 +4350,12 @@
         </w:tc>
         <w:tc>
           <w:tcPr>
-            <w:tcW w:w="3383" w:type="dxa"/>
-          </w:tcPr>
-          <w:p>
+            <w:tcW w:w="3661" w:type="dxa"/>
+          </w:tcPr>
+          <w:p>
+            <w:pPr>
+              <w:cnfStyle w:val="100000000000" w:firstRow="1" w:lastRow="0" w:firstColumn="0" w:lastColumn="0" w:oddVBand="0" w:evenVBand="0" w:oddHBand="0" w:evenHBand="0" w:firstRowFirstColumn="0" w:firstRowLastColumn="0" w:lastRowFirstColumn="0" w:lastRowLastColumn="0"/>
+            </w:pPr>
             <w:r>
               <w:rPr>
                 <w:b/>
@@ -3926,14 +4367,16 @@
         </w:tc>
       </w:tr>
       <w:tr>
-        <w:tc>
-          <w:tcPr>
-            <w:tcW w:w="715" w:type="dxa"/>
-          </w:tcPr>
-          <w:p>
-            <w:pPr>
-              <w:jc w:val="right"/>
-            </w:pPr>
+        <w:trPr>
+          <w:cnfStyle w:val="000000100000" w:firstRow="0" w:lastRow="0" w:firstColumn="0" w:lastColumn="0" w:oddVBand="0" w:evenVBand="0" w:oddHBand="1" w:evenHBand="0" w:firstRowFirstColumn="0" w:firstRowLastColumn="0" w:lastRowFirstColumn="0" w:lastRowLastColumn="0"/>
+          <w:trHeight w:val="509"/>
+        </w:trPr>
+        <w:tc>
+          <w:tcPr>
+            <w:cnfStyle w:val="001000000000" w:firstRow="0" w:lastRow="0" w:firstColumn="1" w:lastColumn="0" w:oddVBand="0" w:evenVBand="0" w:oddHBand="0" w:evenHBand="0" w:firstRowFirstColumn="0" w:firstRowLastColumn="0" w:lastRowFirstColumn="0" w:lastRowLastColumn="0"/>
+            <w:tcW w:w="642" w:type="dxa"/>
+          </w:tcPr>
+          <w:p>
             <w:r>
               <w:rPr>
                 <w:sz w:val="19"/>
@@ -3944,9 +4387,12 @@
         </w:tc>
         <w:tc>
           <w:tcPr>
-            <w:tcW w:w="2096" w:type="dxa"/>
-          </w:tcPr>
-          <w:p>
+            <w:tcW w:w="2126" w:type="dxa"/>
+          </w:tcPr>
+          <w:p>
+            <w:pPr>
+              <w:cnfStyle w:val="000000100000" w:firstRow="0" w:lastRow="0" w:firstColumn="0" w:lastColumn="0" w:oddVBand="0" w:evenVBand="0" w:oddHBand="1" w:evenHBand="0" w:firstRowFirstColumn="0" w:firstRowLastColumn="0" w:lastRowFirstColumn="0" w:lastRowLastColumn="0"/>
+            </w:pPr>
             <w:r>
               <w:rPr>
                 <w:sz w:val="19"/>
@@ -3957,9 +4403,12 @@
         </w:tc>
         <w:tc>
           <w:tcPr>
-            <w:tcW w:w="3383" w:type="dxa"/>
-          </w:tcPr>
-          <w:p>
+            <w:tcW w:w="3538" w:type="dxa"/>
+          </w:tcPr>
+          <w:p>
+            <w:pPr>
+              <w:cnfStyle w:val="000000100000" w:firstRow="0" w:lastRow="0" w:firstColumn="0" w:lastColumn="0" w:oddVBand="0" w:evenVBand="0" w:oddHBand="1" w:evenHBand="0" w:firstRowFirstColumn="0" w:firstRowLastColumn="0" w:lastRowFirstColumn="0" w:lastRowLastColumn="0"/>
+            </w:pPr>
             <w:r>
               <w:rPr>
                 <w:sz w:val="19"/>
@@ -3970,9 +4419,12 @@
         </w:tc>
         <w:tc>
           <w:tcPr>
-            <w:tcW w:w="3383" w:type="dxa"/>
-          </w:tcPr>
-          <w:p>
+            <w:tcW w:w="3661" w:type="dxa"/>
+          </w:tcPr>
+          <w:p>
+            <w:pPr>
+              <w:cnfStyle w:val="000000100000" w:firstRow="0" w:lastRow="0" w:firstColumn="0" w:lastColumn="0" w:oddVBand="0" w:evenVBand="0" w:oddHBand="1" w:evenHBand="0" w:firstRowFirstColumn="0" w:firstRowLastColumn="0" w:lastRowFirstColumn="0" w:lastRowLastColumn="0"/>
+            </w:pPr>
             <w:r>
               <w:rPr>
                 <w:sz w:val="19"/>
@@ -3983,14 +4435,15 @@
         </w:tc>
       </w:tr>
       <w:tr>
-        <w:tc>
-          <w:tcPr>
-            <w:tcW w:w="715" w:type="dxa"/>
-          </w:tcPr>
-          <w:p>
-            <w:pPr>
-              <w:jc w:val="right"/>
-            </w:pPr>
+        <w:trPr>
+          <w:trHeight w:val="509"/>
+        </w:trPr>
+        <w:tc>
+          <w:tcPr>
+            <w:cnfStyle w:val="001000000000" w:firstRow="0" w:lastRow="0" w:firstColumn="1" w:lastColumn="0" w:oddVBand="0" w:evenVBand="0" w:oddHBand="0" w:evenHBand="0" w:firstRowFirstColumn="0" w:firstRowLastColumn="0" w:lastRowFirstColumn="0" w:lastRowLastColumn="0"/>
+            <w:tcW w:w="642" w:type="dxa"/>
+          </w:tcPr>
+          <w:p>
             <w:r>
               <w:rPr>
                 <w:sz w:val="19"/>
@@ -4001,9 +4454,12 @@
         </w:tc>
         <w:tc>
           <w:tcPr>
-            <w:tcW w:w="2096" w:type="dxa"/>
-          </w:tcPr>
-          <w:p>
+            <w:tcW w:w="2126" w:type="dxa"/>
+          </w:tcPr>
+          <w:p>
+            <w:pPr>
+              <w:cnfStyle w:val="000000000000" w:firstRow="0" w:lastRow="0" w:firstColumn="0" w:lastColumn="0" w:oddVBand="0" w:evenVBand="0" w:oddHBand="0" w:evenHBand="0" w:firstRowFirstColumn="0" w:firstRowLastColumn="0" w:lastRowFirstColumn="0" w:lastRowLastColumn="0"/>
+            </w:pPr>
             <w:r>
               <w:rPr>
                 <w:sz w:val="19"/>
@@ -4014,9 +4470,12 @@
         </w:tc>
         <w:tc>
           <w:tcPr>
-            <w:tcW w:w="3383" w:type="dxa"/>
-          </w:tcPr>
-          <w:p>
+            <w:tcW w:w="3538" w:type="dxa"/>
+          </w:tcPr>
+          <w:p>
+            <w:pPr>
+              <w:cnfStyle w:val="000000000000" w:firstRow="0" w:lastRow="0" w:firstColumn="0" w:lastColumn="0" w:oddVBand="0" w:evenVBand="0" w:oddHBand="0" w:evenHBand="0" w:firstRowFirstColumn="0" w:firstRowLastColumn="0" w:lastRowFirstColumn="0" w:lastRowLastColumn="0"/>
+            </w:pPr>
             <w:r>
               <w:rPr>
                 <w:sz w:val="19"/>
@@ -4027,9 +4486,12 @@
         </w:tc>
         <w:tc>
           <w:tcPr>
-            <w:tcW w:w="3383" w:type="dxa"/>
-          </w:tcPr>
-          <w:p>
+            <w:tcW w:w="3661" w:type="dxa"/>
+          </w:tcPr>
+          <w:p>
+            <w:pPr>
+              <w:cnfStyle w:val="000000000000" w:firstRow="0" w:lastRow="0" w:firstColumn="0" w:lastColumn="0" w:oddVBand="0" w:evenVBand="0" w:oddHBand="0" w:evenHBand="0" w:firstRowFirstColumn="0" w:firstRowLastColumn="0" w:lastRowFirstColumn="0" w:lastRowLastColumn="0"/>
+            </w:pPr>
             <w:r>
               <w:rPr>
                 <w:sz w:val="19"/>
@@ -4040,14 +4502,16 @@
         </w:tc>
       </w:tr>
       <w:tr>
-        <w:tc>
-          <w:tcPr>
-            <w:tcW w:w="715" w:type="dxa"/>
-          </w:tcPr>
-          <w:p>
-            <w:pPr>
-              <w:jc w:val="right"/>
-            </w:pPr>
+        <w:trPr>
+          <w:cnfStyle w:val="000000100000" w:firstRow="0" w:lastRow="0" w:firstColumn="0" w:lastColumn="0" w:oddVBand="0" w:evenVBand="0" w:oddHBand="1" w:evenHBand="0" w:firstRowFirstColumn="0" w:firstRowLastColumn="0" w:lastRowFirstColumn="0" w:lastRowLastColumn="0"/>
+          <w:trHeight w:val="509"/>
+        </w:trPr>
+        <w:tc>
+          <w:tcPr>
+            <w:cnfStyle w:val="001000000000" w:firstRow="0" w:lastRow="0" w:firstColumn="1" w:lastColumn="0" w:oddVBand="0" w:evenVBand="0" w:oddHBand="0" w:evenHBand="0" w:firstRowFirstColumn="0" w:firstRowLastColumn="0" w:lastRowFirstColumn="0" w:lastRowLastColumn="0"/>
+            <w:tcW w:w="642" w:type="dxa"/>
+          </w:tcPr>
+          <w:p>
             <w:r>
               <w:rPr>
                 <w:sz w:val="19"/>
@@ -4058,9 +4522,12 @@
         </w:tc>
         <w:tc>
           <w:tcPr>
-            <w:tcW w:w="2096" w:type="dxa"/>
-          </w:tcPr>
-          <w:p>
+            <w:tcW w:w="2126" w:type="dxa"/>
+          </w:tcPr>
+          <w:p>
+            <w:pPr>
+              <w:cnfStyle w:val="000000100000" w:firstRow="0" w:lastRow="0" w:firstColumn="0" w:lastColumn="0" w:oddVBand="0" w:evenVBand="0" w:oddHBand="1" w:evenHBand="0" w:firstRowFirstColumn="0" w:firstRowLastColumn="0" w:lastRowFirstColumn="0" w:lastRowLastColumn="0"/>
+            </w:pPr>
             <w:r>
               <w:rPr>
                 <w:sz w:val="19"/>
@@ -4071,9 +4538,12 @@
         </w:tc>
         <w:tc>
           <w:tcPr>
-            <w:tcW w:w="3383" w:type="dxa"/>
-          </w:tcPr>
-          <w:p>
+            <w:tcW w:w="3538" w:type="dxa"/>
+          </w:tcPr>
+          <w:p>
+            <w:pPr>
+              <w:cnfStyle w:val="000000100000" w:firstRow="0" w:lastRow="0" w:firstColumn="0" w:lastColumn="0" w:oddVBand="0" w:evenVBand="0" w:oddHBand="1" w:evenHBand="0" w:firstRowFirstColumn="0" w:firstRowLastColumn="0" w:lastRowFirstColumn="0" w:lastRowLastColumn="0"/>
+            </w:pPr>
             <w:r>
               <w:rPr>
                 <w:sz w:val="19"/>
@@ -4084,9 +4554,12 @@
         </w:tc>
         <w:tc>
           <w:tcPr>
-            <w:tcW w:w="3383" w:type="dxa"/>
-          </w:tcPr>
-          <w:p>
+            <w:tcW w:w="3661" w:type="dxa"/>
+          </w:tcPr>
+          <w:p>
+            <w:pPr>
+              <w:cnfStyle w:val="000000100000" w:firstRow="0" w:lastRow="0" w:firstColumn="0" w:lastColumn="0" w:oddVBand="0" w:evenVBand="0" w:oddHBand="1" w:evenHBand="0" w:firstRowFirstColumn="0" w:firstRowLastColumn="0" w:lastRowFirstColumn="0" w:lastRowLastColumn="0"/>
+            </w:pPr>
             <w:r>
               <w:rPr>
                 <w:sz w:val="19"/>
@@ -4097,14 +4570,15 @@
         </w:tc>
       </w:tr>
       <w:tr>
-        <w:tc>
-          <w:tcPr>
-            <w:tcW w:w="715" w:type="dxa"/>
-          </w:tcPr>
-          <w:p>
-            <w:pPr>
-              <w:jc w:val="right"/>
-            </w:pPr>
+        <w:trPr>
+          <w:trHeight w:val="308"/>
+        </w:trPr>
+        <w:tc>
+          <w:tcPr>
+            <w:cnfStyle w:val="001000000000" w:firstRow="0" w:lastRow="0" w:firstColumn="1" w:lastColumn="0" w:oddVBand="0" w:evenVBand="0" w:oddHBand="0" w:evenHBand="0" w:firstRowFirstColumn="0" w:firstRowLastColumn="0" w:lastRowFirstColumn="0" w:lastRowLastColumn="0"/>
+            <w:tcW w:w="642" w:type="dxa"/>
+          </w:tcPr>
+          <w:p>
             <w:r>
               <w:rPr>
                 <w:sz w:val="19"/>
@@ -4115,9 +4589,12 @@
         </w:tc>
         <w:tc>
           <w:tcPr>
-            <w:tcW w:w="2096" w:type="dxa"/>
-          </w:tcPr>
-          <w:p>
+            <w:tcW w:w="2126" w:type="dxa"/>
+          </w:tcPr>
+          <w:p>
+            <w:pPr>
+              <w:cnfStyle w:val="000000000000" w:firstRow="0" w:lastRow="0" w:firstColumn="0" w:lastColumn="0" w:oddVBand="0" w:evenVBand="0" w:oddHBand="0" w:evenHBand="0" w:firstRowFirstColumn="0" w:firstRowLastColumn="0" w:lastRowFirstColumn="0" w:lastRowLastColumn="0"/>
+            </w:pPr>
             <w:r>
               <w:rPr>
                 <w:sz w:val="19"/>
@@ -4128,9 +4605,12 @@
         </w:tc>
         <w:tc>
           <w:tcPr>
-            <w:tcW w:w="3383" w:type="dxa"/>
-          </w:tcPr>
-          <w:p>
+            <w:tcW w:w="3538" w:type="dxa"/>
+          </w:tcPr>
+          <w:p>
+            <w:pPr>
+              <w:cnfStyle w:val="000000000000" w:firstRow="0" w:lastRow="0" w:firstColumn="0" w:lastColumn="0" w:oddVBand="0" w:evenVBand="0" w:oddHBand="0" w:evenHBand="0" w:firstRowFirstColumn="0" w:firstRowLastColumn="0" w:lastRowFirstColumn="0" w:lastRowLastColumn="0"/>
+            </w:pPr>
             <w:r>
               <w:rPr>
                 <w:sz w:val="19"/>
@@ -4141,9 +4621,12 @@
         </w:tc>
         <w:tc>
           <w:tcPr>
-            <w:tcW w:w="3383" w:type="dxa"/>
-          </w:tcPr>
-          <w:p>
+            <w:tcW w:w="3661" w:type="dxa"/>
+          </w:tcPr>
+          <w:p>
+            <w:pPr>
+              <w:cnfStyle w:val="000000000000" w:firstRow="0" w:lastRow="0" w:firstColumn="0" w:lastColumn="0" w:oddVBand="0" w:evenVBand="0" w:oddHBand="0" w:evenHBand="0" w:firstRowFirstColumn="0" w:firstRowLastColumn="0" w:lastRowFirstColumn="0" w:lastRowLastColumn="0"/>
+            </w:pPr>
             <w:r>
               <w:rPr>
                 <w:sz w:val="19"/>
@@ -4154,14 +4637,16 @@
         </w:tc>
       </w:tr>
       <w:tr>
-        <w:tc>
-          <w:tcPr>
-            <w:tcW w:w="715" w:type="dxa"/>
-          </w:tcPr>
-          <w:p>
-            <w:pPr>
-              <w:jc w:val="right"/>
-            </w:pPr>
+        <w:trPr>
+          <w:cnfStyle w:val="000000100000" w:firstRow="0" w:lastRow="0" w:firstColumn="0" w:lastColumn="0" w:oddVBand="0" w:evenVBand="0" w:oddHBand="1" w:evenHBand="0" w:firstRowFirstColumn="0" w:firstRowLastColumn="0" w:lastRowFirstColumn="0" w:lastRowLastColumn="0"/>
+          <w:trHeight w:val="711"/>
+        </w:trPr>
+        <w:tc>
+          <w:tcPr>
+            <w:cnfStyle w:val="001000000000" w:firstRow="0" w:lastRow="0" w:firstColumn="1" w:lastColumn="0" w:oddVBand="0" w:evenVBand="0" w:oddHBand="0" w:evenHBand="0" w:firstRowFirstColumn="0" w:firstRowLastColumn="0" w:lastRowFirstColumn="0" w:lastRowLastColumn="0"/>
+            <w:tcW w:w="642" w:type="dxa"/>
+          </w:tcPr>
+          <w:p>
             <w:r>
               <w:rPr>
                 <w:sz w:val="19"/>
@@ -4172,9 +4657,12 @@
         </w:tc>
         <w:tc>
           <w:tcPr>
-            <w:tcW w:w="2096" w:type="dxa"/>
-          </w:tcPr>
-          <w:p>
+            <w:tcW w:w="2126" w:type="dxa"/>
+          </w:tcPr>
+          <w:p>
+            <w:pPr>
+              <w:cnfStyle w:val="000000100000" w:firstRow="0" w:lastRow="0" w:firstColumn="0" w:lastColumn="0" w:oddVBand="0" w:evenVBand="0" w:oddHBand="1" w:evenHBand="0" w:firstRowFirstColumn="0" w:firstRowLastColumn="0" w:lastRowFirstColumn="0" w:lastRowLastColumn="0"/>
+            </w:pPr>
             <w:r>
               <w:rPr>
                 <w:sz w:val="19"/>
@@ -4185,9 +4673,12 @@
         </w:tc>
         <w:tc>
           <w:tcPr>
-            <w:tcW w:w="3383" w:type="dxa"/>
-          </w:tcPr>
-          <w:p>
+            <w:tcW w:w="3538" w:type="dxa"/>
+          </w:tcPr>
+          <w:p>
+            <w:pPr>
+              <w:cnfStyle w:val="000000100000" w:firstRow="0" w:lastRow="0" w:firstColumn="0" w:lastColumn="0" w:oddVBand="0" w:evenVBand="0" w:oddHBand="1" w:evenHBand="0" w:firstRowFirstColumn="0" w:firstRowLastColumn="0" w:lastRowFirstColumn="0" w:lastRowLastColumn="0"/>
+            </w:pPr>
             <w:r>
               <w:rPr>
                 <w:sz w:val="19"/>
@@ -4198,9 +4689,12 @@
         </w:tc>
         <w:tc>
           <w:tcPr>
-            <w:tcW w:w="3383" w:type="dxa"/>
-          </w:tcPr>
-          <w:p>
+            <w:tcW w:w="3661" w:type="dxa"/>
+          </w:tcPr>
+          <w:p>
+            <w:pPr>
+              <w:cnfStyle w:val="000000100000" w:firstRow="0" w:lastRow="0" w:firstColumn="0" w:lastColumn="0" w:oddVBand="0" w:evenVBand="0" w:oddHBand="1" w:evenHBand="0" w:firstRowFirstColumn="0" w:firstRowLastColumn="0" w:lastRowFirstColumn="0" w:lastRowLastColumn="0"/>
+            </w:pPr>
             <w:r>
               <w:rPr>
                 <w:sz w:val="19"/>
@@ -4211,14 +4705,15 @@
         </w:tc>
       </w:tr>
       <w:tr>
-        <w:tc>
-          <w:tcPr>
-            <w:tcW w:w="715" w:type="dxa"/>
-          </w:tcPr>
-          <w:p>
-            <w:pPr>
-              <w:jc w:val="right"/>
-            </w:pPr>
+        <w:trPr>
+          <w:trHeight w:val="518"/>
+        </w:trPr>
+        <w:tc>
+          <w:tcPr>
+            <w:cnfStyle w:val="001000000000" w:firstRow="0" w:lastRow="0" w:firstColumn="1" w:lastColumn="0" w:oddVBand="0" w:evenVBand="0" w:oddHBand="0" w:evenHBand="0" w:firstRowFirstColumn="0" w:firstRowLastColumn="0" w:lastRowFirstColumn="0" w:lastRowLastColumn="0"/>
+            <w:tcW w:w="642" w:type="dxa"/>
+          </w:tcPr>
+          <w:p>
             <w:r>
               <w:rPr>
                 <w:sz w:val="19"/>
@@ -4229,9 +4724,12 @@
         </w:tc>
         <w:tc>
           <w:tcPr>
-            <w:tcW w:w="2096" w:type="dxa"/>
-          </w:tcPr>
-          <w:p>
+            <w:tcW w:w="2126" w:type="dxa"/>
+          </w:tcPr>
+          <w:p>
+            <w:pPr>
+              <w:cnfStyle w:val="000000000000" w:firstRow="0" w:lastRow="0" w:firstColumn="0" w:lastColumn="0" w:oddVBand="0" w:evenVBand="0" w:oddHBand="0" w:evenHBand="0" w:firstRowFirstColumn="0" w:firstRowLastColumn="0" w:lastRowFirstColumn="0" w:lastRowLastColumn="0"/>
+            </w:pPr>
             <w:r>
               <w:rPr>
                 <w:sz w:val="19"/>
@@ -4242,9 +4740,12 @@
         </w:tc>
         <w:tc>
           <w:tcPr>
-            <w:tcW w:w="3383" w:type="dxa"/>
-          </w:tcPr>
-          <w:p>
+            <w:tcW w:w="3538" w:type="dxa"/>
+          </w:tcPr>
+          <w:p>
+            <w:pPr>
+              <w:cnfStyle w:val="000000000000" w:firstRow="0" w:lastRow="0" w:firstColumn="0" w:lastColumn="0" w:oddVBand="0" w:evenVBand="0" w:oddHBand="0" w:evenHBand="0" w:firstRowFirstColumn="0" w:firstRowLastColumn="0" w:lastRowFirstColumn="0" w:lastRowLastColumn="0"/>
+            </w:pPr>
             <w:r>
               <w:rPr>
                 <w:sz w:val="19"/>
@@ -4255,9 +4756,12 @@
         </w:tc>
         <w:tc>
           <w:tcPr>
-            <w:tcW w:w="3383" w:type="dxa"/>
-          </w:tcPr>
-          <w:p>
+            <w:tcW w:w="3661" w:type="dxa"/>
+          </w:tcPr>
+          <w:p>
+            <w:pPr>
+              <w:cnfStyle w:val="000000000000" w:firstRow="0" w:lastRow="0" w:firstColumn="0" w:lastColumn="0" w:oddVBand="0" w:evenVBand="0" w:oddHBand="0" w:evenHBand="0" w:firstRowFirstColumn="0" w:firstRowLastColumn="0" w:lastRowFirstColumn="0" w:lastRowLastColumn="0"/>
+            </w:pPr>
             <w:r>
               <w:rPr>
                 <w:sz w:val="19"/>
@@ -4268,14 +4772,16 @@
         </w:tc>
       </w:tr>
       <w:tr>
-        <w:tc>
-          <w:tcPr>
-            <w:tcW w:w="715" w:type="dxa"/>
-          </w:tcPr>
-          <w:p>
-            <w:pPr>
-              <w:jc w:val="right"/>
-            </w:pPr>
+        <w:trPr>
+          <w:cnfStyle w:val="000000100000" w:firstRow="0" w:lastRow="0" w:firstColumn="0" w:lastColumn="0" w:oddVBand="0" w:evenVBand="0" w:oddHBand="1" w:evenHBand="0" w:firstRowFirstColumn="0" w:firstRowLastColumn="0" w:lastRowFirstColumn="0" w:lastRowLastColumn="0"/>
+          <w:trHeight w:val="509"/>
+        </w:trPr>
+        <w:tc>
+          <w:tcPr>
+            <w:cnfStyle w:val="001000000000" w:firstRow="0" w:lastRow="0" w:firstColumn="1" w:lastColumn="0" w:oddVBand="0" w:evenVBand="0" w:oddHBand="0" w:evenHBand="0" w:firstRowFirstColumn="0" w:firstRowLastColumn="0" w:lastRowFirstColumn="0" w:lastRowLastColumn="0"/>
+            <w:tcW w:w="642" w:type="dxa"/>
+          </w:tcPr>
+          <w:p>
             <w:r>
               <w:rPr>
                 <w:sz w:val="19"/>
@@ -4286,9 +4792,12 @@
         </w:tc>
         <w:tc>
           <w:tcPr>
-            <w:tcW w:w="2096" w:type="dxa"/>
-          </w:tcPr>
-          <w:p>
+            <w:tcW w:w="2126" w:type="dxa"/>
+          </w:tcPr>
+          <w:p>
+            <w:pPr>
+              <w:cnfStyle w:val="000000100000" w:firstRow="0" w:lastRow="0" w:firstColumn="0" w:lastColumn="0" w:oddVBand="0" w:evenVBand="0" w:oddHBand="1" w:evenHBand="0" w:firstRowFirstColumn="0" w:firstRowLastColumn="0" w:lastRowFirstColumn="0" w:lastRowLastColumn="0"/>
+            </w:pPr>
             <w:r>
               <w:rPr>
                 <w:sz w:val="19"/>
@@ -4299,9 +4808,12 @@
         </w:tc>
         <w:tc>
           <w:tcPr>
-            <w:tcW w:w="3383" w:type="dxa"/>
-          </w:tcPr>
-          <w:p>
+            <w:tcW w:w="3538" w:type="dxa"/>
+          </w:tcPr>
+          <w:p>
+            <w:pPr>
+              <w:cnfStyle w:val="000000100000" w:firstRow="0" w:lastRow="0" w:firstColumn="0" w:lastColumn="0" w:oddVBand="0" w:evenVBand="0" w:oddHBand="1" w:evenHBand="0" w:firstRowFirstColumn="0" w:firstRowLastColumn="0" w:lastRowFirstColumn="0" w:lastRowLastColumn="0"/>
+            </w:pPr>
             <w:r>
               <w:rPr>
                 <w:sz w:val="19"/>
@@ -4312,9 +4824,12 @@
         </w:tc>
         <w:tc>
           <w:tcPr>
-            <w:tcW w:w="3383" w:type="dxa"/>
-          </w:tcPr>
-          <w:p>
+            <w:tcW w:w="3661" w:type="dxa"/>
+          </w:tcPr>
+          <w:p>
+            <w:pPr>
+              <w:cnfStyle w:val="000000100000" w:firstRow="0" w:lastRow="0" w:firstColumn="0" w:lastColumn="0" w:oddVBand="0" w:evenVBand="0" w:oddHBand="1" w:evenHBand="0" w:firstRowFirstColumn="0" w:firstRowLastColumn="0" w:lastRowFirstColumn="0" w:lastRowLastColumn="0"/>
+            </w:pPr>
             <w:r>
               <w:rPr>
                 <w:sz w:val="19"/>
@@ -4325,14 +4840,15 @@
         </w:tc>
       </w:tr>
       <w:tr>
-        <w:tc>
-          <w:tcPr>
-            <w:tcW w:w="715" w:type="dxa"/>
-          </w:tcPr>
-          <w:p>
-            <w:pPr>
-              <w:jc w:val="right"/>
-            </w:pPr>
+        <w:trPr>
+          <w:trHeight w:val="509"/>
+        </w:trPr>
+        <w:tc>
+          <w:tcPr>
+            <w:cnfStyle w:val="001000000000" w:firstRow="0" w:lastRow="0" w:firstColumn="1" w:lastColumn="0" w:oddVBand="0" w:evenVBand="0" w:oddHBand="0" w:evenHBand="0" w:firstRowFirstColumn="0" w:firstRowLastColumn="0" w:lastRowFirstColumn="0" w:lastRowLastColumn="0"/>
+            <w:tcW w:w="642" w:type="dxa"/>
+          </w:tcPr>
+          <w:p>
             <w:r>
               <w:rPr>
                 <w:sz w:val="19"/>
@@ -4343,9 +4859,12 @@
         </w:tc>
         <w:tc>
           <w:tcPr>
-            <w:tcW w:w="2096" w:type="dxa"/>
-          </w:tcPr>
-          <w:p>
+            <w:tcW w:w="2126" w:type="dxa"/>
+          </w:tcPr>
+          <w:p>
+            <w:pPr>
+              <w:cnfStyle w:val="000000000000" w:firstRow="0" w:lastRow="0" w:firstColumn="0" w:lastColumn="0" w:oddVBand="0" w:evenVBand="0" w:oddHBand="0" w:evenHBand="0" w:firstRowFirstColumn="0" w:firstRowLastColumn="0" w:lastRowFirstColumn="0" w:lastRowLastColumn="0"/>
+            </w:pPr>
             <w:r>
               <w:rPr>
                 <w:sz w:val="19"/>
@@ -4356,9 +4875,12 @@
         </w:tc>
         <w:tc>
           <w:tcPr>
-            <w:tcW w:w="3383" w:type="dxa"/>
-          </w:tcPr>
-          <w:p>
+            <w:tcW w:w="3538" w:type="dxa"/>
+          </w:tcPr>
+          <w:p>
+            <w:pPr>
+              <w:cnfStyle w:val="000000000000" w:firstRow="0" w:lastRow="0" w:firstColumn="0" w:lastColumn="0" w:oddVBand="0" w:evenVBand="0" w:oddHBand="0" w:evenHBand="0" w:firstRowFirstColumn="0" w:firstRowLastColumn="0" w:lastRowFirstColumn="0" w:lastRowLastColumn="0"/>
+            </w:pPr>
             <w:r>
               <w:rPr>
                 <w:sz w:val="19"/>
@@ -4369,9 +4891,12 @@
         </w:tc>
         <w:tc>
           <w:tcPr>
-            <w:tcW w:w="3383" w:type="dxa"/>
-          </w:tcPr>
-          <w:p>
+            <w:tcW w:w="3661" w:type="dxa"/>
+          </w:tcPr>
+          <w:p>
+            <w:pPr>
+              <w:cnfStyle w:val="000000000000" w:firstRow="0" w:lastRow="0" w:firstColumn="0" w:lastColumn="0" w:oddVBand="0" w:evenVBand="0" w:oddHBand="0" w:evenHBand="0" w:firstRowFirstColumn="0" w:firstRowLastColumn="0" w:lastRowFirstColumn="0" w:lastRowLastColumn="0"/>
+            </w:pPr>
             <w:r>
               <w:rPr>
                 <w:sz w:val="19"/>
@@ -4403,6 +4928,7 @@
     </w:p>
     <w:p>
       <w:r>
+        <w:lastRenderedPageBreak/>
         <w:t>Severity was assigned one level per category. Annotating each of the 76 failures individually would make the severity breakdown defensible under the framework's most rigorous option, its manual-annotation route.</w:t>
       </w:r>
     </w:p>
@@ -4428,7 +4954,6 @@
     </w:p>
     <w:p>
       <w:r>
-        <w:lastRenderedPageBreak/>
         <w:t>All numbers come from the validation split. The held-out test set of 1,243 sentences remains untouched and available for final reporting.</w:t>
       </w:r>
     </w:p>
@@ -4444,7 +4969,7 @@
 </file>
 
 <file path=word/numbering.xml><?xml version="1.0" encoding="utf-8"?>
-<w:numbering xmlns:wpc="http://schemas.microsoft.com/office/word/2010/wordprocessingCanvas" xmlns:cx="http://schemas.microsoft.com/office/drawing/2014/chartex" xmlns:cx1="http://schemas.microsoft.com/office/drawing/2015/9/8/chartex" xmlns:cx2="http://schemas.microsoft.com/office/drawing/2015/10/21/chartex" xmlns:cx3="http://schemas.microsoft.com/office/drawing/2016/5/9/chartex" xmlns:cx4="http://schemas.microsoft.com/office/drawing/2016/5/10/chartex" xmlns:cx5="http://schemas.microsoft.com/office/drawing/2016/5/11/chartex" xmlns:cx6="http://schemas.microsoft.com/office/drawing/2016/5/12/chartex" xmlns:cx7="http://schemas.microsoft.com/office/drawing/2016/5/13/chartex" xmlns:cx8="http://schemas.microsoft.com/office/drawing/2016/5/14/chartex" xmlns:mc="http://schemas.openxmlformats.org/markup-compatibility/2006" xmlns:aink="http://schemas.microsoft.com/office/drawing/2016/ink" xmlns:am3d="http://schemas.microsoft.com/office/drawing/2017/model3d" xmlns:o="urn:schemas-microsoft-com:office:office" xmlns:oel="http://schemas.microsoft.com/office/2019/extlst" xmlns:r="http://schemas.openxmlformats.org/officeDocument/2006/relationships" xmlns:m="http://schemas.openxmlformats.org/officeDocument/2006/math" xmlns:v="urn:schemas-microsoft-com:vml" xmlns:wp14="http://schemas.microsoft.com/office/word/2010/wordprocessingDrawing" xmlns:wp="http://schemas.openxmlformats.org/drawingml/2006/wordprocessingDrawing" xmlns:w10="urn:schemas-microsoft-com:office:word" xmlns:w="http://schemas.openxmlformats.org/wordprocessingml/2006/main" xmlns:w14="http://schemas.microsoft.com/office/word/2010/wordml" xmlns:w15="http://schemas.microsoft.com/office/word/2012/wordml" xmlns:w16cex="http://schemas.microsoft.com/office/word/2018/wordml/cex" xmlns:w16cid="http://schemas.microsoft.com/office/word/2016/wordml/cid" xmlns:w16="http://schemas.microsoft.com/office/word/2018/wordml" xmlns:w16du="http://schemas.microsoft.com/office/word/2023/wordml/word16du" xmlns:w16sdtdh="http://schemas.microsoft.com/office/word/2020/wordml/sdtdatahash" xmlns:w16sdtfl="http://schemas.microsoft.com/office/word/2024/wordml/sdtformatlock" xmlns:w16se="http://schemas.microsoft.com/office/word/2015/wordml/symex" xmlns:wpg="http://schemas.microsoft.com/office/word/2010/wordprocessingGroup" xmlns:wpi="http://schemas.microsoft.com/office/word/2010/wordprocessingInk" xmlns:wne="http://schemas.microsoft.com/office/word/2006/wordml" xmlns:wps="http://schemas.microsoft.com/office/word/2010/wordprocessingShape" mc:Ignorable="w14 w15 w16se w16cid w16 w16cex w16sdtdh w16sdtfl w16du wp14">
+<w:numbering xmlns:wpc="http://schemas.microsoft.com/office/word/2010/wordprocessingCanvas" xmlns:cx="http://schemas.microsoft.com/office/drawing/2014/chartex" xmlns:cx1="http://schemas.microsoft.com/office/drawing/2015/9/8/chartex" xmlns:cx2="http://schemas.microsoft.com/office/drawing/2015/10/21/chartex" xmlns:cx3="http://schemas.microsoft.com/office/drawing/2016/5/9/chartex" xmlns:cx4="http://schemas.microsoft.com/office/drawing/2016/5/10/chartex" xmlns:cx5="http://schemas.microsoft.com/office/drawing/2016/5/11/chartex" xmlns:cx6="http://schemas.microsoft.com/office/drawing/2016/5/12/chartex" xmlns:cx7="http://schemas.microsoft.com/office/drawing/2016/5/13/chartex" xmlns:cx8="http://schemas.microsoft.com/office/drawing/2016/5/14/chartex" xmlns:mc="http://schemas.openxmlformats.org/markup-compatibility/2006" xmlns:aink="http://schemas.microsoft.com/office/drawing/2016/ink" xmlns:am3d="http://schemas.microsoft.com/office/drawing/2017/model3d" xmlns:o="urn:schemas-microsoft-com:office:office" xmlns:oel="http://schemas.microsoft.com/office/2019/extlst" xmlns:r="http://schemas.openxmlformats.org/officeDocument/2006/relationships" xmlns:m="http://schemas.openxmlformats.org/officeDocument/2006/math" xmlns:v="urn:schemas-microsoft-com:vml" xmlns:wp14="http://schemas.microsoft.com/office/word/2010/wordprocessingDrawing" xmlns:wp="http://schemas.openxmlformats.org/drawingml/2006/wordprocessingDrawing" xmlns:w10="urn:schemas-microsoft-com:office:word" xmlns:w="http://schemas.openxmlformats.org/wordprocessingml/2006/main" xmlns:w14="http://schemas.microsoft.com/office/word/2010/wordml" xmlns:w15="http://schemas.microsoft.com/office/word/2012/wordml" xmlns:w16cei="http://schemas.microsoft.com/office/word/2026/wordml/cei" xmlns:w16cex="http://schemas.microsoft.com/office/word/2018/wordml/cex" xmlns:w16cid="http://schemas.microsoft.com/office/word/2016/wordml/cid" xmlns:w16="http://schemas.microsoft.com/office/word/2018/wordml" xmlns:w16du="http://schemas.microsoft.com/office/word/2023/wordml/word16du" xmlns:w16sdtdh="http://schemas.microsoft.com/office/word/2020/wordml/sdtdatahash" xmlns:w16sdtfl="http://schemas.microsoft.com/office/word/2024/wordml/sdtformatlock" xmlns:w16se="http://schemas.microsoft.com/office/word/2015/wordml/symex" xmlns:wpg="http://schemas.microsoft.com/office/word/2010/wordprocessingGroup" xmlns:wpi="http://schemas.microsoft.com/office/word/2010/wordprocessingInk" xmlns:wne="http://schemas.microsoft.com/office/word/2006/wordml" xmlns:wps="http://schemas.microsoft.com/office/word/2010/wordprocessingShape" mc:Ignorable="w14 w15 w16se w16cid w16 w16cex w16sdtdh w16sdtfl w16du wp14">
   <w:abstractNum w:abstractNumId="0" w15:restartNumberingAfterBreak="0">
     <w:nsid w:val="FFFFFF7C"/>
     <w:multiLevelType w:val="singleLevel"/>
@@ -16024,6 +16549,126 @@
       </w:tcPr>
     </w:tblStylePr>
   </w:style>
+  <w:style w:type="table" w:styleId="PlainTable5">
+    <w:name w:val="Plain Table 5"/>
+    <w:basedOn w:val="TableNormal"/>
+    <w:uiPriority w:val="99"/>
+    <w:rsid w:val="00286C6C"/>
+    <w:pPr>
+      <w:spacing w:after="0" w:line="240" w:lineRule="auto"/>
+    </w:pPr>
+    <w:tblPr>
+      <w:tblStyleRowBandSize w:val="1"/>
+      <w:tblStyleColBandSize w:val="1"/>
+    </w:tblPr>
+    <w:tblStylePr w:type="firstRow">
+      <w:rPr>
+        <w:rFonts w:asciiTheme="majorHAnsi" w:eastAsiaTheme="majorEastAsia" w:hAnsiTheme="majorHAnsi" w:cstheme="majorBidi"/>
+        <w:i/>
+        <w:iCs/>
+        <w:sz w:val="26"/>
+      </w:rPr>
+      <w:tblPr/>
+      <w:tcPr>
+        <w:tcBorders>
+          <w:bottom w:val="single" w:sz="4" w:space="0" w:color="7F7F7F" w:themeColor="text1" w:themeTint="80"/>
+        </w:tcBorders>
+        <w:shd w:val="clear" w:color="auto" w:fill="FFFFFF" w:themeFill="background1"/>
+      </w:tcPr>
+    </w:tblStylePr>
+    <w:tblStylePr w:type="lastRow">
+      <w:rPr>
+        <w:rFonts w:asciiTheme="majorHAnsi" w:eastAsiaTheme="majorEastAsia" w:hAnsiTheme="majorHAnsi" w:cstheme="majorBidi"/>
+        <w:i/>
+        <w:iCs/>
+        <w:sz w:val="26"/>
+      </w:rPr>
+      <w:tblPr/>
+      <w:tcPr>
+        <w:tcBorders>
+          <w:top w:val="single" w:sz="4" w:space="0" w:color="7F7F7F" w:themeColor="text1" w:themeTint="80"/>
+        </w:tcBorders>
+        <w:shd w:val="clear" w:color="auto" w:fill="FFFFFF" w:themeFill="background1"/>
+      </w:tcPr>
+    </w:tblStylePr>
+    <w:tblStylePr w:type="firstCol">
+      <w:pPr>
+        <w:jc w:val="right"/>
+      </w:pPr>
+      <w:rPr>
+        <w:rFonts w:asciiTheme="majorHAnsi" w:eastAsiaTheme="majorEastAsia" w:hAnsiTheme="majorHAnsi" w:cstheme="majorBidi"/>
+        <w:i/>
+        <w:iCs/>
+        <w:sz w:val="26"/>
+      </w:rPr>
+      <w:tblPr/>
+      <w:tcPr>
+        <w:tcBorders>
+          <w:right w:val="single" w:sz="4" w:space="0" w:color="7F7F7F" w:themeColor="text1" w:themeTint="80"/>
+        </w:tcBorders>
+        <w:shd w:val="clear" w:color="auto" w:fill="FFFFFF" w:themeFill="background1"/>
+      </w:tcPr>
+    </w:tblStylePr>
+    <w:tblStylePr w:type="lastCol">
+      <w:rPr>
+        <w:rFonts w:asciiTheme="majorHAnsi" w:eastAsiaTheme="majorEastAsia" w:hAnsiTheme="majorHAnsi" w:cstheme="majorBidi"/>
+        <w:i/>
+        <w:iCs/>
+        <w:sz w:val="26"/>
+      </w:rPr>
+      <w:tblPr/>
+      <w:tcPr>
+        <w:tcBorders>
+          <w:left w:val="single" w:sz="4" w:space="0" w:color="7F7F7F" w:themeColor="text1" w:themeTint="80"/>
+        </w:tcBorders>
+        <w:shd w:val="clear" w:color="auto" w:fill="FFFFFF" w:themeFill="background1"/>
+      </w:tcPr>
+    </w:tblStylePr>
+    <w:tblStylePr w:type="band1Vert">
+      <w:tblPr/>
+      <w:tcPr>
+        <w:shd w:val="clear" w:color="auto" w:fill="F2F2F2" w:themeFill="background1" w:themeFillShade="F2"/>
+      </w:tcPr>
+    </w:tblStylePr>
+    <w:tblStylePr w:type="band1Horz">
+      <w:tblPr/>
+      <w:tcPr>
+        <w:shd w:val="clear" w:color="auto" w:fill="F2F2F2" w:themeFill="background1" w:themeFillShade="F2"/>
+      </w:tcPr>
+    </w:tblStylePr>
+    <w:tblStylePr w:type="neCell">
+      <w:tblPr/>
+      <w:tcPr>
+        <w:tcBorders>
+          <w:left w:val="nil"/>
+        </w:tcBorders>
+      </w:tcPr>
+    </w:tblStylePr>
+    <w:tblStylePr w:type="nwCell">
+      <w:tblPr/>
+      <w:tcPr>
+        <w:tcBorders>
+          <w:right w:val="nil"/>
+        </w:tcBorders>
+      </w:tcPr>
+    </w:tblStylePr>
+    <w:tblStylePr w:type="seCell">
+      <w:tblPr/>
+      <w:tcPr>
+        <w:tcBorders>
+          <w:left w:val="nil"/>
+        </w:tcBorders>
+      </w:tcPr>
+    </w:tblStylePr>
+    <w:tblStylePr w:type="swCell">
+      <w:tblPr/>
+      <w:tcPr>
+        <w:tcBorders>
+          <w:right w:val="nil"/>
+        </w:tcBorders>
+      </w:tcPr>
+    </w:tblStylePr>
+  </w:style>
 </w:styles>
 </file>
 

</xml_diff>